<commit_message>
Tambah grid search, uji signifikansi, dan tab pola soft pity
- Hyperparameter keenam algoritma dipilih dengan GridSearchCV (GroupKFold
  4-fold) pada 100 akun simulasi tambahan yang tidak dipakai untuk evaluasi.
  Pada eksperimen data asli, grid search diulang di dalam setiap fold
  (nested cross-validation).
- Uji t berpasangan terkoreksi (Nadeau & Bengio, 2003) terhadap model
  berakurasi tertinggi, termasuk penanda bila beberapa model seri.
- Halaman Perbandingan Algoritma: tab "Pola soft pity", tabel uji
  signifikansi, hyperparameter hasil grid search, dan pengaruh grid search
  pada data asli.
- Proposal, laporan, dan slide kini membaca tabel serta angka hasil langsung
  dari models/report.json (rep.js); subbab teori baru 2.7, Bab IV disusun
  ulang (hasil grid search dan uji signifikansi), grafik dan tangkapan layar
  dibuat ulang.
- LAPORAN.md, README, dan tanya jawab di PANDUAN_PENGUMPULAN disesuaikan.
</commit_message>
<xml_diff>
--- a/docs/tugas/UTS_Proposal_Kelompok6_A11.4502.docx
+++ b/docs/tugas/UTS_Proposal_Kelompok6_A11.4502.docx
@@ -959,7 +959,7 @@
         <w:t xml:space="preserve">DAFTAR TABEL</w:t>
       </w:r>
       <w:r>
-        <w:t xml:space="preserve">	iv</w:t>
+        <w:t xml:space="preserve">	v</w:t>
       </w:r>
     </w:p>
     <w:p>
@@ -978,7 +978,7 @@
         <w:t xml:space="preserve">DAFTAR GAMBAR</w:t>
       </w:r>
       <w:r>
-        <w:t xml:space="preserve">	v</w:t>
+        <w:t xml:space="preserve">	vi</w:t>
       </w:r>
     </w:p>
     <w:p>
@@ -1374,10 +1374,29 @@
           <w:b w:val="false"/>
           <w:bCs w:val="false"/>
         </w:rPr>
-        <w:t xml:space="preserve">2.7 Streamlit</w:t>
+        <w:t xml:space="preserve">2.7 Pemilihan Hyperparameter dan Uji Signifikansi</w:t>
       </w:r>
       <w:r>
         <w:t xml:space="preserve">	9</w:t>
+      </w:r>
+    </w:p>
+    <w:p>
+      <w:pPr>
+        <w:tabs>
+          <w:tab w:val="right" w:pos="7938" w:leader="dot"/>
+        </w:tabs>
+        <w:spacing w:after="40" w:line="300"/>
+        <w:ind w:left="440"/>
+      </w:pPr>
+      <w:r>
+        <w:rPr>
+          <w:b w:val="false"/>
+          <w:bCs w:val="false"/>
+        </w:rPr>
+        <w:t xml:space="preserve">2.8 Streamlit</w:t>
+      </w:r>
+      <w:r>
+        <w:t xml:space="preserve">	10</w:t>
       </w:r>
     </w:p>
     <w:p>
@@ -1396,7 +1415,7 @@
         <w:t xml:space="preserve">BAB III METODE PENELITIAN</w:t>
       </w:r>
       <w:r>
-        <w:t xml:space="preserve">	10</w:t>
+        <w:t xml:space="preserve">	11</w:t>
       </w:r>
     </w:p>
     <w:p>
@@ -1415,7 +1434,7 @@
         <w:t xml:space="preserve">3.1 Alur Penelitian</w:t>
       </w:r>
       <w:r>
-        <w:t xml:space="preserve">	10</w:t>
+        <w:t xml:space="preserve">	11</w:t>
       </w:r>
     </w:p>
     <w:p>
@@ -1434,7 +1453,7 @@
         <w:t xml:space="preserve">3.2 Sumber Data</w:t>
       </w:r>
       <w:r>
-        <w:t xml:space="preserve">	10</w:t>
+        <w:t xml:space="preserve">	12</w:t>
       </w:r>
     </w:p>
     <w:p>
@@ -1453,7 +1472,7 @@
         <w:t xml:space="preserve">3.3 Pra-pemrosesan Data</w:t>
       </w:r>
       <w:r>
-        <w:t xml:space="preserve">	11</w:t>
+        <w:t xml:space="preserve">	12</w:t>
       </w:r>
     </w:p>
     <w:p>
@@ -1472,7 +1491,7 @@
         <w:t xml:space="preserve">3.4 Fitur dan Target</w:t>
       </w:r>
       <w:r>
-        <w:t xml:space="preserve">	11</w:t>
+        <w:t xml:space="preserve">	13</w:t>
       </w:r>
     </w:p>
     <w:p>
@@ -1491,7 +1510,7 @@
         <w:t xml:space="preserve">3.5 Pemodelan</w:t>
       </w:r>
       <w:r>
-        <w:t xml:space="preserve">	12</w:t>
+        <w:t xml:space="preserve">	13</w:t>
       </w:r>
     </w:p>
     <w:p>
@@ -1510,7 +1529,7 @@
         <w:t xml:space="preserve">3.6 Skenario Evaluasi</w:t>
       </w:r>
       <w:r>
-        <w:t xml:space="preserve">	12</w:t>
+        <w:t xml:space="preserve">	14</w:t>
       </w:r>
     </w:p>
     <w:p>
@@ -1529,7 +1548,7 @@
         <w:t xml:space="preserve">3.7 Rancangan Aplikasi</w:t>
       </w:r>
       <w:r>
-        <w:t xml:space="preserve">	13</w:t>
+        <w:t xml:space="preserve">	15</w:t>
       </w:r>
     </w:p>
     <w:p>
@@ -1548,7 +1567,7 @@
         <w:t xml:space="preserve">3.8 Alat dan Bahan</w:t>
       </w:r>
       <w:r>
-        <w:t xml:space="preserve">	14</w:t>
+        <w:t xml:space="preserve">	16</w:t>
       </w:r>
     </w:p>
     <w:p>
@@ -1567,7 +1586,7 @@
         <w:t xml:space="preserve">3.9 Hasil Awal (Prototipe)</w:t>
       </w:r>
       <w:r>
-        <w:t xml:space="preserve">	14</w:t>
+        <w:t xml:space="preserve">	16</w:t>
       </w:r>
     </w:p>
     <w:p>
@@ -1586,7 +1605,7 @@
         <w:t xml:space="preserve">3.10 Jadwal Kegiatan</w:t>
       </w:r>
       <w:r>
-        <w:t xml:space="preserve">	16</w:t>
+        <w:t xml:space="preserve">	18</w:t>
       </w:r>
     </w:p>
     <w:p>
@@ -1605,7 +1624,7 @@
         <w:t xml:space="preserve">3.11 Pembagian Tugas</w:t>
       </w:r>
       <w:r>
-        <w:t xml:space="preserve">	16</w:t>
+        <w:t xml:space="preserve">	18</w:t>
       </w:r>
     </w:p>
     <w:p>
@@ -1624,7 +1643,7 @@
         <w:t xml:space="preserve">DAFTAR PUSTAKA</w:t>
       </w:r>
       <w:r>
-        <w:t xml:space="preserve">	17</w:t>
+        <w:t xml:space="preserve">	19</w:t>
       </w:r>
     </w:p>
     <w:p>
@@ -1695,7 +1714,7 @@
         <w:t xml:space="preserve">Tabel 3.1 Sumber data penelitian</w:t>
       </w:r>
       <w:r>
-        <w:t xml:space="preserve">	10</w:t>
+        <w:t xml:space="preserve">	12</w:t>
       </w:r>
     </w:p>
     <w:p>
@@ -1710,7 +1729,7 @@
         <w:t xml:space="preserve">Tabel 3.2 Fitur yang digunakan</w:t>
       </w:r>
       <w:r>
-        <w:t xml:space="preserve">	12</w:t>
+        <w:t xml:space="preserve">	13</w:t>
       </w:r>
     </w:p>
     <w:p>
@@ -1722,10 +1741,10 @@
         <w:ind w:left="1134" w:hanging="1134"/>
       </w:pPr>
       <w:r>
-        <w:t xml:space="preserve">Tabel 3.3 Algoritma dan pengaturan utama</w:t>
-      </w:r>
-      <w:r>
-        <w:t xml:space="preserve">	12</w:t>
+        <w:t xml:space="preserve">Tabel 3.3 Algoritma, pengaturan tetap, dan ruang pencarian grid search</w:t>
+      </w:r>
+      <w:r>
+        <w:t xml:space="preserve">	14</w:t>
       </w:r>
     </w:p>
     <w:p>
@@ -1740,7 +1759,7 @@
         <w:t xml:space="preserve">Tabel 3.4 Halaman aplikasi</w:t>
       </w:r>
       <w:r>
-        <w:t xml:space="preserve">	13</w:t>
+        <w:t xml:space="preserve">	16</w:t>
       </w:r>
     </w:p>
     <w:p>
@@ -1755,7 +1774,7 @@
         <w:t xml:space="preserve">Tabel 3.5 Jadwal kegiatan proyek</w:t>
       </w:r>
       <w:r>
-        <w:t xml:space="preserve">	16</w:t>
+        <w:t xml:space="preserve">	18</w:t>
       </w:r>
     </w:p>
     <w:p>
@@ -1770,7 +1789,7 @@
         <w:t xml:space="preserve">Tabel 3.6 Pembagian tugas anggota kelompok</w:t>
       </w:r>
       <w:r>
-        <w:t xml:space="preserve">	16</w:t>
+        <w:t xml:space="preserve">	18</w:t>
       </w:r>
     </w:p>
     <w:p>
@@ -1826,7 +1845,7 @@
         <w:t xml:space="preserve">Gambar 3.1 Alur penelitian berdasarkan CRISP-DM</w:t>
       </w:r>
       <w:r>
-        <w:t xml:space="preserve">	10</w:t>
+        <w:t xml:space="preserve">	11</w:t>
       </w:r>
     </w:p>
     <w:p>
@@ -1841,7 +1860,7 @@
         <w:t xml:space="preserve">Gambar 3.2 Prototipe halaman Kalkulator Peluang</w:t>
       </w:r>
       <w:r>
-        <w:t xml:space="preserve">	15</w:t>
+        <w:t xml:space="preserve">	17</w:t>
       </w:r>
     </w:p>
     <w:p>
@@ -2807,7 +2826,17 @@
         <w:jc w:val="both"/>
       </w:pPr>
       <w:r>
-        <w:t xml:space="preserve">Membandingkan kinerja enam algoritma klasifikasi dalam memprediksi keluarnya S-Rank.</w:t>
+        <w:t xml:space="preserve">Membandingkan kinerja enam algoritma klasifikasi dalam memprediksi keluarnya S-Rank, dengan hyperparameter yang dipilih melalui </w:t>
+      </w:r>
+      <w:r>
+        <w:rPr>
+          <w:i/>
+          <w:iCs/>
+        </w:rPr>
+        <w:t xml:space="preserve">grid search</w:t>
+      </w:r>
+      <w:r>
+        <w:t xml:space="preserve"> dan perbedaan kinerja yang diuji signifikansinya secara statistik.</w:t>
       </w:r>
     </w:p>
     <w:p>
@@ -5281,7 +5310,117 @@
         <w:spacing w:after="120" w:before="240" w:line="360"/>
       </w:pPr>
       <w:r>
-        <w:t xml:space="preserve">2.7 Streamlit</w:t>
+        <w:t xml:space="preserve">2.7 Pemilihan Hyperparameter dan Uji Signifikansi</w:t>
+      </w:r>
+    </w:p>
+    <w:p>
+      <w:pPr>
+        <w:spacing w:after="120" w:line="360"/>
+        <w:ind w:firstLine="709"/>
+        <w:jc w:val="both"/>
+      </w:pPr>
+      <w:r>
+        <w:rPr>
+          <w:i/>
+          <w:iCs/>
+        </w:rPr>
+        <w:t xml:space="preserve">Hyperparameter</w:t>
+      </w:r>
+      <w:r>
+        <w:t xml:space="preserve"> adalah pengaturan algoritma yang tidak dipelajari dari data, misalnya jumlah tetangga k pada KNN atau kedalaman maksimum pohon. </w:t>
+      </w:r>
+      <w:r>
+        <w:rPr>
+          <w:i/>
+          <w:iCs/>
+        </w:rPr>
+        <w:t xml:space="preserve">Grid search</w:t>
+      </w:r>
+      <w:r>
+        <w:t xml:space="preserve"> mencoba setiap kombinasi nilai dari ruang pencarian yang ditentukan, lalu memilih kombinasi dengan skor cross-validation terbaik (Pedregosa et al., 2011). Data yang dipakai untuk memilih hyperparameter tidak boleh sama dengan data yang dipakai untuk menilai model akhir, karena skornya akan terlihat lebih baik daripada kenyataan. Jika data terbatas, dipakai </w:t>
+      </w:r>
+      <w:r>
+        <w:rPr>
+          <w:i/>
+          <w:iCs/>
+        </w:rPr>
+        <w:t xml:space="preserve">nested cross-validation</w:t>
+      </w:r>
+      <w:r>
+        <w:t xml:space="preserve">: grid search dijalankan hanya di dalam data latih setiap fold, sedangkan data uji fold tersebut hanya dipakai untuk penilaian (Varma &amp; Simon, 2006).</w:t>
+      </w:r>
+    </w:p>
+    <w:p>
+      <w:pPr>
+        <w:spacing w:after="120" w:line="360"/>
+        <w:ind w:firstLine="709"/>
+        <w:jc w:val="both"/>
+      </w:pPr>
+      <w:r>
+        <w:t xml:space="preserve">Selisih akurasi antar-model juga perlu diuji, apakah bermakna secara statistik atau hanya kebetulan. Uji t berpasangan biasa pada hasil setiap fold terlalu mudah menyatakan dua model berbeda, karena data latih antarfold saling tumpang tindih sehingga hasilnya tidak saling bebas. Nadeau dan Bengio (2003) mengusulkan </w:t>
+      </w:r>
+      <w:r>
+        <w:rPr>
+          <w:b/>
+          <w:bCs/>
+        </w:rPr>
+        <w:t xml:space="preserve">uji t berpasangan terkoreksi</w:t>
+      </w:r>
+      <w:r>
+        <w:t xml:space="preserve"> (</w:t>
+      </w:r>
+      <w:r>
+        <w:rPr>
+          <w:i/>
+          <w:iCs/>
+        </w:rPr>
+        <w:t xml:space="preserve">corrected resampled t-test</w:t>
+      </w:r>
+      <w:r>
+        <w:t xml:space="preserve">) yang memperbesar varians dengan faktor koreksi:</w:t>
+      </w:r>
+    </w:p>
+    <w:p>
+      <w:pPr>
+        <w:spacing w:after="120" w:line="360"/>
+        <w:jc w:val="center"/>
+      </w:pPr>
+      <w:r>
+        <w:rPr>
+          <w:i/>
+          <w:iCs/>
+        </w:rPr>
+        <w:t xml:space="preserve">t = d̄ / √( (1/k + n_uji / n_latih) · s²_d )</w:t>
+      </w:r>
+    </w:p>
+    <w:p>
+      <w:pPr>
+        <w:spacing w:after="120" w:line="360"/>
+        <w:ind w:firstLine="709"/>
+        <w:jc w:val="both"/>
+      </w:pPr>
+      <w:r>
+        <w:t xml:space="preserve">dengan d̄ dan s²_d adalah rata-rata dan varians selisih akurasi dua model pada k fold, sedangkan n_uji/n_latih adalah perbandingan ukuran data uji dan data latih. Nilai t dibandingkan dengan distribusi t berderajat bebas k − 1. Jika p-value kurang dari 0,05, selisih kedua model dinyatakan </w:t>
+      </w:r>
+      <w:r>
+        <w:rPr>
+          <w:b/>
+          <w:bCs/>
+        </w:rPr>
+        <w:t xml:space="preserve">signifikan</w:t>
+      </w:r>
+      <w:r>
+        <w:t xml:space="preserve">.</w:t>
+      </w:r>
+    </w:p>
+    <w:p>
+      <w:pPr>
+        <w:pStyle w:val="Heading2"/>
+        <w:keepNext/>
+        <w:spacing w:after="120" w:before="240" w:line="360"/>
+      </w:pPr>
+      <w:r>
+        <w:t xml:space="preserve">2.8 Streamlit</w:t>
       </w:r>
     </w:p>
     <w:p>
@@ -5483,7 +5622,7 @@
         <w:t xml:space="preserve">Modeling:</w:t>
       </w:r>
       <w:r>
-        <w:t xml:space="preserve"> melatih enam algoritma klasifikasi dan menyusun model Markov Chain sebagai acuan teori.</w:t>
+        <w:t xml:space="preserve"> memilih hyperparameter dengan grid search, melatih enam algoritma klasifikasi, dan menyusun model Markov Chain sebagai acuan teori.</w:t>
       </w:r>
     </w:p>
     <w:p>
@@ -5504,7 +5643,7 @@
         <w:t xml:space="preserve">Evaluation:</w:t>
       </w:r>
       <w:r>
-        <w:t xml:space="preserve"> membandingkan model dengan cross-validation dan menguji pada data pemain asli.</w:t>
+        <w:t xml:space="preserve"> membandingkan model dengan cross-validation dan uji signifikansi, lalu menguji pada data pemain asli.</w:t>
       </w:r>
     </w:p>
     <w:p>
@@ -5807,6 +5946,107 @@
           </w:tcPr>
           <w:p>
             <w:pPr>
+              <w:keepNext/>
+              <w:keepLines/>
+              <w:spacing w:line="276"/>
+              <w:jc w:val="left"/>
+            </w:pPr>
+            <w:r>
+              <w:rPr>
+                <w:sz w:val="20"/>
+                <w:szCs w:val="20"/>
+              </w:rPr>
+              <w:t xml:space="preserve">Simulasi untuk grid search</w:t>
+            </w:r>
+          </w:p>
+        </w:tc>
+        <w:tc>
+          <w:tcPr>
+            <w:tcW w:type="dxa" w:w="4128"/>
+            <w:tcBorders>
+              <w:top w:val="single" w:color="808080" w:sz="4"/>
+              <w:left w:val="single" w:color="808080" w:sz="4"/>
+              <w:bottom w:val="single" w:color="808080" w:sz="4"/>
+              <w:right w:val="single" w:color="808080" w:sz="4"/>
+            </w:tcBorders>
+            <w:tcMar>
+              <w:top w:type="dxa" w:w="60"/>
+              <w:left w:type="dxa" w:w="100"/>
+              <w:bottom w:type="dxa" w:w="60"/>
+              <w:right w:type="dxa" w:w="100"/>
+            </w:tcMar>
+          </w:tcPr>
+          <w:p>
+            <w:pPr>
+              <w:keepNext/>
+              <w:keepLines/>
+              <w:spacing w:line="276"/>
+              <w:jc w:val="left"/>
+            </w:pPr>
+            <w:r>
+              <w:rPr>
+                <w:sz w:val="20"/>
+                <w:szCs w:val="20"/>
+              </w:rPr>
+              <w:t xml:space="preserve">100 akun virtual tambahan (seed 43); ±77 ribu baris</w:t>
+            </w:r>
+          </w:p>
+        </w:tc>
+        <w:tc>
+          <w:tcPr>
+            <w:tcW w:type="dxa" w:w="1905"/>
+            <w:tcBorders>
+              <w:top w:val="single" w:color="808080" w:sz="4"/>
+              <w:left w:val="single" w:color="808080" w:sz="4"/>
+              <w:bottom w:val="single" w:color="808080" w:sz="4"/>
+              <w:right w:val="single" w:color="808080" w:sz="4"/>
+            </w:tcBorders>
+            <w:tcMar>
+              <w:top w:type="dxa" w:w="60"/>
+              <w:left w:type="dxa" w:w="100"/>
+              <w:bottom w:type="dxa" w:w="60"/>
+              <w:right w:type="dxa" w:w="100"/>
+            </w:tcMar>
+          </w:tcPr>
+          <w:p>
+            <w:pPr>
+              <w:keepNext/>
+              <w:keepLines/>
+              <w:spacing w:line="276"/>
+              <w:jc w:val="left"/>
+            </w:pPr>
+            <w:r>
+              <w:rPr>
+                <w:sz w:val="20"/>
+                <w:szCs w:val="20"/>
+              </w:rPr>
+              <w:t xml:space="preserve">Pemilihan hyperparameter, tidak dipakai untuk evaluasi</w:t>
+            </w:r>
+          </w:p>
+        </w:tc>
+      </w:tr>
+      <w:tr>
+        <w:trPr>
+          <w:cantSplit/>
+        </w:trPr>
+        <w:tc>
+          <w:tcPr>
+            <w:tcW w:type="dxa" w:w="1905"/>
+            <w:tcBorders>
+              <w:top w:val="single" w:color="808080" w:sz="4"/>
+              <w:left w:val="single" w:color="808080" w:sz="4"/>
+              <w:bottom w:val="single" w:color="808080" w:sz="4"/>
+              <w:right w:val="single" w:color="808080" w:sz="4"/>
+            </w:tcBorders>
+            <w:tcMar>
+              <w:top w:type="dxa" w:w="60"/>
+              <w:left w:type="dxa" w:w="100"/>
+              <w:bottom w:type="dxa" w:w="60"/>
+              <w:right w:type="dxa" w:w="100"/>
+            </w:tcMar>
+          </w:tcPr>
+          <w:p>
+            <w:pPr>
               <w:keepNext w:val="false"/>
               <w:keepLines/>
               <w:spacing w:line="276"/>
@@ -6527,6 +6767,36 @@
     </w:p>
     <w:p>
       <w:pPr>
+        <w:spacing w:after="120" w:line="360"/>
+        <w:ind w:firstLine="709"/>
+        <w:jc w:val="both"/>
+      </w:pPr>
+      <w:r>
+        <w:t xml:space="preserve">Setiap algoritma memiliki pengaturan tetap dan beberapa </w:t>
+      </w:r>
+      <w:r>
+        <w:rPr>
+          <w:i/>
+          <w:iCs/>
+        </w:rPr>
+        <w:t xml:space="preserve">hyperparameter</w:t>
+      </w:r>
+      <w:r>
+        <w:t xml:space="preserve"> yang akan dipilih dengan </w:t>
+      </w:r>
+      <w:r>
+        <w:rPr>
+          <w:i/>
+          <w:iCs/>
+        </w:rPr>
+        <w:t xml:space="preserve">grid search</w:t>
+      </w:r>
+      <w:r>
+        <w:t xml:space="preserve"> (Tabel 3.3). Nilai pertama pada setiap ruang pencarian adalah pengaturan awal sebelum grid search, sehingga jika beberapa kombinasi memperoleh skor yang sama persis, pengaturan awal dipertahankan.</w:t>
+      </w:r>
+    </w:p>
+    <w:p>
+      <w:pPr>
         <w:keepNext/>
         <w:keepLines/>
         <w:spacing w:after="60" w:before="120"/>
@@ -6540,7 +6810,7 @@
         <w:t xml:space="preserve">Tabel 3.3</w:t>
       </w:r>
       <w:r>
-        <w:t xml:space="preserve"> Algoritma dan pengaturan utama</w:t>
+        <w:t xml:space="preserve"> Algoritma, pengaturan tetap, dan ruang pencarian grid search</w:t>
       </w:r>
     </w:p>
     <w:tbl>
@@ -6556,8 +6826,9 @@
         </w:tblBorders>
       </w:tblPr>
       <w:tblGrid>
-        <w:gridCol w:w="2540"/>
-        <w:gridCol w:w="5398"/>
+        <w:gridCol w:w="1905"/>
+        <w:gridCol w:w="3016"/>
+        <w:gridCol w:w="3017"/>
       </w:tblGrid>
       <w:tr>
         <w:trPr>
@@ -6566,7 +6837,7 @@
         </w:trPr>
         <w:tc>
           <w:tcPr>
-            <w:tcW w:type="dxa" w:w="2540"/>
+            <w:tcW w:type="dxa" w:w="1905"/>
             <w:tcBorders>
               <w:top w:val="single" w:color="808080" w:sz="4"/>
               <w:left w:val="single" w:color="808080" w:sz="4"/>
@@ -6592,8 +6863,8 @@
               <w:rPr>
                 <w:b/>
                 <w:bCs/>
-                <w:sz w:val="20"/>
-                <w:szCs w:val="20"/>
+                <w:sz w:val="19"/>
+                <w:szCs w:val="19"/>
               </w:rPr>
               <w:t xml:space="preserve">Algoritma</w:t>
             </w:r>
@@ -6601,7 +6872,7 @@
         </w:tc>
         <w:tc>
           <w:tcPr>
-            <w:tcW w:type="dxa" w:w="5398"/>
+            <w:tcW w:type="dxa" w:w="3016"/>
             <w:tcBorders>
               <w:top w:val="single" w:color="808080" w:sz="4"/>
               <w:left w:val="single" w:color="808080" w:sz="4"/>
@@ -6627,10 +6898,45 @@
               <w:rPr>
                 <w:b/>
                 <w:bCs/>
-                <w:sz w:val="20"/>
-                <w:szCs w:val="20"/>
-              </w:rPr>
-              <w:t xml:space="preserve">Pengaturan utama</w:t>
+                <w:sz w:val="19"/>
+                <w:szCs w:val="19"/>
+              </w:rPr>
+              <w:t xml:space="preserve">Pengaturan tetap</w:t>
+            </w:r>
+          </w:p>
+        </w:tc>
+        <w:tc>
+          <w:tcPr>
+            <w:tcW w:type="dxa" w:w="3017"/>
+            <w:tcBorders>
+              <w:top w:val="single" w:color="808080" w:sz="4"/>
+              <w:left w:val="single" w:color="808080" w:sz="4"/>
+              <w:bottom w:val="single" w:color="808080" w:sz="4"/>
+              <w:right w:val="single" w:color="808080" w:sz="4"/>
+            </w:tcBorders>
+            <w:shd w:fill="D9E2F3" w:color="auto" w:val="clear"/>
+            <w:tcMar>
+              <w:top w:type="dxa" w:w="60"/>
+              <w:left w:type="dxa" w:w="100"/>
+              <w:bottom w:type="dxa" w:w="60"/>
+              <w:right w:type="dxa" w:w="100"/>
+            </w:tcMar>
+          </w:tcPr>
+          <w:p>
+            <w:pPr>
+              <w:keepNext/>
+              <w:keepLines/>
+              <w:spacing w:line="276"/>
+              <w:jc w:val="left"/>
+            </w:pPr>
+            <w:r>
+              <w:rPr>
+                <w:b/>
+                <w:bCs/>
+                <w:sz w:val="19"/>
+                <w:szCs w:val="19"/>
+              </w:rPr>
+              <w:t xml:space="preserve">Ruang pencarian grid search</w:t>
             </w:r>
           </w:p>
         </w:tc>
@@ -6641,31 +6947,31 @@
         </w:trPr>
         <w:tc>
           <w:tcPr>
-            <w:tcW w:type="dxa" w:w="2540"/>
-            <w:tcBorders>
-              <w:top w:val="single" w:color="808080" w:sz="4"/>
-              <w:left w:val="single" w:color="808080" w:sz="4"/>
-              <w:bottom w:val="single" w:color="808080" w:sz="4"/>
-              <w:right w:val="single" w:color="808080" w:sz="4"/>
-            </w:tcBorders>
-            <w:tcMar>
-              <w:top w:type="dxa" w:w="60"/>
-              <w:left w:type="dxa" w:w="100"/>
-              <w:bottom w:type="dxa" w:w="60"/>
-              <w:right w:type="dxa" w:w="100"/>
-            </w:tcMar>
-          </w:tcPr>
-          <w:p>
-            <w:pPr>
-              <w:keepNext/>
-              <w:keepLines/>
-              <w:spacing w:line="276"/>
-              <w:jc w:val="left"/>
-            </w:pPr>
-            <w:r>
-              <w:rPr>
-                <w:sz w:val="20"/>
-                <w:szCs w:val="20"/>
+            <w:tcW w:type="dxa" w:w="1905"/>
+            <w:tcBorders>
+              <w:top w:val="single" w:color="808080" w:sz="4"/>
+              <w:left w:val="single" w:color="808080" w:sz="4"/>
+              <w:bottom w:val="single" w:color="808080" w:sz="4"/>
+              <w:right w:val="single" w:color="808080" w:sz="4"/>
+            </w:tcBorders>
+            <w:tcMar>
+              <w:top w:type="dxa" w:w="60"/>
+              <w:left w:type="dxa" w:w="100"/>
+              <w:bottom w:type="dxa" w:w="60"/>
+              <w:right w:type="dxa" w:w="100"/>
+            </w:tcMar>
+          </w:tcPr>
+          <w:p>
+            <w:pPr>
+              <w:keepNext/>
+              <w:keepLines/>
+              <w:spacing w:line="276"/>
+              <w:jc w:val="left"/>
+            </w:pPr>
+            <w:r>
+              <w:rPr>
+                <w:sz w:val="19"/>
+                <w:szCs w:val="19"/>
               </w:rPr>
               <w:t xml:space="preserve">Naive Bayes</w:t>
             </w:r>
@@ -6673,33 +6979,65 @@
         </w:tc>
         <w:tc>
           <w:tcPr>
-            <w:tcW w:type="dxa" w:w="5398"/>
-            <w:tcBorders>
-              <w:top w:val="single" w:color="808080" w:sz="4"/>
-              <w:left w:val="single" w:color="808080" w:sz="4"/>
-              <w:bottom w:val="single" w:color="808080" w:sz="4"/>
-              <w:right w:val="single" w:color="808080" w:sz="4"/>
-            </w:tcBorders>
-            <w:tcMar>
-              <w:top w:type="dxa" w:w="60"/>
-              <w:left w:type="dxa" w:w="100"/>
-              <w:bottom w:type="dxa" w:w="60"/>
-              <w:right w:type="dxa" w:w="100"/>
-            </w:tcMar>
-          </w:tcPr>
-          <w:p>
-            <w:pPr>
-              <w:keepNext/>
-              <w:keepLines/>
-              <w:spacing w:line="276"/>
-              <w:jc w:val="left"/>
-            </w:pPr>
-            <w:r>
-              <w:rPr>
-                <w:sz w:val="20"/>
-                <w:szCs w:val="20"/>
+            <w:tcW w:type="dxa" w:w="3016"/>
+            <w:tcBorders>
+              <w:top w:val="single" w:color="808080" w:sz="4"/>
+              <w:left w:val="single" w:color="808080" w:sz="4"/>
+              <w:bottom w:val="single" w:color="808080" w:sz="4"/>
+              <w:right w:val="single" w:color="808080" w:sz="4"/>
+            </w:tcBorders>
+            <w:tcMar>
+              <w:top w:type="dxa" w:w="60"/>
+              <w:left w:type="dxa" w:w="100"/>
+              <w:bottom w:type="dxa" w:w="60"/>
+              <w:right w:type="dxa" w:w="100"/>
+            </w:tcMar>
+          </w:tcPr>
+          <w:p>
+            <w:pPr>
+              <w:keepNext/>
+              <w:keepLines/>
+              <w:spacing w:line="276"/>
+              <w:jc w:val="left"/>
+            </w:pPr>
+            <w:r>
+              <w:rPr>
+                <w:sz w:val="19"/>
+                <w:szCs w:val="19"/>
               </w:rPr>
               <w:t xml:space="preserve">Gaussian Naive Bayes</w:t>
+            </w:r>
+          </w:p>
+        </w:tc>
+        <w:tc>
+          <w:tcPr>
+            <w:tcW w:type="dxa" w:w="3017"/>
+            <w:tcBorders>
+              <w:top w:val="single" w:color="808080" w:sz="4"/>
+              <w:left w:val="single" w:color="808080" w:sz="4"/>
+              <w:bottom w:val="single" w:color="808080" w:sz="4"/>
+              <w:right w:val="single" w:color="808080" w:sz="4"/>
+            </w:tcBorders>
+            <w:tcMar>
+              <w:top w:type="dxa" w:w="60"/>
+              <w:left w:type="dxa" w:w="100"/>
+              <w:bottom w:type="dxa" w:w="60"/>
+              <w:right w:type="dxa" w:w="100"/>
+            </w:tcMar>
+          </w:tcPr>
+          <w:p>
+            <w:pPr>
+              <w:keepNext/>
+              <w:keepLines/>
+              <w:spacing w:line="276"/>
+              <w:jc w:val="left"/>
+            </w:pPr>
+            <w:r>
+              <w:rPr>
+                <w:sz w:val="19"/>
+                <w:szCs w:val="19"/>
+              </w:rPr>
+              <w:t xml:space="preserve">var_smoothing ∈ {10⁻⁹; 10⁻⁶; 10⁻³; 0,01; 0,1; 1}</w:t>
             </w:r>
           </w:p>
         </w:tc>
@@ -6710,31 +7048,31 @@
         </w:trPr>
         <w:tc>
           <w:tcPr>
-            <w:tcW w:type="dxa" w:w="2540"/>
-            <w:tcBorders>
-              <w:top w:val="single" w:color="808080" w:sz="4"/>
-              <w:left w:val="single" w:color="808080" w:sz="4"/>
-              <w:bottom w:val="single" w:color="808080" w:sz="4"/>
-              <w:right w:val="single" w:color="808080" w:sz="4"/>
-            </w:tcBorders>
-            <w:tcMar>
-              <w:top w:type="dxa" w:w="60"/>
-              <w:left w:type="dxa" w:w="100"/>
-              <w:bottom w:type="dxa" w:w="60"/>
-              <w:right w:type="dxa" w:w="100"/>
-            </w:tcMar>
-          </w:tcPr>
-          <w:p>
-            <w:pPr>
-              <w:keepNext/>
-              <w:keepLines/>
-              <w:spacing w:line="276"/>
-              <w:jc w:val="left"/>
-            </w:pPr>
-            <w:r>
-              <w:rPr>
-                <w:sz w:val="20"/>
-                <w:szCs w:val="20"/>
+            <w:tcW w:type="dxa" w:w="1905"/>
+            <w:tcBorders>
+              <w:top w:val="single" w:color="808080" w:sz="4"/>
+              <w:left w:val="single" w:color="808080" w:sz="4"/>
+              <w:bottom w:val="single" w:color="808080" w:sz="4"/>
+              <w:right w:val="single" w:color="808080" w:sz="4"/>
+            </w:tcBorders>
+            <w:tcMar>
+              <w:top w:type="dxa" w:w="60"/>
+              <w:left w:type="dxa" w:w="100"/>
+              <w:bottom w:type="dxa" w:w="60"/>
+              <w:right w:type="dxa" w:w="100"/>
+            </w:tcMar>
+          </w:tcPr>
+          <w:p>
+            <w:pPr>
+              <w:keepNext/>
+              <w:keepLines/>
+              <w:spacing w:line="276"/>
+              <w:jc w:val="left"/>
+            </w:pPr>
+            <w:r>
+              <w:rPr>
+                <w:sz w:val="19"/>
+                <w:szCs w:val="19"/>
               </w:rPr>
               <w:t xml:space="preserve">KNN</w:t>
             </w:r>
@@ -6742,33 +7080,65 @@
         </w:tc>
         <w:tc>
           <w:tcPr>
-            <w:tcW w:type="dxa" w:w="5398"/>
-            <w:tcBorders>
-              <w:top w:val="single" w:color="808080" w:sz="4"/>
-              <w:left w:val="single" w:color="808080" w:sz="4"/>
-              <w:bottom w:val="single" w:color="808080" w:sz="4"/>
-              <w:right w:val="single" w:color="808080" w:sz="4"/>
-            </w:tcBorders>
-            <w:tcMar>
-              <w:top w:type="dxa" w:w="60"/>
-              <w:left w:type="dxa" w:w="100"/>
-              <w:bottom w:type="dxa" w:w="60"/>
-              <w:right w:type="dxa" w:w="100"/>
-            </w:tcMar>
-          </w:tcPr>
-          <w:p>
-            <w:pPr>
-              <w:keepNext/>
-              <w:keepLines/>
-              <w:spacing w:line="276"/>
-              <w:jc w:val="left"/>
-            </w:pPr>
-            <w:r>
-              <w:rPr>
-                <w:sz w:val="20"/>
-                <w:szCs w:val="20"/>
-              </w:rPr>
-              <w:t xml:space="preserve">normalisasi StandardScaler, k = 101 tetangga</w:t>
+            <w:tcW w:type="dxa" w:w="3016"/>
+            <w:tcBorders>
+              <w:top w:val="single" w:color="808080" w:sz="4"/>
+              <w:left w:val="single" w:color="808080" w:sz="4"/>
+              <w:bottom w:val="single" w:color="808080" w:sz="4"/>
+              <w:right w:val="single" w:color="808080" w:sz="4"/>
+            </w:tcBorders>
+            <w:tcMar>
+              <w:top w:type="dxa" w:w="60"/>
+              <w:left w:type="dxa" w:w="100"/>
+              <w:bottom w:type="dxa" w:w="60"/>
+              <w:right w:type="dxa" w:w="100"/>
+            </w:tcMar>
+          </w:tcPr>
+          <w:p>
+            <w:pPr>
+              <w:keepNext/>
+              <w:keepLines/>
+              <w:spacing w:line="276"/>
+              <w:jc w:val="left"/>
+            </w:pPr>
+            <w:r>
+              <w:rPr>
+                <w:sz w:val="19"/>
+                <w:szCs w:val="19"/>
+              </w:rPr>
+              <w:t xml:space="preserve">normalisasi StandardScaler, jarak Euclidean</w:t>
+            </w:r>
+          </w:p>
+        </w:tc>
+        <w:tc>
+          <w:tcPr>
+            <w:tcW w:type="dxa" w:w="3017"/>
+            <w:tcBorders>
+              <w:top w:val="single" w:color="808080" w:sz="4"/>
+              <w:left w:val="single" w:color="808080" w:sz="4"/>
+              <w:bottom w:val="single" w:color="808080" w:sz="4"/>
+              <w:right w:val="single" w:color="808080" w:sz="4"/>
+            </w:tcBorders>
+            <w:tcMar>
+              <w:top w:type="dxa" w:w="60"/>
+              <w:left w:type="dxa" w:w="100"/>
+              <w:bottom w:type="dxa" w:w="60"/>
+              <w:right w:type="dxa" w:w="100"/>
+            </w:tcMar>
+          </w:tcPr>
+          <w:p>
+            <w:pPr>
+              <w:keepNext/>
+              <w:keepLines/>
+              <w:spacing w:line="276"/>
+              <w:jc w:val="left"/>
+            </w:pPr>
+            <w:r>
+              <w:rPr>
+                <w:sz w:val="19"/>
+                <w:szCs w:val="19"/>
+              </w:rPr>
+              <w:t xml:space="preserve">k ∈ {101; 5; 15; 31; 51; 201}</w:t>
             </w:r>
           </w:p>
         </w:tc>
@@ -6779,31 +7149,31 @@
         </w:trPr>
         <w:tc>
           <w:tcPr>
-            <w:tcW w:type="dxa" w:w="2540"/>
-            <w:tcBorders>
-              <w:top w:val="single" w:color="808080" w:sz="4"/>
-              <w:left w:val="single" w:color="808080" w:sz="4"/>
-              <w:bottom w:val="single" w:color="808080" w:sz="4"/>
-              <w:right w:val="single" w:color="808080" w:sz="4"/>
-            </w:tcBorders>
-            <w:tcMar>
-              <w:top w:type="dxa" w:w="60"/>
-              <w:left w:type="dxa" w:w="100"/>
-              <w:bottom w:type="dxa" w:w="60"/>
-              <w:right w:type="dxa" w:w="100"/>
-            </w:tcMar>
-          </w:tcPr>
-          <w:p>
-            <w:pPr>
-              <w:keepNext/>
-              <w:keepLines/>
-              <w:spacing w:line="276"/>
-              <w:jc w:val="left"/>
-            </w:pPr>
-            <w:r>
-              <w:rPr>
-                <w:sz w:val="20"/>
-                <w:szCs w:val="20"/>
+            <w:tcW w:type="dxa" w:w="1905"/>
+            <w:tcBorders>
+              <w:top w:val="single" w:color="808080" w:sz="4"/>
+              <w:left w:val="single" w:color="808080" w:sz="4"/>
+              <w:bottom w:val="single" w:color="808080" w:sz="4"/>
+              <w:right w:val="single" w:color="808080" w:sz="4"/>
+            </w:tcBorders>
+            <w:tcMar>
+              <w:top w:type="dxa" w:w="60"/>
+              <w:left w:type="dxa" w:w="100"/>
+              <w:bottom w:type="dxa" w:w="60"/>
+              <w:right w:type="dxa" w:w="100"/>
+            </w:tcMar>
+          </w:tcPr>
+          <w:p>
+            <w:pPr>
+              <w:keepNext/>
+              <w:keepLines/>
+              <w:spacing w:line="276"/>
+              <w:jc w:val="left"/>
+            </w:pPr>
+            <w:r>
+              <w:rPr>
+                <w:sz w:val="19"/>
+                <w:szCs w:val="19"/>
               </w:rPr>
               <w:t xml:space="preserve">Logistic Regression</w:t>
             </w:r>
@@ -6811,33 +7181,65 @@
         </w:tc>
         <w:tc>
           <w:tcPr>
-            <w:tcW w:type="dxa" w:w="5398"/>
-            <w:tcBorders>
-              <w:top w:val="single" w:color="808080" w:sz="4"/>
-              <w:left w:val="single" w:color="808080" w:sz="4"/>
-              <w:bottom w:val="single" w:color="808080" w:sz="4"/>
-              <w:right w:val="single" w:color="808080" w:sz="4"/>
-            </w:tcBorders>
-            <w:tcMar>
-              <w:top w:type="dxa" w:w="60"/>
-              <w:left w:type="dxa" w:w="100"/>
-              <w:bottom w:type="dxa" w:w="60"/>
-              <w:right w:type="dxa" w:w="100"/>
-            </w:tcMar>
-          </w:tcPr>
-          <w:p>
-            <w:pPr>
-              <w:keepNext/>
-              <w:keepLines/>
-              <w:spacing w:line="276"/>
-              <w:jc w:val="left"/>
-            </w:pPr>
-            <w:r>
-              <w:rPr>
-                <w:sz w:val="20"/>
-                <w:szCs w:val="20"/>
+            <w:tcW w:type="dxa" w:w="3016"/>
+            <w:tcBorders>
+              <w:top w:val="single" w:color="808080" w:sz="4"/>
+              <w:left w:val="single" w:color="808080" w:sz="4"/>
+              <w:bottom w:val="single" w:color="808080" w:sz="4"/>
+              <w:right w:val="single" w:color="808080" w:sz="4"/>
+            </w:tcBorders>
+            <w:tcMar>
+              <w:top w:type="dxa" w:w="60"/>
+              <w:left w:type="dxa" w:w="100"/>
+              <w:bottom w:type="dxa" w:w="60"/>
+              <w:right w:type="dxa" w:w="100"/>
+            </w:tcMar>
+          </w:tcPr>
+          <w:p>
+            <w:pPr>
+              <w:keepNext/>
+              <w:keepLines/>
+              <w:spacing w:line="276"/>
+              <w:jc w:val="left"/>
+            </w:pPr>
+            <w:r>
+              <w:rPr>
+                <w:sz w:val="19"/>
+                <w:szCs w:val="19"/>
               </w:rPr>
               <w:t xml:space="preserve">normalisasi StandardScaler, max_iter 2000</w:t>
+            </w:r>
+          </w:p>
+        </w:tc>
+        <w:tc>
+          <w:tcPr>
+            <w:tcW w:type="dxa" w:w="3017"/>
+            <w:tcBorders>
+              <w:top w:val="single" w:color="808080" w:sz="4"/>
+              <w:left w:val="single" w:color="808080" w:sz="4"/>
+              <w:bottom w:val="single" w:color="808080" w:sz="4"/>
+              <w:right w:val="single" w:color="808080" w:sz="4"/>
+            </w:tcBorders>
+            <w:tcMar>
+              <w:top w:type="dxa" w:w="60"/>
+              <w:left w:type="dxa" w:w="100"/>
+              <w:bottom w:type="dxa" w:w="60"/>
+              <w:right w:type="dxa" w:w="100"/>
+            </w:tcMar>
+          </w:tcPr>
+          <w:p>
+            <w:pPr>
+              <w:keepNext/>
+              <w:keepLines/>
+              <w:spacing w:line="276"/>
+              <w:jc w:val="left"/>
+            </w:pPr>
+            <w:r>
+              <w:rPr>
+                <w:sz w:val="19"/>
+                <w:szCs w:val="19"/>
+              </w:rPr>
+              <w:t xml:space="preserve">C ∈ {1; 0,01; 0,1; 10}</w:t>
             </w:r>
           </w:p>
         </w:tc>
@@ -6848,31 +7250,31 @@
         </w:trPr>
         <w:tc>
           <w:tcPr>
-            <w:tcW w:type="dxa" w:w="2540"/>
-            <w:tcBorders>
-              <w:top w:val="single" w:color="808080" w:sz="4"/>
-              <w:left w:val="single" w:color="808080" w:sz="4"/>
-              <w:bottom w:val="single" w:color="808080" w:sz="4"/>
-              <w:right w:val="single" w:color="808080" w:sz="4"/>
-            </w:tcBorders>
-            <w:tcMar>
-              <w:top w:type="dxa" w:w="60"/>
-              <w:left w:type="dxa" w:w="100"/>
-              <w:bottom w:type="dxa" w:w="60"/>
-              <w:right w:type="dxa" w:w="100"/>
-            </w:tcMar>
-          </w:tcPr>
-          <w:p>
-            <w:pPr>
-              <w:keepNext/>
-              <w:keepLines/>
-              <w:spacing w:line="276"/>
-              <w:jc w:val="left"/>
-            </w:pPr>
-            <w:r>
-              <w:rPr>
-                <w:sz w:val="20"/>
-                <w:szCs w:val="20"/>
+            <w:tcW w:type="dxa" w:w="1905"/>
+            <w:tcBorders>
+              <w:top w:val="single" w:color="808080" w:sz="4"/>
+              <w:left w:val="single" w:color="808080" w:sz="4"/>
+              <w:bottom w:val="single" w:color="808080" w:sz="4"/>
+              <w:right w:val="single" w:color="808080" w:sz="4"/>
+            </w:tcBorders>
+            <w:tcMar>
+              <w:top w:type="dxa" w:w="60"/>
+              <w:left w:type="dxa" w:w="100"/>
+              <w:bottom w:type="dxa" w:w="60"/>
+              <w:right w:type="dxa" w:w="100"/>
+            </w:tcMar>
+          </w:tcPr>
+          <w:p>
+            <w:pPr>
+              <w:keepNext/>
+              <w:keepLines/>
+              <w:spacing w:line="276"/>
+              <w:jc w:val="left"/>
+            </w:pPr>
+            <w:r>
+              <w:rPr>
+                <w:sz w:val="19"/>
+                <w:szCs w:val="19"/>
               </w:rPr>
               <w:t xml:space="preserve">Decision Tree</w:t>
             </w:r>
@@ -6880,33 +7282,65 @@
         </w:tc>
         <w:tc>
           <w:tcPr>
-            <w:tcW w:type="dxa" w:w="5398"/>
-            <w:tcBorders>
-              <w:top w:val="single" w:color="808080" w:sz="4"/>
-              <w:left w:val="single" w:color="808080" w:sz="4"/>
-              <w:bottom w:val="single" w:color="808080" w:sz="4"/>
-              <w:right w:val="single" w:color="808080" w:sz="4"/>
-            </w:tcBorders>
-            <w:tcMar>
-              <w:top w:type="dxa" w:w="60"/>
-              <w:left w:type="dxa" w:w="100"/>
-              <w:bottom w:type="dxa" w:w="60"/>
-              <w:right w:type="dxa" w:w="100"/>
-            </w:tcMar>
-          </w:tcPr>
-          <w:p>
-            <w:pPr>
-              <w:keepNext/>
-              <w:keepLines/>
-              <w:spacing w:line="276"/>
-              <w:jc w:val="left"/>
-            </w:pPr>
-            <w:r>
-              <w:rPr>
-                <w:sz w:val="20"/>
-                <w:szCs w:val="20"/>
-              </w:rPr>
-              <w:t xml:space="preserve">max_depth 6, min_samples_leaf 50</w:t>
+            <w:tcW w:type="dxa" w:w="3016"/>
+            <w:tcBorders>
+              <w:top w:val="single" w:color="808080" w:sz="4"/>
+              <w:left w:val="single" w:color="808080" w:sz="4"/>
+              <w:bottom w:val="single" w:color="808080" w:sz="4"/>
+              <w:right w:val="single" w:color="808080" w:sz="4"/>
+            </w:tcBorders>
+            <w:tcMar>
+              <w:top w:type="dxa" w:w="60"/>
+              <w:left w:type="dxa" w:w="100"/>
+              <w:bottom w:type="dxa" w:w="60"/>
+              <w:right w:type="dxa" w:w="100"/>
+            </w:tcMar>
+          </w:tcPr>
+          <w:p>
+            <w:pPr>
+              <w:keepNext/>
+              <w:keepLines/>
+              <w:spacing w:line="276"/>
+              <w:jc w:val="left"/>
+            </w:pPr>
+            <w:r>
+              <w:rPr>
+                <w:sz w:val="19"/>
+                <w:szCs w:val="19"/>
+              </w:rPr>
+              <w:t xml:space="preserve">indeks Gini</w:t>
+            </w:r>
+          </w:p>
+        </w:tc>
+        <w:tc>
+          <w:tcPr>
+            <w:tcW w:type="dxa" w:w="3017"/>
+            <w:tcBorders>
+              <w:top w:val="single" w:color="808080" w:sz="4"/>
+              <w:left w:val="single" w:color="808080" w:sz="4"/>
+              <w:bottom w:val="single" w:color="808080" w:sz="4"/>
+              <w:right w:val="single" w:color="808080" w:sz="4"/>
+            </w:tcBorders>
+            <w:tcMar>
+              <w:top w:type="dxa" w:w="60"/>
+              <w:left w:type="dxa" w:w="100"/>
+              <w:bottom w:type="dxa" w:w="60"/>
+              <w:right w:type="dxa" w:w="100"/>
+            </w:tcMar>
+          </w:tcPr>
+          <w:p>
+            <w:pPr>
+              <w:keepNext/>
+              <w:keepLines/>
+              <w:spacing w:line="276"/>
+              <w:jc w:val="left"/>
+            </w:pPr>
+            <w:r>
+              <w:rPr>
+                <w:sz w:val="19"/>
+                <w:szCs w:val="19"/>
+              </w:rPr>
+              <w:t xml:space="preserve">max_depth ∈ {6; 3; 4; 8}; min_samples_leaf ∈ {50; 20; 100}</w:t>
             </w:r>
           </w:p>
         </w:tc>
@@ -6917,31 +7351,31 @@
         </w:trPr>
         <w:tc>
           <w:tcPr>
-            <w:tcW w:type="dxa" w:w="2540"/>
-            <w:tcBorders>
-              <w:top w:val="single" w:color="808080" w:sz="4"/>
-              <w:left w:val="single" w:color="808080" w:sz="4"/>
-              <w:bottom w:val="single" w:color="808080" w:sz="4"/>
-              <w:right w:val="single" w:color="808080" w:sz="4"/>
-            </w:tcBorders>
-            <w:tcMar>
-              <w:top w:type="dxa" w:w="60"/>
-              <w:left w:type="dxa" w:w="100"/>
-              <w:bottom w:type="dxa" w:w="60"/>
-              <w:right w:type="dxa" w:w="100"/>
-            </w:tcMar>
-          </w:tcPr>
-          <w:p>
-            <w:pPr>
-              <w:keepNext/>
-              <w:keepLines/>
-              <w:spacing w:line="276"/>
-              <w:jc w:val="left"/>
-            </w:pPr>
-            <w:r>
-              <w:rPr>
-                <w:sz w:val="20"/>
-                <w:szCs w:val="20"/>
+            <w:tcW w:type="dxa" w:w="1905"/>
+            <w:tcBorders>
+              <w:top w:val="single" w:color="808080" w:sz="4"/>
+              <w:left w:val="single" w:color="808080" w:sz="4"/>
+              <w:bottom w:val="single" w:color="808080" w:sz="4"/>
+              <w:right w:val="single" w:color="808080" w:sz="4"/>
+            </w:tcBorders>
+            <w:tcMar>
+              <w:top w:type="dxa" w:w="60"/>
+              <w:left w:type="dxa" w:w="100"/>
+              <w:bottom w:type="dxa" w:w="60"/>
+              <w:right w:type="dxa" w:w="100"/>
+            </w:tcMar>
+          </w:tcPr>
+          <w:p>
+            <w:pPr>
+              <w:keepNext/>
+              <w:keepLines/>
+              <w:spacing w:line="276"/>
+              <w:jc w:val="left"/>
+            </w:pPr>
+            <w:r>
+              <w:rPr>
+                <w:sz w:val="19"/>
+                <w:szCs w:val="19"/>
               </w:rPr>
               <w:t xml:space="preserve">Random Forest</w:t>
             </w:r>
@@ -6949,33 +7383,65 @@
         </w:tc>
         <w:tc>
           <w:tcPr>
-            <w:tcW w:type="dxa" w:w="5398"/>
-            <w:tcBorders>
-              <w:top w:val="single" w:color="808080" w:sz="4"/>
-              <w:left w:val="single" w:color="808080" w:sz="4"/>
-              <w:bottom w:val="single" w:color="808080" w:sz="4"/>
-              <w:right w:val="single" w:color="808080" w:sz="4"/>
-            </w:tcBorders>
-            <w:tcMar>
-              <w:top w:type="dxa" w:w="60"/>
-              <w:left w:type="dxa" w:w="100"/>
-              <w:bottom w:type="dxa" w:w="60"/>
-              <w:right w:type="dxa" w:w="100"/>
-            </w:tcMar>
-          </w:tcPr>
-          <w:p>
-            <w:pPr>
-              <w:keepNext/>
-              <w:keepLines/>
-              <w:spacing w:line="276"/>
-              <w:jc w:val="left"/>
-            </w:pPr>
-            <w:r>
-              <w:rPr>
-                <w:sz w:val="20"/>
-                <w:szCs w:val="20"/>
-              </w:rPr>
-              <w:t xml:space="preserve">150 pohon, max_depth 8, min_samples_leaf 20</w:t>
+            <w:tcW w:type="dxa" w:w="3016"/>
+            <w:tcBorders>
+              <w:top w:val="single" w:color="808080" w:sz="4"/>
+              <w:left w:val="single" w:color="808080" w:sz="4"/>
+              <w:bottom w:val="single" w:color="808080" w:sz="4"/>
+              <w:right w:val="single" w:color="808080" w:sz="4"/>
+            </w:tcBorders>
+            <w:tcMar>
+              <w:top w:type="dxa" w:w="60"/>
+              <w:left w:type="dxa" w:w="100"/>
+              <w:bottom w:type="dxa" w:w="60"/>
+              <w:right w:type="dxa" w:w="100"/>
+            </w:tcMar>
+          </w:tcPr>
+          <w:p>
+            <w:pPr>
+              <w:keepNext/>
+              <w:keepLines/>
+              <w:spacing w:line="276"/>
+              <w:jc w:val="left"/>
+            </w:pPr>
+            <w:r>
+              <w:rPr>
+                <w:sz w:val="19"/>
+                <w:szCs w:val="19"/>
+              </w:rPr>
+              <w:t xml:space="preserve">150 pohon</w:t>
+            </w:r>
+          </w:p>
+        </w:tc>
+        <w:tc>
+          <w:tcPr>
+            <w:tcW w:type="dxa" w:w="3017"/>
+            <w:tcBorders>
+              <w:top w:val="single" w:color="808080" w:sz="4"/>
+              <w:left w:val="single" w:color="808080" w:sz="4"/>
+              <w:bottom w:val="single" w:color="808080" w:sz="4"/>
+              <w:right w:val="single" w:color="808080" w:sz="4"/>
+            </w:tcBorders>
+            <w:tcMar>
+              <w:top w:type="dxa" w:w="60"/>
+              <w:left w:type="dxa" w:w="100"/>
+              <w:bottom w:type="dxa" w:w="60"/>
+              <w:right w:type="dxa" w:w="100"/>
+            </w:tcMar>
+          </w:tcPr>
+          <w:p>
+            <w:pPr>
+              <w:keepNext/>
+              <w:keepLines/>
+              <w:spacing w:line="276"/>
+              <w:jc w:val="left"/>
+            </w:pPr>
+            <w:r>
+              <w:rPr>
+                <w:sz w:val="19"/>
+                <w:szCs w:val="19"/>
+              </w:rPr>
+              <w:t xml:space="preserve">max_depth ∈ {8; 6; 12}; min_samples_leaf ∈ {20; 10; 50}</w:t>
             </w:r>
           </w:p>
         </w:tc>
@@ -6986,31 +7452,31 @@
         </w:trPr>
         <w:tc>
           <w:tcPr>
-            <w:tcW w:type="dxa" w:w="2540"/>
-            <w:tcBorders>
-              <w:top w:val="single" w:color="808080" w:sz="4"/>
-              <w:left w:val="single" w:color="808080" w:sz="4"/>
-              <w:bottom w:val="single" w:color="808080" w:sz="4"/>
-              <w:right w:val="single" w:color="808080" w:sz="4"/>
-            </w:tcBorders>
-            <w:tcMar>
-              <w:top w:type="dxa" w:w="60"/>
-              <w:left w:type="dxa" w:w="100"/>
-              <w:bottom w:type="dxa" w:w="60"/>
-              <w:right w:type="dxa" w:w="100"/>
-            </w:tcMar>
-          </w:tcPr>
-          <w:p>
-            <w:pPr>
-              <w:keepNext/>
-              <w:keepLines/>
-              <w:spacing w:line="276"/>
-              <w:jc w:val="left"/>
-            </w:pPr>
-            <w:r>
-              <w:rPr>
-                <w:sz w:val="20"/>
-                <w:szCs w:val="20"/>
+            <w:tcW w:type="dxa" w:w="1905"/>
+            <w:tcBorders>
+              <w:top w:val="single" w:color="808080" w:sz="4"/>
+              <w:left w:val="single" w:color="808080" w:sz="4"/>
+              <w:bottom w:val="single" w:color="808080" w:sz="4"/>
+              <w:right w:val="single" w:color="808080" w:sz="4"/>
+            </w:tcBorders>
+            <w:tcMar>
+              <w:top w:type="dxa" w:w="60"/>
+              <w:left w:type="dxa" w:w="100"/>
+              <w:bottom w:type="dxa" w:w="60"/>
+              <w:right w:type="dxa" w:w="100"/>
+            </w:tcMar>
+          </w:tcPr>
+          <w:p>
+            <w:pPr>
+              <w:keepNext/>
+              <w:keepLines/>
+              <w:spacing w:line="276"/>
+              <w:jc w:val="left"/>
+            </w:pPr>
+            <w:r>
+              <w:rPr>
+                <w:sz w:val="19"/>
+                <w:szCs w:val="19"/>
               </w:rPr>
               <w:t xml:space="preserve">XGBoost</w:t>
             </w:r>
@@ -7018,33 +7484,65 @@
         </w:tc>
         <w:tc>
           <w:tcPr>
-            <w:tcW w:type="dxa" w:w="5398"/>
-            <w:tcBorders>
-              <w:top w:val="single" w:color="808080" w:sz="4"/>
-              <w:left w:val="single" w:color="808080" w:sz="4"/>
-              <w:bottom w:val="single" w:color="808080" w:sz="4"/>
-              <w:right w:val="single" w:color="808080" w:sz="4"/>
-            </w:tcBorders>
-            <w:tcMar>
-              <w:top w:type="dxa" w:w="60"/>
-              <w:left w:type="dxa" w:w="100"/>
-              <w:bottom w:type="dxa" w:w="60"/>
-              <w:right w:type="dxa" w:w="100"/>
-            </w:tcMar>
-          </w:tcPr>
-          <w:p>
-            <w:pPr>
-              <w:keepNext/>
-              <w:keepLines/>
-              <w:spacing w:line="276"/>
-              <w:jc w:val="left"/>
-            </w:pPr>
-            <w:r>
-              <w:rPr>
-                <w:sz w:val="20"/>
-                <w:szCs w:val="20"/>
-              </w:rPr>
-              <w:t xml:space="preserve">300 pohon, max_depth 4, learning rate 0,05, subsample 0,8</w:t>
+            <w:tcW w:type="dxa" w:w="3016"/>
+            <w:tcBorders>
+              <w:top w:val="single" w:color="808080" w:sz="4"/>
+              <w:left w:val="single" w:color="808080" w:sz="4"/>
+              <w:bottom w:val="single" w:color="808080" w:sz="4"/>
+              <w:right w:val="single" w:color="808080" w:sz="4"/>
+            </w:tcBorders>
+            <w:tcMar>
+              <w:top w:type="dxa" w:w="60"/>
+              <w:left w:type="dxa" w:w="100"/>
+              <w:bottom w:type="dxa" w:w="60"/>
+              <w:right w:type="dxa" w:w="100"/>
+            </w:tcMar>
+          </w:tcPr>
+          <w:p>
+            <w:pPr>
+              <w:keepNext/>
+              <w:keepLines/>
+              <w:spacing w:line="276"/>
+              <w:jc w:val="left"/>
+            </w:pPr>
+            <w:r>
+              <w:rPr>
+                <w:sz w:val="19"/>
+                <w:szCs w:val="19"/>
+              </w:rPr>
+              <w:t xml:space="preserve">300 pohon, subsample 0,8</w:t>
+            </w:r>
+          </w:p>
+        </w:tc>
+        <w:tc>
+          <w:tcPr>
+            <w:tcW w:type="dxa" w:w="3017"/>
+            <w:tcBorders>
+              <w:top w:val="single" w:color="808080" w:sz="4"/>
+              <w:left w:val="single" w:color="808080" w:sz="4"/>
+              <w:bottom w:val="single" w:color="808080" w:sz="4"/>
+              <w:right w:val="single" w:color="808080" w:sz="4"/>
+            </w:tcBorders>
+            <w:tcMar>
+              <w:top w:type="dxa" w:w="60"/>
+              <w:left w:type="dxa" w:w="100"/>
+              <w:bottom w:type="dxa" w:w="60"/>
+              <w:right w:type="dxa" w:w="100"/>
+            </w:tcMar>
+          </w:tcPr>
+          <w:p>
+            <w:pPr>
+              <w:keepNext/>
+              <w:keepLines/>
+              <w:spacing w:line="276"/>
+              <w:jc w:val="left"/>
+            </w:pPr>
+            <w:r>
+              <w:rPr>
+                <w:sz w:val="19"/>
+                <w:szCs w:val="19"/>
+              </w:rPr>
+              <w:t xml:space="preserve">max_depth ∈ {4; 3; 6}; learning_rate ∈ {0,05; 0,1}</w:t>
             </w:r>
           </w:p>
         </w:tc>
@@ -7055,31 +7553,31 @@
         </w:trPr>
         <w:tc>
           <w:tcPr>
-            <w:tcW w:type="dxa" w:w="2540"/>
-            <w:tcBorders>
-              <w:top w:val="single" w:color="808080" w:sz="4"/>
-              <w:left w:val="single" w:color="808080" w:sz="4"/>
-              <w:bottom w:val="single" w:color="808080" w:sz="4"/>
-              <w:right w:val="single" w:color="808080" w:sz="4"/>
-            </w:tcBorders>
-            <w:tcMar>
-              <w:top w:type="dxa" w:w="60"/>
-              <w:left w:type="dxa" w:w="100"/>
-              <w:bottom w:type="dxa" w:w="60"/>
-              <w:right w:type="dxa" w:w="100"/>
-            </w:tcMar>
-          </w:tcPr>
-          <w:p>
-            <w:pPr>
-              <w:keepNext/>
-              <w:keepLines/>
-              <w:spacing w:line="276"/>
-              <w:jc w:val="left"/>
-            </w:pPr>
-            <w:r>
-              <w:rPr>
-                <w:sz w:val="20"/>
-                <w:szCs w:val="20"/>
+            <w:tcW w:type="dxa" w:w="1905"/>
+            <w:tcBorders>
+              <w:top w:val="single" w:color="808080" w:sz="4"/>
+              <w:left w:val="single" w:color="808080" w:sz="4"/>
+              <w:bottom w:val="single" w:color="808080" w:sz="4"/>
+              <w:right w:val="single" w:color="808080" w:sz="4"/>
+            </w:tcBorders>
+            <w:tcMar>
+              <w:top w:type="dxa" w:w="60"/>
+              <w:left w:type="dxa" w:w="100"/>
+              <w:bottom w:type="dxa" w:w="60"/>
+              <w:right w:type="dxa" w:w="100"/>
+            </w:tcMar>
+          </w:tcPr>
+          <w:p>
+            <w:pPr>
+              <w:keepNext/>
+              <w:keepLines/>
+              <w:spacing w:line="276"/>
+              <w:jc w:val="left"/>
+            </w:pPr>
+            <w:r>
+              <w:rPr>
+                <w:sz w:val="19"/>
+                <w:szCs w:val="19"/>
               </w:rPr>
               <w:t xml:space="preserve">Pembanding: Baseline</w:t>
             </w:r>
@@ -7087,33 +7585,65 @@
         </w:tc>
         <w:tc>
           <w:tcPr>
-            <w:tcW w:type="dxa" w:w="5398"/>
-            <w:tcBorders>
-              <w:top w:val="single" w:color="808080" w:sz="4"/>
-              <w:left w:val="single" w:color="808080" w:sz="4"/>
-              <w:bottom w:val="single" w:color="808080" w:sz="4"/>
-              <w:right w:val="single" w:color="808080" w:sz="4"/>
-            </w:tcBorders>
-            <w:tcMar>
-              <w:top w:type="dxa" w:w="60"/>
-              <w:left w:type="dxa" w:w="100"/>
-              <w:bottom w:type="dxa" w:w="60"/>
-              <w:right w:type="dxa" w:w="100"/>
-            </w:tcMar>
-          </w:tcPr>
-          <w:p>
-            <w:pPr>
-              <w:keepNext/>
-              <w:keepLines/>
-              <w:spacing w:line="276"/>
-              <w:jc w:val="left"/>
-            </w:pPr>
-            <w:r>
-              <w:rPr>
-                <w:sz w:val="20"/>
-                <w:szCs w:val="20"/>
+            <w:tcW w:type="dxa" w:w="3016"/>
+            <w:tcBorders>
+              <w:top w:val="single" w:color="808080" w:sz="4"/>
+              <w:left w:val="single" w:color="808080" w:sz="4"/>
+              <w:bottom w:val="single" w:color="808080" w:sz="4"/>
+              <w:right w:val="single" w:color="808080" w:sz="4"/>
+            </w:tcBorders>
+            <w:tcMar>
+              <w:top w:type="dxa" w:w="60"/>
+              <w:left w:type="dxa" w:w="100"/>
+              <w:bottom w:type="dxa" w:w="60"/>
+              <w:right w:type="dxa" w:w="100"/>
+            </w:tcMar>
+          </w:tcPr>
+          <w:p>
+            <w:pPr>
+              <w:keepNext/>
+              <w:keepLines/>
+              <w:spacing w:line="276"/>
+              <w:jc w:val="left"/>
+            </w:pPr>
+            <w:r>
+              <w:rPr>
+                <w:sz w:val="19"/>
+                <w:szCs w:val="19"/>
               </w:rPr>
               <w:t xml:space="preserve">selalu menebak "tidak dapat S-Rank" (DummyClassifier)</w:t>
+            </w:r>
+          </w:p>
+        </w:tc>
+        <w:tc>
+          <w:tcPr>
+            <w:tcW w:type="dxa" w:w="3017"/>
+            <w:tcBorders>
+              <w:top w:val="single" w:color="808080" w:sz="4"/>
+              <w:left w:val="single" w:color="808080" w:sz="4"/>
+              <w:bottom w:val="single" w:color="808080" w:sz="4"/>
+              <w:right w:val="single" w:color="808080" w:sz="4"/>
+            </w:tcBorders>
+            <w:tcMar>
+              <w:top w:type="dxa" w:w="60"/>
+              <w:left w:type="dxa" w:w="100"/>
+              <w:bottom w:type="dxa" w:w="60"/>
+              <w:right w:type="dxa" w:w="100"/>
+            </w:tcMar>
+          </w:tcPr>
+          <w:p>
+            <w:pPr>
+              <w:keepNext/>
+              <w:keepLines/>
+              <w:spacing w:line="276"/>
+              <w:jc w:val="left"/>
+            </w:pPr>
+            <w:r>
+              <w:rPr>
+                <w:sz w:val="19"/>
+                <w:szCs w:val="19"/>
+              </w:rPr>
+              <w:t xml:space="preserve">–</w:t>
             </w:r>
           </w:p>
         </w:tc>
@@ -7124,7 +7654,7 @@
         </w:trPr>
         <w:tc>
           <w:tcPr>
-            <w:tcW w:type="dxa" w:w="2540"/>
+            <w:tcW w:type="dxa" w:w="1905"/>
             <w:tcBorders>
               <w:top w:val="single" w:color="808080" w:sz="4"/>
               <w:left w:val="single" w:color="808080" w:sz="4"/>
@@ -7147,8 +7677,8 @@
             </w:pPr>
             <w:r>
               <w:rPr>
-                <w:sz w:val="20"/>
-                <w:szCs w:val="20"/>
+                <w:sz w:val="19"/>
+                <w:szCs w:val="19"/>
               </w:rPr>
               <w:t xml:space="preserve">Pembanding: Markov Chain</w:t>
             </w:r>
@@ -7156,7 +7686,7 @@
         </w:tc>
         <w:tc>
           <w:tcPr>
-            <w:tcW w:type="dxa" w:w="5398"/>
+            <w:tcW w:type="dxa" w:w="3016"/>
             <w:tcBorders>
               <w:top w:val="single" w:color="808080" w:sz="4"/>
               <w:left w:val="single" w:color="808080" w:sz="4"/>
@@ -7179,10 +7709,42 @@
             </w:pPr>
             <w:r>
               <w:rPr>
-                <w:sz w:val="20"/>
-                <w:szCs w:val="20"/>
+                <w:sz w:val="19"/>
+                <w:szCs w:val="19"/>
               </w:rPr>
               <w:t xml:space="preserve">peluang teoretis dari model hazard (Subbab 2.4); pada data simulasi menjadi batas atas akurasi karena data dibangkitkan dari model yang sama</w:t>
+            </w:r>
+          </w:p>
+        </w:tc>
+        <w:tc>
+          <w:tcPr>
+            <w:tcW w:type="dxa" w:w="3017"/>
+            <w:tcBorders>
+              <w:top w:val="single" w:color="808080" w:sz="4"/>
+              <w:left w:val="single" w:color="808080" w:sz="4"/>
+              <w:bottom w:val="single" w:color="808080" w:sz="4"/>
+              <w:right w:val="single" w:color="808080" w:sz="4"/>
+            </w:tcBorders>
+            <w:tcMar>
+              <w:top w:type="dxa" w:w="60"/>
+              <w:left w:type="dxa" w:w="100"/>
+              <w:bottom w:type="dxa" w:w="60"/>
+              <w:right w:type="dxa" w:w="100"/>
+            </w:tcMar>
+          </w:tcPr>
+          <w:p>
+            <w:pPr>
+              <w:keepNext w:val="false"/>
+              <w:keepLines/>
+              <w:spacing w:line="276"/>
+              <w:jc w:val="left"/>
+            </w:pPr>
+            <w:r>
+              <w:rPr>
+                <w:sz w:val="19"/>
+                <w:szCs w:val="19"/>
+              </w:rPr>
+              <w:t xml:space="preserve">–</w:t>
             </w:r>
           </w:p>
         </w:tc>
@@ -7238,10 +7800,10 @@
           <w:b/>
           <w:bCs/>
         </w:rPr>
-        <w:t xml:space="preserve">GroupKFold 5-fold cross-validation</w:t>
-      </w:r>
-      <w:r>
-        <w:t xml:space="preserve"> dipakai untuk membandingkan model secara stabil (rata-rata ± simpangan baku).</w:t>
+        <w:t xml:space="preserve">Grid search</w:t>
+      </w:r>
+      <w:r>
+        <w:t xml:space="preserve"> pada data simulasi: hyperparameter akan dipilih memakai 100 akun simulasi tambahan (seed 43) yang tidak dipakai untuk evaluasi, dengan GroupKFold 4-fold per akun dan metrik accuracy. Pengaturan terpilih lalu dipakai untuk semua evaluasi simulasi dan model di aplikasi.</w:t>
       </w:r>
     </w:p>
     <w:p>
@@ -7259,10 +7821,10 @@
           <w:b/>
           <w:bCs/>
         </w:rPr>
-        <w:t xml:space="preserve">GroupShuffleSplit 80/20</w:t>
-      </w:r>
-      <w:r>
-        <w:t xml:space="preserve"> dipakai untuk model akhir yang disimpan ke aplikasi.</w:t>
+        <w:t xml:space="preserve">GroupKFold 5-fold cross-validation</w:t>
+      </w:r>
+      <w:r>
+        <w:t xml:space="preserve"> dipakai untuk membandingkan model secara stabil (rata-rata ± simpangan baku).</w:t>
       </w:r>
     </w:p>
     <w:p>
@@ -7276,17 +7838,14 @@
         <w:jc w:val="both"/>
       </w:pPr>
       <w:r>
-        <w:t xml:space="preserve">Model akhir diuji ulang pada </w:t>
-      </w:r>
-      <w:r>
         <w:rPr>
           <w:b/>
           <w:bCs/>
         </w:rPr>
-        <w:t xml:space="preserve">data asli 2 akun</w:t>
-      </w:r>
-      <w:r>
-        <w:t xml:space="preserve"> yang tidak pernah dipakai saat pelatihan.</w:t>
+        <w:t xml:space="preserve">Uji signifikansi:</w:t>
+      </w:r>
+      <w:r>
+        <w:t xml:space="preserve"> akurasi setiap algoritma pada kelima fold dibandingkan dengan algoritma berakurasi tertinggi memakai uji t berpasangan terkoreksi (Subbab 2.7, α = 0,05).</w:t>
       </w:r>
     </w:p>
     <w:p>
@@ -7304,20 +7863,75 @@
           <w:b/>
           <w:bCs/>
         </w:rPr>
-        <w:t xml:space="preserve">Eksperimen kedua:</w:t>
-      </w:r>
-      <w:r>
-        <w:t xml:space="preserve"> keenam algoritma dilatih dan diuji hanya dengan data asli (±1.200 baris) memakai GroupKFold 5-fold yang dibagi per </w:t>
+        <w:t xml:space="preserve">GroupShuffleSplit 80/20</w:t>
+      </w:r>
+      <w:r>
+        <w:t xml:space="preserve"> dipakai untuk model akhir yang disimpan ke aplikasi.</w:t>
+      </w:r>
+    </w:p>
+    <w:p>
+      <w:pPr>
+        <w:pStyle w:val="ListParagraph"/>
+        <w:numPr>
+          <w:ilvl w:val="0"/>
+          <w:numId w:val="3"/>
+        </w:numPr>
+        <w:spacing w:after="60" w:line="360"/>
+        <w:jc w:val="both"/>
+      </w:pPr>
+      <w:r>
+        <w:t xml:space="preserve">Model akhir diuji ulang pada </w:t>
       </w:r>
       <w:r>
         <w:rPr>
           <w:b/>
           <w:bCs/>
         </w:rPr>
+        <w:t xml:space="preserve">data asli 2 akun</w:t>
+      </w:r>
+      <w:r>
+        <w:t xml:space="preserve"> yang tidak pernah dipakai saat pelatihan.</w:t>
+      </w:r>
+    </w:p>
+    <w:p>
+      <w:pPr>
+        <w:pStyle w:val="ListParagraph"/>
+        <w:numPr>
+          <w:ilvl w:val="0"/>
+          <w:numId w:val="3"/>
+        </w:numPr>
+        <w:spacing w:after="60" w:line="360"/>
+        <w:jc w:val="both"/>
+      </w:pPr>
+      <w:r>
+        <w:rPr>
+          <w:b/>
+          <w:bCs/>
+        </w:rPr>
+        <w:t xml:space="preserve">Eksperimen kedua:</w:t>
+      </w:r>
+      <w:r>
+        <w:t xml:space="preserve"> keenam algoritma dilatih dan diuji hanya dengan data asli (±1.200 baris) memakai GroupKFold 5-fold yang dibagi per </w:t>
+      </w:r>
+      <w:r>
+        <w:rPr>
+          <w:b/>
+          <w:bCs/>
+        </w:rPr>
         <w:t xml:space="preserve">siklus pity</w:t>
       </w:r>
       <w:r>
-        <w:t xml:space="preserve"> (20 siklus). Pembagian per siklus dipakai karena data asli hanya berasal dari 2 akun, dan siklus pity saling bebas karena peluang selalu kembali ke awal setelah mendapat S-Rank.</w:t>
+        <w:t xml:space="preserve"> (20 siklus). Pembagian per siklus dipakai karena data asli hanya berasal dari 2 akun, dan siklus pity saling bebas karena peluang selalu kembali ke awal setelah mendapat S-Rank. Hyperparameter pada eksperimen ini dipilih dengan </w:t>
+      </w:r>
+      <w:r>
+        <w:rPr>
+          <w:i/>
+          <w:iCs/>
+        </w:rPr>
+        <w:t xml:space="preserve">nested cross-validation</w:t>
+      </w:r>
+      <w:r>
+        <w:t xml:space="preserve">: grid search dijalankan ulang di dalam data latih setiap fold (GroupKFold 4-fold per siklus), sehingga data uji tidak pernah ikut memilih pengaturan.</w:t>
       </w:r>
     </w:p>
     <w:p>
@@ -7849,7 +8463,7 @@
                 <w:sz w:val="20"/>
                 <w:szCs w:val="20"/>
               </w:rPr>
-              <w:t xml:space="preserve">tabel metrik, cross-validation, kurva peluang, confusion matrix, feature importance</w:t>
+              <w:t xml:space="preserve">tabel metrik, cross-validation, uji signifikansi, hasil grid search, latih–uji data asli, pola soft pity, kurva peluang, confusion matrix, feature importance</w:t>
             </w:r>
           </w:p>
         </w:tc>
@@ -7946,7 +8560,7 @@
         <w:jc w:val="both"/>
       </w:pPr>
       <w:r>
-        <w:t xml:space="preserve">Bahasa pemrograman Python 3.12 dengan pustaka pandas, NumPy, scikit-learn 1.9, XGBoost 3.2, dan Plotly.</w:t>
+        <w:t xml:space="preserve">Bahasa pemrograman Python 3.12 dengan pustaka pandas, NumPy, SciPy, scikit-learn 1.9, XGBoost 3.2, dan Plotly.</w:t>
       </w:r>
     </w:p>
     <w:p>
@@ -7984,7 +8598,7 @@
         <w:jc w:val="both"/>
       </w:pPr>
       <w:r>
-        <w:t xml:space="preserve">Pytest dan GitHub Actions untuk pengujian otomatis (87 kasus uji).</w:t>
+        <w:t xml:space="preserve">Pytest dan GitHub Actions untuk pengujian otomatis (99 kasus uji).</w:t>
       </w:r>
     </w:p>
     <w:p>
@@ -8032,7 +8646,7 @@
         <w:jc w:val="both"/>
       </w:pPr>
       <w:r>
-        <w:t xml:space="preserve">Prototipe aplikasi telah berjalan dan dapat diakses di https://project-data-mining-zzz.streamlit.app. Riwayat dua akun asli berhasil diambil, dan pity serta status guaranteed yang dihitung aplikasi telah dicocokkan dengan tampilan di dalam permainan dan hasilnya sama. Pada uji awal tugas B, model berbasis pohon dan KNN mencapai akurasi ±91% pada data simulasi dan ±93% pada data asli. Eksperimen latih dan uji dengan data asli saja (1.209 baris) juga memberikan hasil serupa, dengan Decision Tree sebagai yang tertinggi (±93,1%). Analisis awal data asli juga memperlihatkan lonjakan laju S-Rank mulai pull ke-74 pada banner Agent (dari di bawah 1% menjadi 14,3%) dan sekitar pull ke-65 pada banner W-Engine, sesuai dengan estimasi soft pity yang dipakai.</w:t>
+        <w:t xml:space="preserve">Prototipe aplikasi telah berjalan dan dapat diakses di https://project-data-mining-zzz.streamlit.app. Riwayat dua akun asli berhasil diambil, dan pity serta status guaranteed yang dihitung aplikasi telah dicocokkan dengan tampilan di dalam permainan dan hasilnya sama. Pada uji awal tugas B, model berbasis pohon dan KNN mencapai akurasi ±91% pada data simulasi dan ±93% pada data asli. Eksperimen latih dan uji dengan data asli saja (1.209 baris) juga memberikan hasil serupa, dengan Decision Tree sebagai yang tertinggi (±93,1%). Uji coba grid search menunjukkan bahwa Naive Bayes dan KNN membaik cukup besar setelah hyperparameter-nya disesuaikan, sedangkan uji signifikansi awal menunjukkan bahwa selisih antaralgoritma pada data asli yang masih sedikit belum bermakna secara statistik. Analisis awal data asli juga memperlihatkan lonjakan laju S-Rank mulai pull ke-74 pada banner Agent (dari di bawah 1% menjadi 14,3%) dan sekitar pull ke-65 pada banner W-Engine, sesuai dengan estimasi soft pity yang dipakai.</w:t>
       </w:r>
     </w:p>
     <w:p>
@@ -10217,17 +10831,17 @@
         <w:jc w:val="both"/>
       </w:pPr>
       <w:r>
-        <w:t xml:space="preserve">Norris, J. R. (1997). </w:t>
+        <w:t xml:space="preserve">Nadeau, C., &amp; Bengio, Y. (2003). Inference for the generalization error. </w:t>
       </w:r>
       <w:r>
         <w:rPr>
           <w:i/>
           <w:iCs/>
         </w:rPr>
-        <w:t xml:space="preserve">Markov chains</w:t>
-      </w:r>
-      <w:r>
-        <w:t xml:space="preserve">. Cambridge University Press.</w:t>
+        <w:t xml:space="preserve">Machine Learning, 52</w:t>
+      </w:r>
+      <w:r>
+        <w:t xml:space="preserve">(3), 239–281.</w:t>
       </w:r>
     </w:p>
     <w:p>
@@ -10237,17 +10851,17 @@
         <w:jc w:val="both"/>
       </w:pPr>
       <w:r>
-        <w:t xml:space="preserve">Pedregosa, F., Varoquaux, G., Gramfort, A., Michel, V., Thirion, B., Grisel, O., … Duchesnay, É. (2011). Scikit-learn: Machine learning in Python. </w:t>
+        <w:t xml:space="preserve">Norris, J. R. (1997). </w:t>
       </w:r>
       <w:r>
         <w:rPr>
           <w:i/>
           <w:iCs/>
         </w:rPr>
-        <w:t xml:space="preserve">Journal of Machine Learning Research, 12</w:t>
-      </w:r>
-      <w:r>
-        <w:t xml:space="preserve">, 2825–2830.</w:t>
+        <w:t xml:space="preserve">Markov chains</w:t>
+      </w:r>
+      <w:r>
+        <w:t xml:space="preserve">. Cambridge University Press.</w:t>
       </w:r>
     </w:p>
     <w:p>
@@ -10257,17 +10871,17 @@
         <w:jc w:val="both"/>
       </w:pPr>
       <w:r>
-        <w:t xml:space="preserve">Quinlan, J. R. (1986). Induction of decision trees. </w:t>
+        <w:t xml:space="preserve">Pedregosa, F., Varoquaux, G., Gramfort, A., Michel, V., Thirion, B., Grisel, O., … Duchesnay, É. (2011). Scikit-learn: Machine learning in Python. </w:t>
       </w:r>
       <w:r>
         <w:rPr>
           <w:i/>
           <w:iCs/>
         </w:rPr>
-        <w:t xml:space="preserve">Machine Learning, 1</w:t>
-      </w:r>
-      <w:r>
-        <w:t xml:space="preserve">(1), 81–106.</w:t>
+        <w:t xml:space="preserve">Journal of Machine Learning Research, 12</w:t>
+      </w:r>
+      <w:r>
+        <w:t xml:space="preserve">, 2825–2830.</w:t>
       </w:r>
     </w:p>
     <w:p>
@@ -10277,17 +10891,17 @@
         <w:jc w:val="both"/>
       </w:pPr>
       <w:r>
-        <w:t xml:space="preserve">Saito, T., &amp; Rehmsmeier, M. (2015). The precision-recall plot is more informative than the ROC plot when evaluating binary classifiers on imbalanced datasets. </w:t>
+        <w:t xml:space="preserve">Quinlan, J. R. (1986). Induction of decision trees. </w:t>
       </w:r>
       <w:r>
         <w:rPr>
           <w:i/>
           <w:iCs/>
         </w:rPr>
-        <w:t xml:space="preserve">PLOS ONE, 10</w:t>
-      </w:r>
-      <w:r>
-        <w:t xml:space="preserve">(3), e0118432.</w:t>
+        <w:t xml:space="preserve">Machine Learning, 1</w:t>
+      </w:r>
+      <w:r>
+        <w:t xml:space="preserve">(1), 81–106.</w:t>
       </w:r>
     </w:p>
     <w:p>
@@ -10297,17 +10911,17 @@
         <w:jc w:val="both"/>
       </w:pPr>
       <w:r>
-        <w:t xml:space="preserve">Streamlit Inc. (2024). </w:t>
+        <w:t xml:space="preserve">Saito, T., &amp; Rehmsmeier, M. (2015). The precision-recall plot is more informative than the ROC plot when evaluating binary classifiers on imbalanced datasets. </w:t>
       </w:r>
       <w:r>
         <w:rPr>
           <w:i/>
           <w:iCs/>
         </w:rPr>
-        <w:t xml:space="preserve">Streamlit documentation</w:t>
-      </w:r>
-      <w:r>
-        <w:t xml:space="preserve">. https://docs.streamlit.io</w:t>
+        <w:t xml:space="preserve">PLOS ONE, 10</w:t>
+      </w:r>
+      <w:r>
+        <w:t xml:space="preserve">(3), e0118432.</w:t>
       </w:r>
     </w:p>
     <w:p>
@@ -10317,17 +10931,57 @@
         <w:jc w:val="both"/>
       </w:pPr>
       <w:r>
-        <w:t xml:space="preserve">UIGF Organization. (2024). </w:t>
+        <w:t xml:space="preserve">Streamlit Inc. (2024). </w:t>
       </w:r>
       <w:r>
         <w:rPr>
           <w:i/>
           <w:iCs/>
         </w:rPr>
+        <w:t xml:space="preserve">Streamlit documentation</w:t>
+      </w:r>
+      <w:r>
+        <w:t xml:space="preserve">. https://docs.streamlit.io</w:t>
+      </w:r>
+    </w:p>
+    <w:p>
+      <w:pPr>
+        <w:spacing w:after="120" w:line="360"/>
+        <w:ind w:left="709" w:hanging="709"/>
+        <w:jc w:val="both"/>
+      </w:pPr>
+      <w:r>
+        <w:t xml:space="preserve">UIGF Organization. (2024). </w:t>
+      </w:r>
+      <w:r>
+        <w:rPr>
+          <w:i/>
+          <w:iCs/>
+        </w:rPr>
         <w:t xml:space="preserve">Uniformed Interchangeable GachaLog Format standard v4</w:t>
       </w:r>
       <w:r>
         <w:t xml:space="preserve">. https://uigf.org</w:t>
+      </w:r>
+    </w:p>
+    <w:p>
+      <w:pPr>
+        <w:spacing w:after="120" w:line="360"/>
+        <w:ind w:left="709" w:hanging="709"/>
+        <w:jc w:val="both"/>
+      </w:pPr>
+      <w:r>
+        <w:t xml:space="preserve">Varma, S., &amp; Simon, R. (2006). Bias in error estimation when using cross-validation for model selection. </w:t>
+      </w:r>
+      <w:r>
+        <w:rPr>
+          <w:i/>
+          <w:iCs/>
+        </w:rPr>
+        <w:t xml:space="preserve">BMC Bioinformatics, 7</w:t>
+      </w:r>
+      <w:r>
+        <w:t xml:space="preserve">, 91.</w:t>
       </w:r>
     </w:p>
     <w:sectPr>

</xml_diff>

<commit_message>
Buat proposal UTS hitam-putih dengan bahasa yang lebih sederhana
Diagram peta jalan dan alur metode digambar ulang hitam-putih dengan huruf
serif, tabel tanpa warna, dan tangkapan layar aplikasi dihapus. Telaah
pustaka, eksperimen, dan pra-pemrosesan ditulis sebagai paragraf biasa,
tanpa huruf tebal di tengah kalimat.
</commit_message>
<xml_diff>
--- a/docs/tugas/UTS_Proposal_Kelompok6_A11.4502.docx
+++ b/docs/tugas/UTS_Proposal_Kelompok6_A11.4502.docx
@@ -113,7 +113,7 @@
           <w:sz w:val="24"/>
           <w:szCs w:val="24"/>
         </w:rPr>
-        <w:t xml:space="preserve">Kelompok 6 – Kelas A11.4502</w:t>
+        <w:t xml:space="preserve">Kelompok 6, Kelas A11.4502</w:t>
       </w:r>
     </w:p>
     <w:p>
@@ -574,7 +574,7 @@
         <w:jc w:val="both"/>
       </w:pPr>
       <w:r>
-        <w:t xml:space="preserve">Zenless Zone Zero adalah permainan </w:t>
+        <w:t xml:space="preserve">Zenless Zone Zero merupakan game </w:t>
       </w:r>
       <w:r>
         <w:rPr>
@@ -584,7 +584,7 @@
         <w:t xml:space="preserve">free-to-play</w:t>
       </w:r>
       <w:r>
-        <w:t xml:space="preserve"> dari HoYoverse yang memakai mekanisme </w:t>
+        <w:t xml:space="preserve"> buatan HoYoverse yang menggunakan sistem </w:t>
       </w:r>
       <w:r>
         <w:rPr>
@@ -594,7 +594,7 @@
         <w:t xml:space="preserve">gacha</w:t>
       </w:r>
       <w:r>
-        <w:t xml:space="preserve">, yaitu undian berhadiah acak. Hadiah paling langka, item S-Rank, hanya memiliki peluang dasar 0,6% untuk karakter (</w:t>
+        <w:t xml:space="preserve">, yaitu undian berhadiah secara acak. Item paling langka dalam game ini adalah item S-Rank dengan peluang dasar hanya 0,6% untuk karakter (</w:t>
       </w:r>
       <w:r>
         <w:rPr>
@@ -614,7 +614,7 @@
         <w:t xml:space="preserve">W-Engine</w:t>
       </w:r>
       <w:r>
-        <w:t xml:space="preserve">). Peluang tersebut naik setelah sejumlah pull tertentu (</w:t>
+        <w:t xml:space="preserve">). Peluang tersebut akan naik setelah pemain melakukan sejumlah pull tertentu (</w:t>
       </w:r>
       <w:r>
         <w:rPr>
@@ -624,7 +624,7 @@
         <w:t xml:space="preserve">soft pity</w:t>
       </w:r>
       <w:r>
-        <w:t xml:space="preserve">), dan S-Rank pasti didapat pada pull ke-90 atau ke-80 (</w:t>
+        <w:t xml:space="preserve">), dan S-Rank pasti didapatkan pada pull ke-90 atau ke-80 (</w:t>
       </w:r>
       <w:r>
         <w:rPr>
@@ -634,7 +634,7 @@
         <w:t xml:space="preserve">hard pity</w:t>
       </w:r>
       <w:r>
-        <w:t xml:space="preserve">). Pengembang tidak mengumumkan kapan </w:t>
+        <w:t xml:space="preserve">). Namun, pengembang tidak menjelaskan kapan </w:t>
       </w:r>
       <w:r>
         <w:rPr>
@@ -644,7 +644,7 @@
         <w:t xml:space="preserve">soft pity</w:t>
       </w:r>
       <w:r>
-        <w:t xml:space="preserve"> dimulai dan seberapa cepat peluangnya naik, sehingga pemain sulit memperkirakan peluangnya sendiri. Padahal, riwayat gacha setiap pemain tersimpan di server dan dapat diambil sebagai data.</w:t>
+        <w:t xml:space="preserve"> mulai berlaku dan seberapa besar kenaikannya, sehingga pemain kesulitan memperkirakan peluangnya sendiri.</w:t>
       </w:r>
     </w:p>
     <w:p>
@@ -654,7 +654,7 @@
         <w:jc w:val="both"/>
       </w:pPr>
       <w:r>
-        <w:t xml:space="preserve">Penelitian ini bertujuan membandingkan enam algoritma klasifikasi, yaitu Naive Bayes, K-Nearest Neighbor, Logistic Regression, Decision Tree, Random Forest, dan XGBoost, untuk memprediksi keluarnya S-Rank berdasarkan pity, status </w:t>
+        <w:t xml:space="preserve">Tujuan dari penelitian ini adalah membandingkan enam algoritma klasifikasi, yaitu Naive Bayes, K-Nearest Neighbor, Logistic Regression, Decision Tree, Random Forest, dan XGBoost dalam memprediksi keluarnya S-Rank berdasarkan nilai pity, status </w:t>
       </w:r>
       <w:r>
         <w:rPr>
@@ -664,27 +664,7 @@
         <w:t xml:space="preserve">guaranteed</w:t>
       </w:r>
       <w:r>
-        <w:t xml:space="preserve">, dan jenis banner. Model Markov Chain yang disusun dari parameter resmi dipakai sebagai acuan teori. Penelitian mengikuti tahapan CRISP-DM dengan data simulasi Monte Carlo 400 akun dan riwayat gacha asli 3 akun (1.751 pull, 28 S-Rank). Hyperparameter dipilih dengan </w:t>
-      </w:r>
-      <w:r>
-        <w:rPr>
-          <w:i/>
-          <w:iCs/>
-        </w:rPr>
-        <w:t xml:space="preserve">grid search</w:t>
-      </w:r>
-      <w:r>
-        <w:t xml:space="preserve">, model dievaluasi dengan </w:t>
-      </w:r>
-      <w:r>
-        <w:rPr>
-          <w:i/>
-          <w:iCs/>
-        </w:rPr>
-        <w:t xml:space="preserve">cross-validation</w:t>
-      </w:r>
-      <w:r>
-        <w:t xml:space="preserve"> yang dibagi per akun, dan selisih akurasi antaralgoritma diuji dengan uji t berpasangan terkoreksi. Karena S-Rank hanya sekitar 1,7% dari seluruh pull, evaluasi tidak hanya memakai Accuracy, tetapi juga Balanced Accuracy, F1-score, ROC-AUC, dan Log Loss.</w:t>
+        <w:t xml:space="preserve">, dan jenis banner. Sebagai pembanding digunakan model Markov Chain yang disusun dari aturan resmi game. Metode penelitian mengikuti tahapan CRISP-DM dengan data riwayat gacha asli dari 3 akun (1.751 pull) dan data simulasi dari 400 akun. Karena S-Rank hanya muncul sekitar 1,7% dari seluruh pull, model tidak hanya dinilai dengan akurasi, tetapi juga dengan Balanced Accuracy, F1-score, ROC-AUC, dan Log Loss.</w:t>
       </w:r>
     </w:p>
     <w:p>
@@ -694,7 +674,7 @@
         <w:jc w:val="both"/>
       </w:pPr>
       <w:r>
-        <w:t xml:space="preserve">Luaran yang ditargetkan adalah perbandingan kinerja keenam algoritma beserta uji signifikansinya, temuan pola </w:t>
+        <w:t xml:space="preserve">Luaran yang ditargetkan dari penelitian ini adalah hasil perbandingan keenam algoritma, analisis pola </w:t>
       </w:r>
       <w:r>
         <w:rPr>
@@ -704,7 +684,7 @@
         <w:t xml:space="preserve">soft pity</w:t>
       </w:r>
       <w:r>
-        <w:t xml:space="preserve"> langsung dari data pemain asli, aplikasi web berbasis Streamlit yang dapat diakses dari ponsel maupun komputer, serta laporan akhir. Prototipe aplikasi sudah dapat diakses di https://project-data-mining-zzz.streamlit.app. Hasil penelitian diharapkan membantu pemain merencanakan penggunaan mata uang permainan dan menjadi contoh penerapan penambangan data untuk menggali aturan yang tidak diumumkan dari data.</w:t>
+        <w:t xml:space="preserve"> dari data pemain asli, prototipe aplikasi web berbasis Streamlit, dan laporan akhir. Hasil penelitian diharapkan dapat membantu pemain dalam merencanakan penggunaan mata uang di dalam game.</w:t>
       </w:r>
     </w:p>
     <w:p>
@@ -760,7 +740,7 @@
         <w:t xml:space="preserve">Gacha</w:t>
       </w:r>
       <w:r>
-        <w:t xml:space="preserve"> adalah mekanisme undian berhadiah di dalam permainan digital. Pemain menukarkan mata uang permainan untuk satu kali undian (</w:t>
+        <w:t xml:space="preserve"> merupakan sistem undian berhadiah yang banyak digunakan pada game digital. Pemain menukarkan mata uang di dalam game untuk melakukan satu kali undian atau </w:t>
       </w:r>
       <w:r>
         <w:rPr>
@@ -770,7 +750,7 @@
         <w:t xml:space="preserve">pull</w:t>
       </w:r>
       <w:r>
-        <w:t xml:space="preserve">) dan memperoleh item secara acak sesuai peluang yang ditetapkan pengembang. Mekanisme ini serupa dengan </w:t>
+        <w:t xml:space="preserve">, lalu mendapatkan item secara acak sesuai peluang yang sudah ditentukan oleh pengembang. Sistem ini mirip dengan </w:t>
       </w:r>
       <w:r>
         <w:rPr>
@@ -780,7 +760,7 @@
         <w:t xml:space="preserve">loot box</w:t>
       </w:r>
       <w:r>
-        <w:t xml:space="preserve"> yang banyak diteliti karena kemiripannya dengan perjudian; survei terhadap 7.422 pemain menemukan bahwa besarnya pengeluaran untuk </w:t>
+        <w:t xml:space="preserve"> yang sering dikaitkan dengan perjudian. Survei terhadap 7.422 pemain menunjukkan bahwa semakin besar pengeluaran untuk </w:t>
       </w:r>
       <w:r>
         <w:rPr>
@@ -790,7 +770,7 @@
         <w:t xml:space="preserve">loot box</w:t>
       </w:r>
       <w:r>
-        <w:t xml:space="preserve"> berkaitan dengan tingkat masalah judi [1]. Karena itu, beberapa negara mewajibkan pengembang mengumumkan peluang hadiah, walaupun kepatuhan dan cara penyajiannya masih beragam [2]. Di Indonesia, permainan gacha HoYoverse juga banyak dimainkan dan sudah diteliti dari sisi perilaku konsumtif pemainnya [3].</w:t>
+        <w:t xml:space="preserve">, semakin tinggi pula tingkat masalah judi pemainnya [1]. Beberapa negara kemudian mewajibkan pengembang untuk mengumumkan peluang hadiah, meskipun penerapannya masih belum seragam [2]. Di Indonesia sendiri, game gacha buatan HoYoverse cukup banyak dimainkan dan sudah pernah diteliti dari sisi perilaku konsumtif pemainnya [3].</w:t>
       </w:r>
     </w:p>
     <w:p>
@@ -800,17 +780,7 @@
         <w:jc w:val="both"/>
       </w:pPr>
       <w:r>
-        <w:t xml:space="preserve">Salah satu permainan gacha tersebut adalah Zenless Zone Zero (ZZZ) yang dirilis HoYoverse pada tahun 2024 [4]. Hadiah paling langka di ZZZ adalah item </w:t>
-      </w:r>
-      <w:r>
-        <w:rPr>
-          <w:b/>
-          <w:bCs/>
-        </w:rPr>
-        <w:t xml:space="preserve">S-Rank</w:t>
-      </w:r>
-      <w:r>
-        <w:t xml:space="preserve">, baik karakter (</w:t>
+        <w:t xml:space="preserve">Salah satu game gacha yang populer adalah Zenless Zone Zero (ZZZ) yang dirilis oleh HoYoverse pada tahun 2024 [4]. Item paling langka dalam ZZZ adalah S-Rank, baik berupa karakter (</w:t>
       </w:r>
       <w:r>
         <w:rPr>
@@ -830,17 +800,7 @@
         <w:t xml:space="preserve">W-Engine</w:t>
       </w:r>
       <w:r>
-        <w:t xml:space="preserve">), dengan peluang dasar 0,6% untuk Agent dan 1,0% untuk W-Engine pada banner terbatas. Permainan ini memakai sistem </w:t>
-      </w:r>
-      <w:r>
-        <w:rPr>
-          <w:b/>
-          <w:bCs/>
-        </w:rPr>
-        <w:t xml:space="preserve">pity</w:t>
-      </w:r>
-      <w:r>
-        <w:t xml:space="preserve">: semakin lama pemain tidak mendapatkan S-Rank, peluangnya meningkat (</w:t>
+        <w:t xml:space="preserve">). Peluang dasar untuk mendapatkan S-Rank pada banner terbatas hanya 0,6% untuk Agent dan 1,0% untuk W-Engine. Game ini menggunakan sistem pity, yaitu semakin lama pemain tidak mendapatkan S-Rank maka peluangnya akan semakin besar (</w:t>
       </w:r>
       <w:r>
         <w:rPr>
@@ -850,7 +810,7 @@
         <w:t xml:space="preserve">soft pity</w:t>
       </w:r>
       <w:r>
-        <w:t xml:space="preserve">) hingga S-Rank pasti didapat pada batas tertentu (</w:t>
+        <w:t xml:space="preserve">), sampai akhirnya S-Rank pasti didapatkan pada pull ke-90 untuk Agent dan pull ke-80 untuk W-Engine (</w:t>
       </w:r>
       <w:r>
         <w:rPr>
@@ -860,7 +820,7 @@
         <w:t xml:space="preserve">hard pity</w:t>
       </w:r>
       <w:r>
-        <w:t xml:space="preserve">, pull ke-90 untuk Agent dan ke-80 untuk W-Engine). Selain itu, aturan 50/50 (Agent) dan 75/25 (W-Engine) menentukan apakah S-Rank yang keluar adalah item yang sedang dipromosikan (</w:t>
+        <w:t xml:space="preserve">). Selain itu, ada aturan 50/50 pada banner Agent dan 75/25 pada banner W-Engine yang menentukan apakah S-Rank yang didapat merupakan item yang sedang dipromosikan (</w:t>
       </w:r>
       <w:r>
         <w:rPr>
@@ -870,7 +830,7 @@
         <w:t xml:space="preserve">rate-up</w:t>
       </w:r>
       <w:r>
-        <w:t xml:space="preserve">). Jika kalah, S-Rank berikutnya pasti </w:t>
+        <w:t xml:space="preserve">). Jika pemain kalah, S-Rank berikutnya dijamin </w:t>
       </w:r>
       <w:r>
         <w:rPr>
@@ -880,7 +840,7 @@
         <w:t xml:space="preserve">rate-up</w:t>
       </w:r>
       <w:r>
-        <w:t xml:space="preserve"> (status </w:t>
+        <w:t xml:space="preserve">, atau disebut status </w:t>
       </w:r>
       <w:r>
         <w:rPr>
@@ -890,7 +850,7 @@
         <w:t xml:space="preserve">guaranteed</w:t>
       </w:r>
       <w:r>
-        <w:t xml:space="preserve">).</w:t>
+        <w:t xml:space="preserve">.</w:t>
       </w:r>
     </w:p>
     <w:p>
@@ -900,7 +860,7 @@
         <w:jc w:val="both"/>
       </w:pPr>
       <w:r>
-        <w:t xml:space="preserve">Detail banner di dalam permainan hanya mengumumkan rate dasar, rate gabungan (1,6% dan 2,0%), hard pity, dan peluang rate-up. Kapan </w:t>
+        <w:t xml:space="preserve">Informasi yang diberikan di dalam game hanya berupa peluang dasar, peluang gabungan (1,6% dan 2,0%), batas hard pity, dan peluang rate-up. Kapan </w:t>
       </w:r>
       <w:r>
         <w:rPr>
@@ -910,17 +870,7 @@
         <w:t xml:space="preserve">soft pity</w:t>
       </w:r>
       <w:r>
-        <w:t xml:space="preserve"> dimulai dan seberapa cepat peluangnya naik </w:t>
-      </w:r>
-      <w:r>
-        <w:rPr>
-          <w:b/>
-          <w:bCs/>
-        </w:rPr>
-        <w:t xml:space="preserve">tidak diumumkan</w:t>
-      </w:r>
-      <w:r>
-        <w:t xml:space="preserve">, sehingga pemain sulit menjawab pertanyaan seperti "jika pity saya sekarang 70, berapa peluang mendapatkan S-Rank dalam 10 pull berikutnya?". Masalah ini cocok diselesaikan dengan penambangan data karena tidak ada atribut yang langsung menentukan hasil (setiap pull tetap acak) dan tidak ada rumus resmi yang lengkap. Bagian aturan yang tidak diumumkan hanya dapat diketahui dari data riwayat gacha pemain, yang tersimpan di server dan dapat diambil oleh pemain sendiri.</w:t>
+        <w:t xml:space="preserve"> mulai berlaku dan seberapa cepat peluangnya naik tidak pernah diumumkan secara resmi. Akibatnya, pemain sulit menjawab pertanyaan sederhana seperti "kalau pity saya sekarang 70, berapa peluang saya mendapatkan S-Rank dalam 10 pull ke depan?". Hasil setiap pull tetap acak dan tidak ada rumus resmi yang lengkap, sehingga pola tersebut hanya bisa dicari dari data riwayat gacha pemain. Data ini tersimpan di server game dan dapat diambil oleh pemain itu sendiri, sehingga dapat diolah menggunakan teknik penambangan data.</w:t>
       </w:r>
     </w:p>
     <w:p>
@@ -930,7 +880,7 @@
         <w:jc w:val="both"/>
       </w:pPr>
       <w:r>
-        <w:t xml:space="preserve">Karena setiap pull memiliki label yang jelas (mendapat S-Rank atau tidak), masalah ini termasuk klasifikasi biner dalam </w:t>
+        <w:t xml:space="preserve">Setiap pull memiliki hasil yang jelas, yaitu mendapatkan S-Rank atau tidak, sehingga permasalahan ini termasuk klasifikasi biner pada </w:t>
       </w:r>
       <w:r>
         <w:rPr>
@@ -940,7 +890,7 @@
         <w:t xml:space="preserve">supervised learning</w:t>
       </w:r>
       <w:r>
-        <w:t xml:space="preserve">, sekaligus estimasi peluang. Pendekatan ini sejalan dengan model </w:t>
+        <w:t xml:space="preserve">. Cara ini juga sesuai dengan model </w:t>
       </w:r>
       <w:r>
         <w:rPr>
@@ -950,7 +900,7 @@
         <w:t xml:space="preserve">hazard</w:t>
       </w:r>
       <w:r>
-        <w:t xml:space="preserve"> waktu diskrit, yaitu peluang terjadinya suatu kejadian pada setiap periode dengan syarat kejadian itu belum terjadi sebelumnya [5]. Tantangannya, data sangat tidak seimbang: kelas "mendapat S-Rank" hanya sekitar 1,7% dari seluruh pull. Pada data seperti ini, akurasi dapat tinggi walaupun model tidak pernah menebak kelas minoritas [6], [7], sehingga diperlukan metrik pendamping.</w:t>
+        <w:t xml:space="preserve"> waktu diskrit, yaitu peluang terjadinya suatu kejadian pada setiap periode dengan syarat kejadian tersebut belum terjadi sebelumnya [5]. Kendala utama dari data gacha adalah datanya sangat tidak seimbang, karena kelas "mendapat S-Rank" hanya sekitar 1,7% dari seluruh pull. Pada data seperti ini, nilai akurasi bisa terlihat tinggi walaupun model tidak pernah menebak kelas minoritas [6], [7], sehingga perlu digunakan metrik evaluasi lain.</w:t>
       </w:r>
     </w:p>
     <w:p>
@@ -960,7 +910,7 @@
         <w:jc w:val="both"/>
       </w:pPr>
       <w:r>
-        <w:t xml:space="preserve">Penambangan data menyediakan banyak algoritma klasifikasi dengan asumsi dan cara belajar yang berbeda. Hasil perbandingan algoritma pada penelitian sebelumnya juga berbeda-beda bergantung pada datanya [8], [9], sehingga kinerjanya perlu dibandingkan langsung pada kasus yang sama. Berdasarkan hal tersebut, penelitian ini membandingkan enam algoritma klasifikasi untuk memprediksi keluarnya S-Rank pada Zenless Zone Zero, dengan model Markov Chain sebagai acuan teori, lalu menerapkan hasilnya dalam aplikasi berbasis web.</w:t>
+        <w:t xml:space="preserve">Algoritma klasifikasi yang tersedia cukup banyak dan masing-masing memiliki cara kerja yang berbeda. Hasil perbandingan algoritma pada penelitian sebelumnya juga berbeda-beda tergantung data yang digunakan [8], [9]. Oleh karena itu, penelitian ini membandingkan enam algoritma klasifikasi untuk memprediksi keluarnya S-Rank pada Zenless Zone Zero, dengan model Markov Chain sebagai acuan teori. Hasil penelitian kemudian diterapkan dalam bentuk aplikasi berbasis web agar dapat digunakan oleh pemain.</w:t>
       </w:r>
     </w:p>
     <w:p>
@@ -1028,7 +978,7 @@
         <w:t xml:space="preserve">soft pity</w:t>
       </w:r>
       <w:r>
-        <w:t xml:space="preserve">) yang tidak diumumkan resmi dapat ditemukan dari data riwayat gacha pemain?</w:t>
+        <w:t xml:space="preserve">) yang tidak diumumkan secara resmi dapat ditemukan dari data riwayat gacha pemain?</w:t>
       </w:r>
     </w:p>
     <w:p>
@@ -1042,7 +992,7 @@
         <w:jc w:val="both"/>
       </w:pPr>
       <w:r>
-        <w:t xml:space="preserve">Algoritma klasifikasi manakah di antara Naive Bayes, KNN, Logistic Regression, Decision Tree, Random Forest, dan XGBoost yang paling akurat memprediksi keluarnya S-Rank?</w:t>
+        <w:t xml:space="preserve">Algoritma klasifikasi manakah di antara Naive Bayes, KNN, Logistic Regression, Decision Tree, Random Forest, dan XGBoost yang paling akurat dalam memprediksi keluarnya S-Rank?</w:t>
       </w:r>
     </w:p>
     <w:p>
@@ -1056,7 +1006,7 @@
         <w:jc w:val="both"/>
       </w:pPr>
       <w:r>
-        <w:t xml:space="preserve">Bagaimana mengevaluasi model secara tepat pada data yang sangat tidak seimbang?</w:t>
+        <w:t xml:space="preserve">Bagaimana cara mengevaluasi model dengan tepat pada data yang sangat tidak seimbang?</w:t>
       </w:r>
     </w:p>
     <w:p>
@@ -1070,7 +1020,7 @@
         <w:jc w:val="both"/>
       </w:pPr>
       <w:r>
-        <w:t xml:space="preserve">Bagaimana menyajikan hasil tersebut dalam aplikasi web yang mudah diakses pengguna ponsel maupun komputer?</w:t>
+        <w:t xml:space="preserve">Bagaimana menyajikan hasil penelitian dalam aplikasi web yang mudah diakses melalui HP maupun komputer?</w:t>
       </w:r>
     </w:p>
     <w:p>
@@ -1090,7 +1040,7 @@
         <w:jc w:val="both"/>
       </w:pPr>
       <w:r>
-        <w:t xml:space="preserve">Penelitian ini mengikuti kerangka CRISP-DM yang terdiri atas </w:t>
+        <w:t xml:space="preserve">Penelitian ini menggunakan tahapan CRISP-DM yang terdiri dari </w:t>
       </w:r>
       <w:r>
         <w:rPr>
@@ -1150,37 +1100,7 @@
         <w:t xml:space="preserve">deployment</w:t>
       </w:r>
       <w:r>
-        <w:t xml:space="preserve"> [10]. Masalah dirumuskan sebagai dua tugas klasifikasi biner. </w:t>
-      </w:r>
-      <w:r>
-        <w:rPr>
-          <w:b/>
-          <w:bCs/>
-        </w:rPr>
-        <w:t xml:space="preserve">Tugas A</w:t>
-      </w:r>
-      <w:r>
-        <w:t xml:space="preserve"> memprediksi apakah pull berikutnya menghasilkan S-Rank (kelas positif ±1,7%), sedangkan </w:t>
-      </w:r>
-      <w:r>
-        <w:rPr>
-          <w:b/>
-          <w:bCs/>
-        </w:rPr>
-        <w:t xml:space="preserve">tugas B</w:t>
-      </w:r>
-      <w:r>
-        <w:t xml:space="preserve"> memprediksi apakah pemain mendapat minimal satu S-Rank dalam 10 pull berikutnya atau satu kali </w:t>
-      </w:r>
-      <w:r>
-        <w:rPr>
-          <w:i/>
-          <w:iCs/>
-        </w:rPr>
-        <w:t xml:space="preserve">ten-pull</w:t>
-      </w:r>
-      <w:r>
-        <w:t xml:space="preserve"> (kelas positif ±16,6%). Tugas B dijadikan tugas utama karena kelasnya lebih seimbang dan lebih dekat dengan keputusan pemain.</w:t>
+        <w:t xml:space="preserve"> [10]. Permasalahan dibagi menjadi dua tugas klasifikasi. Tugas A memprediksi apakah pull berikutnya menghasilkan S-Rank, dengan kelas positif sekitar 1,7%. Tugas B memprediksi apakah pemain mendapatkan minimal satu S-Rank dalam 10 pull berikutnya, dengan kelas positif sekitar 16,6%. Tugas B dijadikan tugas utama karena kelasnya lebih seimbang dan lebih sesuai dengan kebiasaan pemain yang sering melakukan 10 pull sekaligus.</w:t>
       </w:r>
     </w:p>
     <w:p>
@@ -1190,7 +1110,7 @@
         <w:jc w:val="both"/>
       </w:pPr>
       <w:r>
-        <w:t xml:space="preserve">Data diambil dari dua sumber. Riwayat gacha asli diambil dengan tiga cara yang disediakan aplikasi, yaitu skrip PowerShell yang membaca URL riwayat dari </w:t>
+        <w:t xml:space="preserve">Data riwayat gacha asli diambil melalui aplikasi dengan tiga cara, yaitu menggunakan skrip PowerShell yang membaca URL riwayat dari </w:t>
       </w:r>
       <w:r>
         <w:rPr>
@@ -1200,7 +1120,7 @@
         <w:t xml:space="preserve">cache</w:t>
       </w:r>
       <w:r>
-        <w:t xml:space="preserve"> permainan di PC, unggah berkas berformat UIGF [11], dan input manual. Karena riwayat satu akun hanya berisi ratusan pull dengan sedikit S-Rank, data asli dilengkapi dengan simulasi Monte Carlo. Setelah dibersihkan, setiap pull diubah menjadi satu baris berisi fitur pity, rasio pity, status </w:t>
+        <w:t xml:space="preserve"> game di PC, mengunggah file berformat UIGF [11], atau mengisi data secara manual. Riwayat dari satu akun biasanya hanya berisi ratusan pull dengan sedikit S-Rank, sehingga data asli ditambah dengan data simulasi Monte Carlo. Setelah dibersihkan, setiap pull diubah menjadi satu baris data yang berisi nilai pity, rasio pity, status </w:t>
       </w:r>
       <w:r>
         <w:rPr>
@@ -1210,17 +1130,7 @@
         <w:t xml:space="preserve">guaranteed</w:t>
       </w:r>
       <w:r>
-        <w:t xml:space="preserve">, dan jenis banner. Semua fitur sudah diketahui </w:t>
-      </w:r>
-      <w:r>
-        <w:rPr>
-          <w:b/>
-          <w:bCs/>
-        </w:rPr>
-        <w:t xml:space="preserve">sebelum</w:t>
-      </w:r>
-      <w:r>
-        <w:t xml:space="preserve"> pull dilakukan, sehingga tidak ada informasi masa depan yang bocor ke model.</w:t>
+        <w:t xml:space="preserve">, dan jenis banner. Semua fitur tersebut sudah diketahui sebelum pull dilakukan, sehingga tidak ada informasi dari masa depan yang ikut masuk ke model.</w:t>
       </w:r>
     </w:p>
     <w:p>
@@ -1230,7 +1140,7 @@
         <w:jc w:val="both"/>
       </w:pPr>
       <w:r>
-        <w:t xml:space="preserve">Model Markov Chain disusun dari parameter resmi ditambah estimasi </w:t>
+        <w:t xml:space="preserve">Model Markov Chain disusun dari aturan resmi game ditambah perkiraan titik </w:t>
       </w:r>
       <w:r>
         <w:rPr>
@@ -1240,7 +1150,7 @@
         <w:t xml:space="preserve">soft pity</w:t>
       </w:r>
       <w:r>
-        <w:t xml:space="preserve"> dan dipakai sebagai acuan teori. Keenam algoritma klasifikasi tidak diberi tahu tentang </w:t>
+        <w:t xml:space="preserve"> dari komunitas pemain, lalu digunakan sebagai acuan teori. Keenam algoritma klasifikasi tidak diberi informasi mengenai </w:t>
       </w:r>
       <w:r>
         <w:rPr>
@@ -1250,7 +1160,7 @@
         <w:t xml:space="preserve">soft pity</w:t>
       </w:r>
       <w:r>
-        <w:t xml:space="preserve">, sehingga dapat diuji apakah mampu menemukan pola tersebut sendiri dari data. Hyperparameter setiap algoritma dipilih dengan </w:t>
+        <w:t xml:space="preserve">, sehingga dapat dilihat apakah algoritma mampu menemukan pola tersebut sendiri dari data. Hyperparameter setiap algoritma dipilih menggunakan </w:t>
       </w:r>
       <w:r>
         <w:rPr>
@@ -1260,7 +1170,7 @@
         <w:t xml:space="preserve">grid search</w:t>
       </w:r>
       <w:r>
-        <w:t xml:space="preserve"> tanpa memakai data uji, lalu kinerjanya dibandingkan dengan </w:t>
+        <w:t xml:space="preserve">, kemudian kinerjanya dibandingkan menggunakan </w:t>
       </w:r>
       <w:r>
         <w:rPr>
@@ -1270,17 +1180,7 @@
         <w:t xml:space="preserve">cross-validation</w:t>
       </w:r>
       <w:r>
-        <w:t xml:space="preserve"> yang dibagi per akun dan diuji signifikansinya. Model juga diuji pada data pemain asli, dan laju S-Rank per rentang pity pada data asli dibandingkan dengan model Markov untuk memeriksa pola </w:t>
-      </w:r>
-      <w:r>
-        <w:rPr>
-          <w:i/>
-          <w:iCs/>
-        </w:rPr>
-        <w:t xml:space="preserve">soft pity</w:t>
-      </w:r>
-      <w:r>
-        <w:t xml:space="preserve">.</w:t>
+        <w:t xml:space="preserve"> dan diuji signifikansinya. Model juga diuji menggunakan data pemain asli untuk melihat apakah hasilnya tetap baik di luar data simulasi.</w:t>
       </w:r>
     </w:p>
     <w:p>
@@ -1290,7 +1190,7 @@
         <w:jc w:val="both"/>
       </w:pPr>
       <w:r>
-        <w:t xml:space="preserve">Penelitian dibatasi pada banner Agent terbatas (</w:t>
+        <w:t xml:space="preserve">Ruang lingkup penelitian dibatasi pada banner Agent terbatas (</w:t>
       </w:r>
       <w:r>
         <w:rPr>
@@ -1310,7 +1210,7 @@
         <w:t xml:space="preserve">W-Engine Channel</w:t>
       </w:r>
       <w:r>
-        <w:t xml:space="preserve">), dan yang diprediksi hanya keluarnya item S-Rank. Data asli berasal dari akun anggota kelompok dan teman yang bersedia, dan disimpan dalam bentuk anonim tanpa UID, nama item, maupun waktu. Hasil akhirnya diterapkan dalam aplikasi web Streamlit [12] yang dapat dibuka dari ponsel maupun komputer; pengambilan riwayat otomatis hanya tersedia untuk permainan versi PC (Windows).</w:t>
+        <w:t xml:space="preserve">), dan yang diprediksi hanya item S-Rank. Data asli berasal dari akun anggota kelompok dan teman yang bersedia, dan disimpan tanpa UID, nama item, maupun waktu. Hasil akhirnya diterapkan dalam aplikasi web menggunakan Streamlit [12] yang dapat dibuka melalui HP maupun komputer, sedangkan fitur pengambilan riwayat otomatis hanya tersedia untuk game versi PC (Windows).</w:t>
       </w:r>
     </w:p>
     <w:p>
@@ -1330,7 +1230,7 @@
         <w:jc w:val="both"/>
       </w:pPr>
       <w:r>
-        <w:t xml:space="preserve">Penelitian tentang gacha dan </w:t>
+        <w:t xml:space="preserve">Penelitian mengenai gacha dan </w:t>
       </w:r>
       <w:r>
         <w:rPr>
@@ -1340,7 +1240,7 @@
         <w:t xml:space="preserve">loot box</w:t>
       </w:r>
       <w:r>
-        <w:t xml:space="preserve"> sejauh ini banyak membahas sisi perilaku dan regulasi [1], [2], [3], sedangkan penelitian yang memodelkan gacha secara matematis berangkat dari sudut pandang desain dan pendapatan pengembang [13]. Di sisi lain, penelitian perbandingan algoritma klasifikasi di Indonesia umumnya memakai dataset publik, seperti data pemasaran bank atau kepuasan penumpang pesawat [8], [9]. Penelitian ini memakai data riwayat gacha pemain untuk memperkirakan aturan yang tidak diumumkan pengembang, dari sudut pandang pemain.</w:t>
+        <w:t xml:space="preserve"> sejauh ini lebih banyak membahas perilaku pemain dan regulasi [1], [2], [3]. Penelitian yang membahas gacha secara matematis pun lebih banyak melihat dari sisi desain dan pendapatan pengembang [13]. Sementara itu, penelitian perbandingan algoritma klasifikasi di Indonesia umumnya menggunakan dataset publik seperti data pemasaran bank atau data kepuasan penumpang pesawat [8], [9]. Pada penelitian ini, data yang digunakan adalah riwayat gacha pemain, dengan tujuan memperkirakan aturan yang tidak diumumkan oleh pengembang.</w:t>
       </w:r>
     </w:p>
     <w:p>
@@ -1350,7 +1250,7 @@
         <w:jc w:val="both"/>
       </w:pPr>
       <w:r>
-        <w:t xml:space="preserve">Kebaruan lainnya terletak pada cara evaluasi. Pull yang berurutan dari akun yang sama saling berkaitan, sehingga data dibagi per akun atau per siklus pity, bukan per baris. Hyperparameter dipilih tanpa menyentuh data uji, dan selisih akurasi antaralgoritma diuji dengan uji t terkoreksi yang memperhitungkan tumpang tindih data latih antarfold [14]. Setiap algoritma juga dibandingkan dengan acuan teori Markov Chain, sehingga terlihat seberapa dekat kinerjanya dengan batas yang dapat dicapai. Secara ringkas, kebaruan penelitian ini adalah:</w:t>
+        <w:t xml:space="preserve">Selain dari sisi data, penelitian ini juga memperhatikan cara evaluasi. Pull yang berurutan dari akun yang sama saling berkaitan, sehingga data dibagi berdasarkan akun atau siklus pity, bukan per baris. Hyperparameter dipilih tanpa menggunakan data uji, dan perbedaan akurasi antaralgoritma diuji menggunakan uji t terkoreksi [14]. Kebaruan dari penelitian ini dapat dirangkum sebagai berikut.</w:t>
       </w:r>
     </w:p>
     <w:p>
@@ -1374,7 +1274,7 @@
         <w:t xml:space="preserve">soft pity</w:t>
       </w:r>
       <w:r>
-        <w:t xml:space="preserve"> yang tidak diumumkan resmi langsung dari data riwayat gacha pemain asli.</w:t>
+        <w:t xml:space="preserve"> yang tidak diumumkan secara resmi langsung dari data riwayat gacha pemain.</w:t>
       </w:r>
     </w:p>
     <w:p>
@@ -1388,7 +1288,7 @@
         <w:jc w:val="both"/>
       </w:pPr>
       <w:r>
-        <w:t xml:space="preserve">Membandingkan enam algoritma klasifikasi terhadap acuan teori Markov Chain, bukan hanya terhadap sesama algoritma.</w:t>
+        <w:t xml:space="preserve">Membandingkan enam algoritma klasifikasi dengan acuan teori Markov Chain.</w:t>
       </w:r>
     </w:p>
     <w:p>
@@ -1402,17 +1302,7 @@
         <w:jc w:val="both"/>
       </w:pPr>
       <w:r>
-        <w:t xml:space="preserve">Menerapkan evaluasi yang sesuai untuk data berurutan dan tidak seimbang: pembagian per akun atau siklus pity, </w:t>
-      </w:r>
-      <w:r>
-        <w:rPr>
-          <w:i/>
-          <w:iCs/>
-        </w:rPr>
-        <w:t xml:space="preserve">nested cross-validation</w:t>
-      </w:r>
-      <w:r>
-        <w:t xml:space="preserve">, uji t terkoreksi, dan metrik pendamping selain akurasi.</w:t>
+        <w:t xml:space="preserve">Menggunakan cara evaluasi yang sesuai untuk data yang berurutan dan tidak seimbang.</w:t>
       </w:r>
     </w:p>
     <w:p>
@@ -1426,7 +1316,7 @@
         <w:jc w:val="both"/>
       </w:pPr>
       <w:r>
-        <w:t xml:space="preserve">Menerapkan hasilnya dalam aplikasi web yang dapat mengambil riwayat gacha pemain sendiri dan langsung menghitung peluangnya.</w:t>
+        <w:t xml:space="preserve">Menerapkan hasil penelitian dalam aplikasi web yang dapat membaca riwayat gacha pemain dan menghitung peluangnya secara langsung.</w:t>
       </w:r>
     </w:p>
     <w:p>
@@ -1446,7 +1336,7 @@
         <w:jc w:val="both"/>
       </w:pPr>
       <w:r>
-        <w:t xml:space="preserve">Peta jalan penelitian ini dibagi menjadi tiga tahap yang disesuaikan dengan periode perkuliahan selama 14 minggu, seperti pada Gambar 1.1. Tahap pertama adalah penelitian rintisan pada minggu 1–3, berupa pembentukan kelompok, pemilihan topik, studi literatur tentang gacha dan algoritma klasifikasi, serta mempelajari aturan banner Zenless Zone Zero. Tahap kedua adalah penelitian fundamental pada minggu 4–7, berupa pengambilan riwayat gacha pemain asli, pembuatan data simulasi, pra-pemrosesan, pembentukan fitur, dan penyusunan proposal. Tahap ketiga adalah penelitian terapan pada minggu 8–14, berupa </w:t>
+        <w:t xml:space="preserve">Peta jalan penelitian dibagi menjadi tiga tahap yang disesuaikan dengan masa perkuliahan selama 14 minggu, seperti yang terlihat pada Gambar 1.1. Tahap pertama adalah penelitian rintisan pada minggu 1-3, yang berisi pembentukan kelompok, pemilihan topik, studi literatur, dan mempelajari aturan banner Zenless Zone Zero. Tahap kedua adalah penelitian fundamental pada minggu 4-7, yang berisi pengambilan data riwayat gacha, pembuatan data simulasi, pra-pemrosesan data, dan penyusunan proposal. Tahap ketiga adalah penelitian terapan pada minggu 8-14, yang berisi </w:t>
       </w:r>
       <w:r>
         <w:rPr>
@@ -1456,7 +1346,7 @@
         <w:t xml:space="preserve">grid search</w:t>
       </w:r>
       <w:r>
-        <w:t xml:space="preserve"> dan pelatihan enam algoritma, evaluasi dan uji signifikansi, analisis pola </w:t>
+        <w:t xml:space="preserve">, pelatihan model, evaluasi, analisis pola </w:t>
       </w:r>
       <w:r>
         <w:rPr>
@@ -1478,9 +1368,9 @@
       <w:r>
         <w:drawing>
           <wp:inline distT="0" distB="0" distL="0" distR="0">
-            <wp:extent cx="4953000" cy="2752725"/>
+            <wp:extent cx="5143500" cy="2228850"/>
             <wp:effectExtent t="0" r="0" b="0" l="0"/>
-            <wp:docPr id="2" name="fig_petajalan.png" descr="Peta jalan penelitian selama 14 minggu" title="Peta jalan penelitian selama 14 minggu"/>
+            <wp:docPr id="2" name="fig_petajalan.png" descr="Peta jalan penelitian" title="Peta jalan penelitian"/>
             <wp:cNvGraphicFramePr>
               <a:graphicFrameLocks xmlns:a="http://schemas.openxmlformats.org/drawingml/2006/main" noChangeAspect="1"/>
             </wp:cNvGraphicFramePr>
@@ -1503,7 +1393,7 @@
                   <pic:spPr bwMode="auto">
                     <a:xfrm>
                       <a:off x="0" y="0"/>
-                      <a:ext cx="4953000" cy="2752725"/>
+                      <a:ext cx="5143500" cy="2228850"/>
                     </a:xfrm>
                     <a:prstGeom prst="rect">
                       <a:avLst/>
@@ -1529,7 +1419,7 @@
         <w:t xml:space="preserve">Gambar 1.1</w:t>
       </w:r>
       <w:r>
-        <w:t xml:space="preserve"> Peta jalan penelitian selama 14 minggu</w:t>
+        <w:t xml:space="preserve"> Peta jalan penelitian</w:t>
       </w:r>
     </w:p>
     <w:p>
@@ -1560,7 +1450,7 @@
         <w:jc w:val="both"/>
       </w:pPr>
       <w:r>
-        <w:t xml:space="preserve">Telaah pustaka dilakukan terhadap penelitian tentang mekanisme gacha dan </w:t>
+        <w:t xml:space="preserve">Telaah pustaka dilakukan dengan menelusuri penelitian yang berkaitan dengan sistem gacha dan </w:t>
       </w:r>
       <w:r>
         <w:rPr>
@@ -1570,1160 +1460,8 @@
         <w:t xml:space="preserve">loot box</w:t>
       </w:r>
       <w:r>
-        <w:t xml:space="preserve">, perbandingan algoritma klasifikasi, serta evaluasi model pada data tidak seimbang. Ringkasan penelitian terdahulu yang paling berkaitan ditunjukkan pada Tabel 2.1.</w:t>
-      </w:r>
-    </w:p>
-    <w:p>
-      <w:pPr>
-        <w:keepNext/>
-        <w:keepLines/>
-        <w:spacing w:after="60" w:before="120"/>
-        <w:jc w:val="center"/>
-      </w:pPr>
-      <w:r>
-        <w:rPr>
-          <w:b/>
-          <w:bCs/>
-        </w:rPr>
-        <w:t xml:space="preserve">Tabel 2.1</w:t>
-      </w:r>
-      <w:r>
-        <w:t xml:space="preserve"> Ringkasan penelitian terdahulu</w:t>
-      </w:r>
-    </w:p>
-    <w:tbl>
-      <w:tblPr>
-        <w:tblW w:type="dxa" w:w="8838"/>
-        <w:tblBorders>
-          <w:top w:val="single" w:color="auto" w:sz="4"/>
-          <w:left w:val="single" w:color="auto" w:sz="4"/>
-          <w:bottom w:val="single" w:color="auto" w:sz="4"/>
-          <w:right w:val="single" w:color="auto" w:sz="4"/>
-          <w:insideH w:val="single" w:color="auto" w:sz="4"/>
-          <w:insideV w:val="single" w:color="auto" w:sz="4"/>
-        </w:tblBorders>
-      </w:tblPr>
-      <w:tblGrid>
-        <w:gridCol w:w="2298"/>
-        <w:gridCol w:w="3005"/>
-        <w:gridCol w:w="3535"/>
-      </w:tblGrid>
-      <w:tr>
-        <w:trPr>
-          <w:cantSplit/>
-          <w:tblHeader/>
-        </w:trPr>
-        <w:tc>
-          <w:tcPr>
-            <w:tcW w:type="dxa" w:w="2298"/>
-            <w:tcBorders>
-              <w:top w:val="single" w:color="808080" w:sz="4"/>
-              <w:left w:val="single" w:color="808080" w:sz="4"/>
-              <w:bottom w:val="single" w:color="808080" w:sz="4"/>
-              <w:right w:val="single" w:color="808080" w:sz="4"/>
-            </w:tcBorders>
-            <w:shd w:fill="D9E2F3" w:color="auto" w:val="clear"/>
-            <w:tcMar>
-              <w:top w:type="dxa" w:w="60"/>
-              <w:left w:type="dxa" w:w="100"/>
-              <w:bottom w:type="dxa" w:w="60"/>
-              <w:right w:type="dxa" w:w="100"/>
-            </w:tcMar>
-          </w:tcPr>
-          <w:p>
-            <w:pPr>
-              <w:keepNext/>
-              <w:keepLines/>
-              <w:spacing w:line="276"/>
-              <w:jc w:val="left"/>
-            </w:pPr>
-            <w:r>
-              <w:rPr>
-                <w:b/>
-                <w:bCs/>
-                <w:sz w:val="19"/>
-                <w:szCs w:val="19"/>
-              </w:rPr>
-              <w:t xml:space="preserve">Peneliti</w:t>
-            </w:r>
-          </w:p>
-        </w:tc>
-        <w:tc>
-          <w:tcPr>
-            <w:tcW w:type="dxa" w:w="3005"/>
-            <w:tcBorders>
-              <w:top w:val="single" w:color="808080" w:sz="4"/>
-              <w:left w:val="single" w:color="808080" w:sz="4"/>
-              <w:bottom w:val="single" w:color="808080" w:sz="4"/>
-              <w:right w:val="single" w:color="808080" w:sz="4"/>
-            </w:tcBorders>
-            <w:shd w:fill="D9E2F3" w:color="auto" w:val="clear"/>
-            <w:tcMar>
-              <w:top w:type="dxa" w:w="60"/>
-              <w:left w:type="dxa" w:w="100"/>
-              <w:bottom w:type="dxa" w:w="60"/>
-              <w:right w:type="dxa" w:w="100"/>
-            </w:tcMar>
-          </w:tcPr>
-          <w:p>
-            <w:pPr>
-              <w:keepNext/>
-              <w:keepLines/>
-              <w:spacing w:line="276"/>
-              <w:jc w:val="left"/>
-            </w:pPr>
-            <w:r>
-              <w:rPr>
-                <w:b/>
-                <w:bCs/>
-                <w:sz w:val="19"/>
-                <w:szCs w:val="19"/>
-              </w:rPr>
-              <w:t xml:space="preserve">Objek dan metode</w:t>
-            </w:r>
-          </w:p>
-        </w:tc>
-        <w:tc>
-          <w:tcPr>
-            <w:tcW w:type="dxa" w:w="3535"/>
-            <w:tcBorders>
-              <w:top w:val="single" w:color="808080" w:sz="4"/>
-              <w:left w:val="single" w:color="808080" w:sz="4"/>
-              <w:bottom w:val="single" w:color="808080" w:sz="4"/>
-              <w:right w:val="single" w:color="808080" w:sz="4"/>
-            </w:tcBorders>
-            <w:shd w:fill="D9E2F3" w:color="auto" w:val="clear"/>
-            <w:tcMar>
-              <w:top w:type="dxa" w:w="60"/>
-              <w:left w:type="dxa" w:w="100"/>
-              <w:bottom w:type="dxa" w:w="60"/>
-              <w:right w:type="dxa" w:w="100"/>
-            </w:tcMar>
-          </w:tcPr>
-          <w:p>
-            <w:pPr>
-              <w:keepNext/>
-              <w:keepLines/>
-              <w:spacing w:line="276"/>
-              <w:jc w:val="left"/>
-            </w:pPr>
-            <w:r>
-              <w:rPr>
-                <w:b/>
-                <w:bCs/>
-                <w:sz w:val="19"/>
-                <w:szCs w:val="19"/>
-              </w:rPr>
-              <w:t xml:space="preserve">Hasil utama</w:t>
-            </w:r>
-          </w:p>
-        </w:tc>
-      </w:tr>
-      <w:tr>
-        <w:trPr>
-          <w:cantSplit/>
-        </w:trPr>
-        <w:tc>
-          <w:tcPr>
-            <w:tcW w:type="dxa" w:w="2298"/>
-            <w:tcBorders>
-              <w:top w:val="single" w:color="808080" w:sz="4"/>
-              <w:left w:val="single" w:color="808080" w:sz="4"/>
-              <w:bottom w:val="single" w:color="808080" w:sz="4"/>
-              <w:right w:val="single" w:color="808080" w:sz="4"/>
-            </w:tcBorders>
-            <w:tcMar>
-              <w:top w:type="dxa" w:w="60"/>
-              <w:left w:type="dxa" w:w="100"/>
-              <w:bottom w:type="dxa" w:w="60"/>
-              <w:right w:type="dxa" w:w="100"/>
-            </w:tcMar>
-          </w:tcPr>
-          <w:p>
-            <w:pPr>
-              <w:keepNext/>
-              <w:keepLines/>
-              <w:spacing w:line="276"/>
-              <w:jc w:val="left"/>
-            </w:pPr>
-            <w:r>
-              <w:rPr>
-                <w:sz w:val="19"/>
-                <w:szCs w:val="19"/>
-              </w:rPr>
-              <w:t xml:space="preserve">Zendle dan Cairns (2018) [1]</w:t>
-            </w:r>
-          </w:p>
-        </w:tc>
-        <w:tc>
-          <w:tcPr>
-            <w:tcW w:type="dxa" w:w="3005"/>
-            <w:tcBorders>
-              <w:top w:val="single" w:color="808080" w:sz="4"/>
-              <w:left w:val="single" w:color="808080" w:sz="4"/>
-              <w:bottom w:val="single" w:color="808080" w:sz="4"/>
-              <w:right w:val="single" w:color="808080" w:sz="4"/>
-            </w:tcBorders>
-            <w:tcMar>
-              <w:top w:type="dxa" w:w="60"/>
-              <w:left w:type="dxa" w:w="100"/>
-              <w:bottom w:type="dxa" w:w="60"/>
-              <w:right w:type="dxa" w:w="100"/>
-            </w:tcMar>
-          </w:tcPr>
-          <w:p>
-            <w:pPr>
-              <w:keepNext/>
-              <w:keepLines/>
-              <w:spacing w:line="276"/>
-              <w:jc w:val="left"/>
-            </w:pPr>
-            <w:r>
-              <w:rPr>
-                <w:sz w:val="19"/>
-                <w:szCs w:val="19"/>
-              </w:rPr>
-              <w:t xml:space="preserve">Survei 7.422 pemain</w:t>
-            </w:r>
-          </w:p>
-        </w:tc>
-        <w:tc>
-          <w:tcPr>
-            <w:tcW w:type="dxa" w:w="3535"/>
-            <w:tcBorders>
-              <w:top w:val="single" w:color="808080" w:sz="4"/>
-              <w:left w:val="single" w:color="808080" w:sz="4"/>
-              <w:bottom w:val="single" w:color="808080" w:sz="4"/>
-              <w:right w:val="single" w:color="808080" w:sz="4"/>
-            </w:tcBorders>
-            <w:tcMar>
-              <w:top w:type="dxa" w:w="60"/>
-              <w:left w:type="dxa" w:w="100"/>
-              <w:bottom w:type="dxa" w:w="60"/>
-              <w:right w:type="dxa" w:w="100"/>
-            </w:tcMar>
-          </w:tcPr>
-          <w:p>
-            <w:pPr>
-              <w:keepNext/>
-              <w:keepLines/>
-              <w:spacing w:line="276"/>
-              <w:jc w:val="left"/>
-            </w:pPr>
-            <w:r>
-              <w:rPr>
-                <w:sz w:val="19"/>
-                <w:szCs w:val="19"/>
-              </w:rPr>
-              <w:t xml:space="preserve">Pengeluaran untuk </w:t>
-            </w:r>
-            <w:r>
-              <w:rPr>
-                <w:i/>
-                <w:iCs/>
-                <w:sz w:val="19"/>
-                <w:szCs w:val="19"/>
-              </w:rPr>
-              <w:t xml:space="preserve">loot box</w:t>
-            </w:r>
-            <w:r>
-              <w:rPr>
-                <w:sz w:val="19"/>
-                <w:szCs w:val="19"/>
-              </w:rPr>
-              <w:t xml:space="preserve"> berkaitan dengan tingkat masalah judi</w:t>
-            </w:r>
-          </w:p>
-        </w:tc>
-      </w:tr>
-      <w:tr>
-        <w:trPr>
-          <w:cantSplit/>
-        </w:trPr>
-        <w:tc>
-          <w:tcPr>
-            <w:tcW w:type="dxa" w:w="2298"/>
-            <w:tcBorders>
-              <w:top w:val="single" w:color="808080" w:sz="4"/>
-              <w:left w:val="single" w:color="808080" w:sz="4"/>
-              <w:bottom w:val="single" w:color="808080" w:sz="4"/>
-              <w:right w:val="single" w:color="808080" w:sz="4"/>
-            </w:tcBorders>
-            <w:tcMar>
-              <w:top w:type="dxa" w:w="60"/>
-              <w:left w:type="dxa" w:w="100"/>
-              <w:bottom w:type="dxa" w:w="60"/>
-              <w:right w:type="dxa" w:w="100"/>
-            </w:tcMar>
-          </w:tcPr>
-          <w:p>
-            <w:pPr>
-              <w:keepNext/>
-              <w:keepLines/>
-              <w:spacing w:line="276"/>
-              <w:jc w:val="left"/>
-            </w:pPr>
-            <w:r>
-              <w:rPr>
-                <w:sz w:val="19"/>
-                <w:szCs w:val="19"/>
-              </w:rPr>
-              <w:t xml:space="preserve">Xiao dkk. (2024) [2]</w:t>
-            </w:r>
-          </w:p>
-        </w:tc>
-        <w:tc>
-          <w:tcPr>
-            <w:tcW w:type="dxa" w:w="3005"/>
-            <w:tcBorders>
-              <w:top w:val="single" w:color="808080" w:sz="4"/>
-              <w:left w:val="single" w:color="808080" w:sz="4"/>
-              <w:bottom w:val="single" w:color="808080" w:sz="4"/>
-              <w:right w:val="single" w:color="808080" w:sz="4"/>
-            </w:tcBorders>
-            <w:tcMar>
-              <w:top w:type="dxa" w:w="60"/>
-              <w:left w:type="dxa" w:w="100"/>
-              <w:bottom w:type="dxa" w:w="60"/>
-              <w:right w:type="dxa" w:w="100"/>
-            </w:tcMar>
-          </w:tcPr>
-          <w:p>
-            <w:pPr>
-              <w:keepNext/>
-              <w:keepLines/>
-              <w:spacing w:line="276"/>
-              <w:jc w:val="left"/>
-            </w:pPr>
-            <w:r>
-              <w:rPr>
-                <w:sz w:val="19"/>
-                <w:szCs w:val="19"/>
-              </w:rPr>
-              <w:t xml:space="preserve">100 game iPhone terlaris di Tiongkok; kepatuhan pengungkapan peluang</w:t>
-            </w:r>
-          </w:p>
-        </w:tc>
-        <w:tc>
-          <w:tcPr>
-            <w:tcW w:type="dxa" w:w="3535"/>
-            <w:tcBorders>
-              <w:top w:val="single" w:color="808080" w:sz="4"/>
-              <w:left w:val="single" w:color="808080" w:sz="4"/>
-              <w:bottom w:val="single" w:color="808080" w:sz="4"/>
-              <w:right w:val="single" w:color="808080" w:sz="4"/>
-            </w:tcBorders>
-            <w:tcMar>
-              <w:top w:type="dxa" w:w="60"/>
-              <w:left w:type="dxa" w:w="100"/>
-              <w:bottom w:type="dxa" w:w="60"/>
-              <w:right w:type="dxa" w:w="100"/>
-            </w:tcMar>
-          </w:tcPr>
-          <w:p>
-            <w:pPr>
-              <w:keepNext/>
-              <w:keepLines/>
-              <w:spacing w:line="276"/>
-              <w:jc w:val="left"/>
-            </w:pPr>
-            <w:r>
-              <w:rPr>
-                <w:i/>
-                <w:iCs/>
-                <w:sz w:val="19"/>
-                <w:szCs w:val="19"/>
-              </w:rPr>
-              <w:t xml:space="preserve">Loot box</w:t>
-            </w:r>
-            <w:r>
-              <w:rPr>
-                <w:sz w:val="19"/>
-                <w:szCs w:val="19"/>
-              </w:rPr>
-              <w:t xml:space="preserve"> ada pada 91 dari 100 game; hanya 5,5% yang menampilkan peluang langsung di halaman pembelian</w:t>
-            </w:r>
-          </w:p>
-        </w:tc>
-      </w:tr>
-      <w:tr>
-        <w:trPr>
-          <w:cantSplit/>
-        </w:trPr>
-        <w:tc>
-          <w:tcPr>
-            <w:tcW w:type="dxa" w:w="2298"/>
-            <w:tcBorders>
-              <w:top w:val="single" w:color="808080" w:sz="4"/>
-              <w:left w:val="single" w:color="808080" w:sz="4"/>
-              <w:bottom w:val="single" w:color="808080" w:sz="4"/>
-              <w:right w:val="single" w:color="808080" w:sz="4"/>
-            </w:tcBorders>
-            <w:tcMar>
-              <w:top w:type="dxa" w:w="60"/>
-              <w:left w:type="dxa" w:w="100"/>
-              <w:bottom w:type="dxa" w:w="60"/>
-              <w:right w:type="dxa" w:w="100"/>
-            </w:tcMar>
-          </w:tcPr>
-          <w:p>
-            <w:pPr>
-              <w:keepNext/>
-              <w:keepLines/>
-              <w:spacing w:line="276"/>
-              <w:jc w:val="left"/>
-            </w:pPr>
-            <w:r>
-              <w:rPr>
-                <w:sz w:val="19"/>
-                <w:szCs w:val="19"/>
-              </w:rPr>
-              <w:t xml:space="preserve">Dahlan dan Noorrizki (2023) [3]</w:t>
-            </w:r>
-          </w:p>
-        </w:tc>
-        <w:tc>
-          <w:tcPr>
-            <w:tcW w:type="dxa" w:w="3005"/>
-            <w:tcBorders>
-              <w:top w:val="single" w:color="808080" w:sz="4"/>
-              <w:left w:val="single" w:color="808080" w:sz="4"/>
-              <w:bottom w:val="single" w:color="808080" w:sz="4"/>
-              <w:right w:val="single" w:color="808080" w:sz="4"/>
-            </w:tcBorders>
-            <w:tcMar>
-              <w:top w:type="dxa" w:w="60"/>
-              <w:left w:type="dxa" w:w="100"/>
-              <w:bottom w:type="dxa" w:w="60"/>
-              <w:right w:type="dxa" w:w="100"/>
-            </w:tcMar>
-          </w:tcPr>
-          <w:p>
-            <w:pPr>
-              <w:keepNext/>
-              <w:keepLines/>
-              <w:spacing w:line="276"/>
-              <w:jc w:val="left"/>
-            </w:pPr>
-            <w:r>
-              <w:rPr>
-                <w:sz w:val="19"/>
-                <w:szCs w:val="19"/>
-              </w:rPr>
-              <w:t xml:space="preserve">Survei 19 pemain Genshin Impact (HoYoverse)</w:t>
-            </w:r>
-          </w:p>
-        </w:tc>
-        <w:tc>
-          <w:tcPr>
-            <w:tcW w:type="dxa" w:w="3535"/>
-            <w:tcBorders>
-              <w:top w:val="single" w:color="808080" w:sz="4"/>
-              <w:left w:val="single" w:color="808080" w:sz="4"/>
-              <w:bottom w:val="single" w:color="808080" w:sz="4"/>
-              <w:right w:val="single" w:color="808080" w:sz="4"/>
-            </w:tcBorders>
-            <w:tcMar>
-              <w:top w:type="dxa" w:w="60"/>
-              <w:left w:type="dxa" w:w="100"/>
-              <w:bottom w:type="dxa" w:w="60"/>
-              <w:right w:type="dxa" w:w="100"/>
-            </w:tcMar>
-          </w:tcPr>
-          <w:p>
-            <w:pPr>
-              <w:keepNext/>
-              <w:keepLines/>
-              <w:spacing w:line="276"/>
-              <w:jc w:val="left"/>
-            </w:pPr>
-            <w:r>
-              <w:rPr>
-                <w:sz w:val="19"/>
-                <w:szCs w:val="19"/>
-              </w:rPr>
-              <w:t xml:space="preserve">Responden cenderung tidak konsumtif, tetapi tetap ada yang membeli </w:t>
-            </w:r>
-            <w:r>
-              <w:rPr>
-                <w:i/>
-                <w:iCs/>
-                <w:sz w:val="19"/>
-                <w:szCs w:val="19"/>
-              </w:rPr>
-              <w:t xml:space="preserve">top-up</w:t>
-            </w:r>
-            <w:r>
-              <w:rPr>
-                <w:sz w:val="19"/>
-                <w:szCs w:val="19"/>
-              </w:rPr>
-              <w:t xml:space="preserve"> untuk karakter atau senjata</w:t>
-            </w:r>
-          </w:p>
-        </w:tc>
-      </w:tr>
-      <w:tr>
-        <w:trPr>
-          <w:cantSplit/>
-        </w:trPr>
-        <w:tc>
-          <w:tcPr>
-            <w:tcW w:type="dxa" w:w="2298"/>
-            <w:tcBorders>
-              <w:top w:val="single" w:color="808080" w:sz="4"/>
-              <w:left w:val="single" w:color="808080" w:sz="4"/>
-              <w:bottom w:val="single" w:color="808080" w:sz="4"/>
-              <w:right w:val="single" w:color="808080" w:sz="4"/>
-            </w:tcBorders>
-            <w:tcMar>
-              <w:top w:type="dxa" w:w="60"/>
-              <w:left w:type="dxa" w:w="100"/>
-              <w:bottom w:type="dxa" w:w="60"/>
-              <w:right w:type="dxa" w:w="100"/>
-            </w:tcMar>
-          </w:tcPr>
-          <w:p>
-            <w:pPr>
-              <w:keepNext/>
-              <w:keepLines/>
-              <w:spacing w:line="276"/>
-              <w:jc w:val="left"/>
-            </w:pPr>
-            <w:r>
-              <w:rPr>
-                <w:sz w:val="19"/>
-                <w:szCs w:val="19"/>
-              </w:rPr>
-              <w:t xml:space="preserve">Chen dan Fang (2023) [13]</w:t>
-            </w:r>
-          </w:p>
-        </w:tc>
-        <w:tc>
-          <w:tcPr>
-            <w:tcW w:type="dxa" w:w="3005"/>
-            <w:tcBorders>
-              <w:top w:val="single" w:color="808080" w:sz="4"/>
-              <w:left w:val="single" w:color="808080" w:sz="4"/>
-              <w:bottom w:val="single" w:color="808080" w:sz="4"/>
-              <w:right w:val="single" w:color="808080" w:sz="4"/>
-            </w:tcBorders>
-            <w:tcMar>
-              <w:top w:type="dxa" w:w="60"/>
-              <w:left w:type="dxa" w:w="100"/>
-              <w:bottom w:type="dxa" w:w="60"/>
-              <w:right w:type="dxa" w:w="100"/>
-            </w:tcMar>
-          </w:tcPr>
-          <w:p>
-            <w:pPr>
-              <w:keepNext/>
-              <w:keepLines/>
-              <w:spacing w:line="276"/>
-              <w:jc w:val="left"/>
-            </w:pPr>
-            <w:r>
-              <w:rPr>
-                <w:sz w:val="19"/>
-                <w:szCs w:val="19"/>
-              </w:rPr>
-              <w:t xml:space="preserve">Model matematis gacha; keputusan pemain sebagai </w:t>
-            </w:r>
-            <w:r>
-              <w:rPr>
-                <w:i/>
-                <w:iCs/>
-                <w:sz w:val="19"/>
-                <w:szCs w:val="19"/>
-              </w:rPr>
-              <w:t xml:space="preserve">Markov Decision Process</w:t>
-            </w:r>
-          </w:p>
-        </w:tc>
-        <w:tc>
-          <w:tcPr>
-            <w:tcW w:type="dxa" w:w="3535"/>
-            <w:tcBorders>
-              <w:top w:val="single" w:color="808080" w:sz="4"/>
-              <w:left w:val="single" w:color="808080" w:sz="4"/>
-              <w:bottom w:val="single" w:color="808080" w:sz="4"/>
-              <w:right w:val="single" w:color="808080" w:sz="4"/>
-            </w:tcBorders>
-            <w:tcMar>
-              <w:top w:type="dxa" w:w="60"/>
-              <w:left w:type="dxa" w:w="100"/>
-              <w:bottom w:type="dxa" w:w="60"/>
-              <w:right w:type="dxa" w:w="100"/>
-            </w:tcMar>
-          </w:tcPr>
-          <w:p>
-            <w:pPr>
-              <w:keepNext/>
-              <w:keepLines/>
-              <w:spacing w:line="276"/>
-              <w:jc w:val="left"/>
-            </w:pPr>
-            <w:r>
-              <w:rPr>
-                <w:sz w:val="19"/>
-                <w:szCs w:val="19"/>
-              </w:rPr>
-              <w:t xml:space="preserve">Desain gacha, termasuk sistem pity, dapat dianalisis secara matematis dari sisi pendapatan pengembang</w:t>
-            </w:r>
-          </w:p>
-        </w:tc>
-      </w:tr>
-      <w:tr>
-        <w:trPr>
-          <w:cantSplit/>
-        </w:trPr>
-        <w:tc>
-          <w:tcPr>
-            <w:tcW w:type="dxa" w:w="2298"/>
-            <w:tcBorders>
-              <w:top w:val="single" w:color="808080" w:sz="4"/>
-              <w:left w:val="single" w:color="808080" w:sz="4"/>
-              <w:bottom w:val="single" w:color="808080" w:sz="4"/>
-              <w:right w:val="single" w:color="808080" w:sz="4"/>
-            </w:tcBorders>
-            <w:tcMar>
-              <w:top w:type="dxa" w:w="60"/>
-              <w:left w:type="dxa" w:w="100"/>
-              <w:bottom w:type="dxa" w:w="60"/>
-              <w:right w:type="dxa" w:w="100"/>
-            </w:tcMar>
-          </w:tcPr>
-          <w:p>
-            <w:pPr>
-              <w:keepNext/>
-              <w:keepLines/>
-              <w:spacing w:line="276"/>
-              <w:jc w:val="left"/>
-            </w:pPr>
-            <w:r>
-              <w:rPr>
-                <w:sz w:val="19"/>
-                <w:szCs w:val="19"/>
-              </w:rPr>
-              <w:t xml:space="preserve">Maulidah (2023) [8]</w:t>
-            </w:r>
-          </w:p>
-        </w:tc>
-        <w:tc>
-          <w:tcPr>
-            <w:tcW w:type="dxa" w:w="3005"/>
-            <w:tcBorders>
-              <w:top w:val="single" w:color="808080" w:sz="4"/>
-              <w:left w:val="single" w:color="808080" w:sz="4"/>
-              <w:bottom w:val="single" w:color="808080" w:sz="4"/>
-              <w:right w:val="single" w:color="808080" w:sz="4"/>
-            </w:tcBorders>
-            <w:tcMar>
-              <w:top w:type="dxa" w:w="60"/>
-              <w:left w:type="dxa" w:w="100"/>
-              <w:bottom w:type="dxa" w:w="60"/>
-              <w:right w:type="dxa" w:w="100"/>
-            </w:tcMar>
-          </w:tcPr>
-          <w:p>
-            <w:pPr>
-              <w:keepNext/>
-              <w:keepLines/>
-              <w:spacing w:line="276"/>
-              <w:jc w:val="left"/>
-            </w:pPr>
-            <w:r>
-              <w:rPr>
-                <w:sz w:val="19"/>
-                <w:szCs w:val="19"/>
-              </w:rPr>
-              <w:t xml:space="preserve">Nasabah deposito berjangka (UCI); KNN, Decision Tree, Random Forest, XGBoost</w:t>
-            </w:r>
-          </w:p>
-        </w:tc>
-        <w:tc>
-          <w:tcPr>
-            <w:tcW w:type="dxa" w:w="3535"/>
-            <w:tcBorders>
-              <w:top w:val="single" w:color="808080" w:sz="4"/>
-              <w:left w:val="single" w:color="808080" w:sz="4"/>
-              <w:bottom w:val="single" w:color="808080" w:sz="4"/>
-              <w:right w:val="single" w:color="808080" w:sz="4"/>
-            </w:tcBorders>
-            <w:tcMar>
-              <w:top w:type="dxa" w:w="60"/>
-              <w:left w:type="dxa" w:w="100"/>
-              <w:bottom w:type="dxa" w:w="60"/>
-              <w:right w:type="dxa" w:w="100"/>
-            </w:tcMar>
-          </w:tcPr>
-          <w:p>
-            <w:pPr>
-              <w:keepNext/>
-              <w:keepLines/>
-              <w:spacing w:line="276"/>
-              <w:jc w:val="left"/>
-            </w:pPr>
-            <w:r>
-              <w:rPr>
-                <w:sz w:val="19"/>
-                <w:szCs w:val="19"/>
-              </w:rPr>
-              <w:t xml:space="preserve">XGBoost memperoleh akurasi tertinggi, 92,36%</w:t>
-            </w:r>
-          </w:p>
-        </w:tc>
-      </w:tr>
-      <w:tr>
-        <w:trPr>
-          <w:cantSplit/>
-        </w:trPr>
-        <w:tc>
-          <w:tcPr>
-            <w:tcW w:type="dxa" w:w="2298"/>
-            <w:tcBorders>
-              <w:top w:val="single" w:color="808080" w:sz="4"/>
-              <w:left w:val="single" w:color="808080" w:sz="4"/>
-              <w:bottom w:val="single" w:color="808080" w:sz="4"/>
-              <w:right w:val="single" w:color="808080" w:sz="4"/>
-            </w:tcBorders>
-            <w:tcMar>
-              <w:top w:type="dxa" w:w="60"/>
-              <w:left w:type="dxa" w:w="100"/>
-              <w:bottom w:type="dxa" w:w="60"/>
-              <w:right w:type="dxa" w:w="100"/>
-            </w:tcMar>
-          </w:tcPr>
-          <w:p>
-            <w:pPr>
-              <w:keepNext/>
-              <w:keepLines/>
-              <w:spacing w:line="276"/>
-              <w:jc w:val="left"/>
-            </w:pPr>
-            <w:r>
-              <w:rPr>
-                <w:sz w:val="19"/>
-                <w:szCs w:val="19"/>
-              </w:rPr>
-              <w:t xml:space="preserve">Rahmat dkk. (2023) [9]</w:t>
-            </w:r>
-          </w:p>
-        </w:tc>
-        <w:tc>
-          <w:tcPr>
-            <w:tcW w:type="dxa" w:w="3005"/>
-            <w:tcBorders>
-              <w:top w:val="single" w:color="808080" w:sz="4"/>
-              <w:left w:val="single" w:color="808080" w:sz="4"/>
-              <w:bottom w:val="single" w:color="808080" w:sz="4"/>
-              <w:right w:val="single" w:color="808080" w:sz="4"/>
-            </w:tcBorders>
-            <w:tcMar>
-              <w:top w:type="dxa" w:w="60"/>
-              <w:left w:type="dxa" w:w="100"/>
-              <w:bottom w:type="dxa" w:w="60"/>
-              <w:right w:type="dxa" w:w="100"/>
-            </w:tcMar>
-          </w:tcPr>
-          <w:p>
-            <w:pPr>
-              <w:keepNext/>
-              <w:keepLines/>
-              <w:spacing w:line="276"/>
-              <w:jc w:val="left"/>
-            </w:pPr>
-            <w:r>
-              <w:rPr>
-                <w:sz w:val="19"/>
-                <w:szCs w:val="19"/>
-              </w:rPr>
-              <w:t xml:space="preserve">Kepuasan penumpang maskapai (Kaggle); Decision Tree, Random Forest, Naive Bayes</w:t>
-            </w:r>
-          </w:p>
-        </w:tc>
-        <w:tc>
-          <w:tcPr>
-            <w:tcW w:type="dxa" w:w="3535"/>
-            <w:tcBorders>
-              <w:top w:val="single" w:color="808080" w:sz="4"/>
-              <w:left w:val="single" w:color="808080" w:sz="4"/>
-              <w:bottom w:val="single" w:color="808080" w:sz="4"/>
-              <w:right w:val="single" w:color="808080" w:sz="4"/>
-            </w:tcBorders>
-            <w:tcMar>
-              <w:top w:type="dxa" w:w="60"/>
-              <w:left w:type="dxa" w:w="100"/>
-              <w:bottom w:type="dxa" w:w="60"/>
-              <w:right w:type="dxa" w:w="100"/>
-            </w:tcMar>
-          </w:tcPr>
-          <w:p>
-            <w:pPr>
-              <w:keepNext/>
-              <w:keepLines/>
-              <w:spacing w:line="276"/>
-              <w:jc w:val="left"/>
-            </w:pPr>
-            <w:r>
-              <w:rPr>
-                <w:sz w:val="19"/>
-                <w:szCs w:val="19"/>
-              </w:rPr>
-              <w:t xml:space="preserve">Random Forest 95%, Decision Tree 93%, Naive Bayes 82%</w:t>
-            </w:r>
-          </w:p>
-        </w:tc>
-      </w:tr>
-      <w:tr>
-        <w:trPr>
-          <w:cantSplit/>
-        </w:trPr>
-        <w:tc>
-          <w:tcPr>
-            <w:tcW w:type="dxa" w:w="2298"/>
-            <w:tcBorders>
-              <w:top w:val="single" w:color="808080" w:sz="4"/>
-              <w:left w:val="single" w:color="808080" w:sz="4"/>
-              <w:bottom w:val="single" w:color="808080" w:sz="4"/>
-              <w:right w:val="single" w:color="808080" w:sz="4"/>
-            </w:tcBorders>
-            <w:tcMar>
-              <w:top w:type="dxa" w:w="60"/>
-              <w:left w:type="dxa" w:w="100"/>
-              <w:bottom w:type="dxa" w:w="60"/>
-              <w:right w:type="dxa" w:w="100"/>
-            </w:tcMar>
-          </w:tcPr>
-          <w:p>
-            <w:pPr>
-              <w:keepNext/>
-              <w:keepLines/>
-              <w:spacing w:line="276"/>
-              <w:jc w:val="left"/>
-            </w:pPr>
-            <w:r>
-              <w:rPr>
-                <w:sz w:val="19"/>
-                <w:szCs w:val="19"/>
-              </w:rPr>
-              <w:t xml:space="preserve">Grinsztajn dkk. (2022) [15]</w:t>
-            </w:r>
-          </w:p>
-        </w:tc>
-        <w:tc>
-          <w:tcPr>
-            <w:tcW w:type="dxa" w:w="3005"/>
-            <w:tcBorders>
-              <w:top w:val="single" w:color="808080" w:sz="4"/>
-              <w:left w:val="single" w:color="808080" w:sz="4"/>
-              <w:bottom w:val="single" w:color="808080" w:sz="4"/>
-              <w:right w:val="single" w:color="808080" w:sz="4"/>
-            </w:tcBorders>
-            <w:tcMar>
-              <w:top w:type="dxa" w:w="60"/>
-              <w:left w:type="dxa" w:w="100"/>
-              <w:bottom w:type="dxa" w:w="60"/>
-              <w:right w:type="dxa" w:w="100"/>
-            </w:tcMar>
-          </w:tcPr>
-          <w:p>
-            <w:pPr>
-              <w:keepNext/>
-              <w:keepLines/>
-              <w:spacing w:line="276"/>
-              <w:jc w:val="left"/>
-            </w:pPr>
-            <w:r>
-              <w:rPr>
-                <w:sz w:val="19"/>
-                <w:szCs w:val="19"/>
-              </w:rPr>
-              <w:t xml:space="preserve">45 dataset tabular; model berbasis pohon dan </w:t>
-            </w:r>
-            <w:r>
-              <w:rPr>
-                <w:i/>
-                <w:iCs/>
-                <w:sz w:val="19"/>
-                <w:szCs w:val="19"/>
-              </w:rPr>
-              <w:t xml:space="preserve">deep learning</w:t>
-            </w:r>
-          </w:p>
-        </w:tc>
-        <w:tc>
-          <w:tcPr>
-            <w:tcW w:type="dxa" w:w="3535"/>
-            <w:tcBorders>
-              <w:top w:val="single" w:color="808080" w:sz="4"/>
-              <w:left w:val="single" w:color="808080" w:sz="4"/>
-              <w:bottom w:val="single" w:color="808080" w:sz="4"/>
-              <w:right w:val="single" w:color="808080" w:sz="4"/>
-            </w:tcBorders>
-            <w:tcMar>
-              <w:top w:type="dxa" w:w="60"/>
-              <w:left w:type="dxa" w:w="100"/>
-              <w:bottom w:type="dxa" w:w="60"/>
-              <w:right w:type="dxa" w:w="100"/>
-            </w:tcMar>
-          </w:tcPr>
-          <w:p>
-            <w:pPr>
-              <w:keepNext/>
-              <w:keepLines/>
-              <w:spacing w:line="276"/>
-              <w:jc w:val="left"/>
-            </w:pPr>
-            <w:r>
-              <w:rPr>
-                <w:sz w:val="19"/>
-                <w:szCs w:val="19"/>
-              </w:rPr>
-              <w:t xml:space="preserve">Model berbasis pohon seperti XGBoost dan Random Forest tetap unggul pada data tabular berukuran menengah</w:t>
-            </w:r>
-          </w:p>
-        </w:tc>
-      </w:tr>
-      <w:tr>
-        <w:trPr>
-          <w:cantSplit/>
-        </w:trPr>
-        <w:tc>
-          <w:tcPr>
-            <w:tcW w:type="dxa" w:w="2298"/>
-            <w:tcBorders>
-              <w:top w:val="single" w:color="808080" w:sz="4"/>
-              <w:left w:val="single" w:color="808080" w:sz="4"/>
-              <w:bottom w:val="single" w:color="808080" w:sz="4"/>
-              <w:right w:val="single" w:color="808080" w:sz="4"/>
-            </w:tcBorders>
-            <w:tcMar>
-              <w:top w:type="dxa" w:w="60"/>
-              <w:left w:type="dxa" w:w="100"/>
-              <w:bottom w:type="dxa" w:w="60"/>
-              <w:right w:type="dxa" w:w="100"/>
-            </w:tcMar>
-          </w:tcPr>
-          <w:p>
-            <w:pPr>
-              <w:keepNext/>
-              <w:keepLines/>
-              <w:spacing w:line="276"/>
-              <w:jc w:val="left"/>
-            </w:pPr>
-            <w:r>
-              <w:rPr>
-                <w:sz w:val="19"/>
-                <w:szCs w:val="19"/>
-              </w:rPr>
-              <w:t xml:space="preserve">Chicco dan Jurman (2020) [7]</w:t>
-            </w:r>
-          </w:p>
-        </w:tc>
-        <w:tc>
-          <w:tcPr>
-            <w:tcW w:type="dxa" w:w="3005"/>
-            <w:tcBorders>
-              <w:top w:val="single" w:color="808080" w:sz="4"/>
-              <w:left w:val="single" w:color="808080" w:sz="4"/>
-              <w:bottom w:val="single" w:color="808080" w:sz="4"/>
-              <w:right w:val="single" w:color="808080" w:sz="4"/>
-            </w:tcBorders>
-            <w:tcMar>
-              <w:top w:type="dxa" w:w="60"/>
-              <w:left w:type="dxa" w:w="100"/>
-              <w:bottom w:type="dxa" w:w="60"/>
-              <w:right w:type="dxa" w:w="100"/>
-            </w:tcMar>
-          </w:tcPr>
-          <w:p>
-            <w:pPr>
-              <w:keepNext/>
-              <w:keepLines/>
-              <w:spacing w:line="276"/>
-              <w:jc w:val="left"/>
-            </w:pPr>
-            <w:r>
-              <w:rPr>
-                <w:sz w:val="19"/>
-                <w:szCs w:val="19"/>
-              </w:rPr>
-              <w:t xml:space="preserve">Metrik evaluasi klasifikasi biner</w:t>
-            </w:r>
-          </w:p>
-        </w:tc>
-        <w:tc>
-          <w:tcPr>
-            <w:tcW w:type="dxa" w:w="3535"/>
-            <w:tcBorders>
-              <w:top w:val="single" w:color="808080" w:sz="4"/>
-              <w:left w:val="single" w:color="808080" w:sz="4"/>
-              <w:bottom w:val="single" w:color="808080" w:sz="4"/>
-              <w:right w:val="single" w:color="808080" w:sz="4"/>
-            </w:tcBorders>
-            <w:tcMar>
-              <w:top w:type="dxa" w:w="60"/>
-              <w:left w:type="dxa" w:w="100"/>
-              <w:bottom w:type="dxa" w:w="60"/>
-              <w:right w:type="dxa" w:w="100"/>
-            </w:tcMar>
-          </w:tcPr>
-          <w:p>
-            <w:pPr>
-              <w:keepNext/>
-              <w:keepLines/>
-              <w:spacing w:line="276"/>
-              <w:jc w:val="left"/>
-            </w:pPr>
-            <w:r>
-              <w:rPr>
-                <w:sz w:val="19"/>
-                <w:szCs w:val="19"/>
-              </w:rPr>
-              <w:t xml:space="preserve">Accuracy dan F1-score dapat terlalu optimistis pada data tidak seimbang</w:t>
-            </w:r>
-          </w:p>
-        </w:tc>
-      </w:tr>
-      <w:tr>
-        <w:trPr>
-          <w:cantSplit/>
-        </w:trPr>
-        <w:tc>
-          <w:tcPr>
-            <w:tcW w:type="dxa" w:w="2298"/>
-            <w:tcBorders>
-              <w:top w:val="single" w:color="808080" w:sz="4"/>
-              <w:left w:val="single" w:color="808080" w:sz="4"/>
-              <w:bottom w:val="single" w:color="808080" w:sz="4"/>
-              <w:right w:val="single" w:color="808080" w:sz="4"/>
-            </w:tcBorders>
-            <w:tcMar>
-              <w:top w:type="dxa" w:w="60"/>
-              <w:left w:type="dxa" w:w="100"/>
-              <w:bottom w:type="dxa" w:w="60"/>
-              <w:right w:type="dxa" w:w="100"/>
-            </w:tcMar>
-          </w:tcPr>
-          <w:p>
-            <w:pPr>
-              <w:keepNext w:val="false"/>
-              <w:keepLines/>
-              <w:spacing w:line="276"/>
-              <w:jc w:val="left"/>
-            </w:pPr>
-            <w:r>
-              <w:rPr>
-                <w:sz w:val="19"/>
-                <w:szCs w:val="19"/>
-              </w:rPr>
-              <w:t xml:space="preserve">Niculescu-Mizil dan Caruana (2005) [16]</w:t>
-            </w:r>
-          </w:p>
-        </w:tc>
-        <w:tc>
-          <w:tcPr>
-            <w:tcW w:type="dxa" w:w="3005"/>
-            <w:tcBorders>
-              <w:top w:val="single" w:color="808080" w:sz="4"/>
-              <w:left w:val="single" w:color="808080" w:sz="4"/>
-              <w:bottom w:val="single" w:color="808080" w:sz="4"/>
-              <w:right w:val="single" w:color="808080" w:sz="4"/>
-            </w:tcBorders>
-            <w:tcMar>
-              <w:top w:type="dxa" w:w="60"/>
-              <w:left w:type="dxa" w:w="100"/>
-              <w:bottom w:type="dxa" w:w="60"/>
-              <w:right w:type="dxa" w:w="100"/>
-            </w:tcMar>
-          </w:tcPr>
-          <w:p>
-            <w:pPr>
-              <w:keepNext w:val="false"/>
-              <w:keepLines/>
-              <w:spacing w:line="276"/>
-              <w:jc w:val="left"/>
-            </w:pPr>
-            <w:r>
-              <w:rPr>
-                <w:sz w:val="19"/>
-                <w:szCs w:val="19"/>
-              </w:rPr>
-              <w:t xml:space="preserve">Ketepatan peluang berbagai algoritma</w:t>
-            </w:r>
-          </w:p>
-        </w:tc>
-        <w:tc>
-          <w:tcPr>
-            <w:tcW w:type="dxa" w:w="3535"/>
-            <w:tcBorders>
-              <w:top w:val="single" w:color="808080" w:sz="4"/>
-              <w:left w:val="single" w:color="808080" w:sz="4"/>
-              <w:bottom w:val="single" w:color="808080" w:sz="4"/>
-              <w:right w:val="single" w:color="808080" w:sz="4"/>
-            </w:tcBorders>
-            <w:tcMar>
-              <w:top w:type="dxa" w:w="60"/>
-              <w:left w:type="dxa" w:w="100"/>
-              <w:bottom w:type="dxa" w:w="60"/>
-              <w:right w:type="dxa" w:w="100"/>
-            </w:tcMar>
-          </w:tcPr>
-          <w:p>
-            <w:pPr>
-              <w:keepNext w:val="false"/>
-              <w:keepLines/>
-              <w:spacing w:line="276"/>
-              <w:jc w:val="left"/>
-            </w:pPr>
-            <w:r>
-              <w:rPr>
-                <w:sz w:val="19"/>
-                <w:szCs w:val="19"/>
-              </w:rPr>
-              <w:t xml:space="preserve">Naive Bayes mendorong peluang ke 0 atau 1, </w:t>
-            </w:r>
-            <w:r>
-              <w:rPr>
-                <w:i/>
-                <w:iCs/>
-                <w:sz w:val="19"/>
-                <w:szCs w:val="19"/>
-              </w:rPr>
-              <w:t xml:space="preserve">boosting</w:t>
-            </w:r>
-            <w:r>
-              <w:rPr>
-                <w:sz w:val="19"/>
-                <w:szCs w:val="19"/>
-              </w:rPr>
-              <w:t xml:space="preserve"> mendistorsi peluang, sedangkan </w:t>
-            </w:r>
-            <w:r>
-              <w:rPr>
-                <w:i/>
-                <w:iCs/>
-                <w:sz w:val="19"/>
-                <w:szCs w:val="19"/>
-              </w:rPr>
-              <w:t xml:space="preserve">bagged trees</w:t>
-            </w:r>
-            <w:r>
-              <w:rPr>
-                <w:sz w:val="19"/>
-                <w:szCs w:val="19"/>
-              </w:rPr>
-              <w:t xml:space="preserve"> relatif terkalibrasi baik</w:t>
-            </w:r>
-          </w:p>
-        </w:tc>
-      </w:tr>
-    </w:tbl>
-    <w:p>
-      <w:pPr>
-        <w:spacing w:after="0" w:line="276"/>
-      </w:pPr>
+        <w:t xml:space="preserve">, perbandingan algoritma klasifikasi, serta evaluasi model pada data yang tidak seimbang.</w:t>
+      </w:r>
     </w:p>
     <w:p>
       <w:pPr>
@@ -2732,7 +1470,47 @@
         <w:jc w:val="both"/>
       </w:pPr>
       <w:r>
-        <w:t xml:space="preserve">Penelitian Chen dan Fang [13] serta Xiao dkk. [2] menunjukkan bahwa peluang pada gacha dirancang oleh pengembang dan tidak selalu disajikan dengan jelas kepada pemain. Penelitian Zendle dan Cairns [1] serta Dahlan dan Noorrizki [3] menunjukkan bahwa keputusan berbelanja pada gacha berdampak nyata bagi pemain, sehingga informasi peluang yang akurat bermanfaat. Namun, penelitian-penelitian tersebut tidak memperkirakan peluang dari data riwayat gacha pemain.</w:t>
+        <w:t xml:space="preserve">Zendle dan Cairns [1] melakukan survei terhadap 7.422 pemain dan menemukan bahwa pengeluaran untuk </w:t>
+      </w:r>
+      <w:r>
+        <w:rPr>
+          <w:i/>
+          <w:iCs/>
+        </w:rPr>
+        <w:t xml:space="preserve">loot box</w:t>
+      </w:r>
+      <w:r>
+        <w:t xml:space="preserve"> berkaitan dengan tingkat masalah judi. Xiao dkk. [2] meneliti 100 game iPhone terlaris di Tiongkok dan menemukan </w:t>
+      </w:r>
+      <w:r>
+        <w:rPr>
+          <w:i/>
+          <w:iCs/>
+        </w:rPr>
+        <w:t xml:space="preserve">loot box</w:t>
+      </w:r>
+      <w:r>
+        <w:t xml:space="preserve"> pada 91 game, tetapi hanya 5,5% game yang menampilkan peluangnya langsung di halaman pembelian. Di Indonesia, Dahlan dan Noorrizki [3] meneliti 19 pemain Genshin Impact dan menemukan bahwa responden cenderung tidak konsumtif, walaupun tetap ada yang melakukan </w:t>
+      </w:r>
+      <w:r>
+        <w:rPr>
+          <w:i/>
+          <w:iCs/>
+        </w:rPr>
+        <w:t xml:space="preserve">top-up</w:t>
+      </w:r>
+      <w:r>
+        <w:t xml:space="preserve"> untuk mendapatkan karakter atau senjata tertentu. Chen dan Fang [13] memodelkan game gacha secara matematis, termasuk sistem pity, dengan memandang keputusan pemain sebagai </w:t>
+      </w:r>
+      <w:r>
+        <w:rPr>
+          <w:i/>
+          <w:iCs/>
+        </w:rPr>
+        <w:t xml:space="preserve">Markov Decision Process</w:t>
+      </w:r>
+      <w:r>
+        <w:t xml:space="preserve"> dan menganalisisnya dari sisi pendapatan pengembang. Dari penelitian-penelitian tersebut, belum ada yang memperkirakan peluang gacha dari data riwayat pemain.</w:t>
       </w:r>
     </w:p>
     <w:p>
@@ -2742,7 +1520,27 @@
         <w:jc w:val="both"/>
       </w:pPr>
       <w:r>
-        <w:t xml:space="preserve">Dari sisi algoritma, hasil perbandingan berbeda-beda bergantung pada data: XGBoost unggul pada data deposito bank [8], sedangkan Random Forest unggul pada data kepuasan penumpang [9]. Secara umum, model berbasis pohon cenderung unggul pada data tabular berukuran menengah [15]. Karena pemain membutuhkan angka peluang, bukan hanya tebakan ya atau tidak, ketepatan peluang juga perlu dinilai [16], dan karena kelas S-Rank sangat jarang, akurasi perlu didampingi metrik lain [7]. Oleh karena itu, penelitian ini membandingkan enam algoritma dari keluarga yang berbeda (probabilistik, berbasis jarak, linear, dan berbasis pohon) dan menilai ketepatan peluangnya dengan Log Loss dan Brier Score [17].</w:t>
+        <w:t xml:space="preserve">Dari sisi algoritma, Maulidah [8] membandingkan KNN, Decision Tree, Random Forest, dan XGBoost untuk memprediksi nasabah deposito berjangka, dan XGBoost memperoleh akurasi tertinggi sebesar 92,36%. Rahmat dkk. [9] membandingkan Decision Tree, Random Forest, dan Naive Bayes pada data kepuasan penumpang maskapai, dengan hasil akurasi Random Forest 95%, Decision Tree 93%, dan Naive Bayes 82%. Grinsztajn dkk. [15] menguji 45 dataset tabular dan menunjukkan bahwa model berbasis pohon seperti XGBoost dan Random Forest masih unggul pada data tabular berukuran menengah. Hasil-hasil tersebut menunjukkan bahwa algoritma terbaik bisa berbeda tergantung datanya, sehingga perlu diuji langsung pada data gacha.</w:t>
+      </w:r>
+    </w:p>
+    <w:p>
+      <w:pPr>
+        <w:spacing w:after="0" w:line="276"/>
+        <w:ind w:firstLine="720"/>
+        <w:jc w:val="both"/>
+      </w:pPr>
+      <w:r>
+        <w:t xml:space="preserve">Untuk evaluasi model, Chicco dan Jurman [7] menjelaskan bahwa Accuracy dan F1-score bisa memberikan hasil yang terlalu optimis pada data tidak seimbang. Niculescu-Mizil dan Caruana [16] menemukan bahwa Naive Bayes cenderung menghasilkan peluang yang terlalu ekstrem mendekati 0 atau 1, sedangkan </w:t>
+      </w:r>
+      <w:r>
+        <w:rPr>
+          <w:i/>
+          <w:iCs/>
+        </w:rPr>
+        <w:t xml:space="preserve">bagged trees</w:t>
+      </w:r>
+      <w:r>
+        <w:t xml:space="preserve"> menghasilkan peluang yang lebih baik. Karena pemain membutuhkan angka peluang dan bukan hanya tebakan ya atau tidak, penelitian ini juga menilai ketepatan peluang menggunakan Log Loss dan Brier Score [17].</w:t>
       </w:r>
     </w:p>
     <w:p>
@@ -2762,17 +1560,7 @@
         <w:jc w:val="both"/>
       </w:pPr>
       <w:r>
-        <w:t xml:space="preserve">Alur metode yang diusulkan ditunjukkan pada Gambar 2.1. Proses dimulai dari pengambilan riwayat gacha asli dan pembuatan data simulasi, dilanjutkan pra-pemrosesan, pembentukan fitur dan target, pemilihan hyperparameter dan pelatihan enam algoritma, evaluasi, lalu </w:t>
-      </w:r>
-      <w:r>
-        <w:rPr>
-          <w:i/>
-          <w:iCs/>
-        </w:rPr>
-        <w:t xml:space="preserve">deployment</w:t>
-      </w:r>
-      <w:r>
-        <w:t xml:space="preserve"> ke aplikasi web.</w:t>
+        <w:t xml:space="preserve">Alur metode yang diusulkan dapat dilihat pada Gambar 2.1. Penelitian dimulai dari pengambilan data riwayat gacha asli dan pembuatan data simulasi. Data kemudian melalui tahap pra-pemrosesan dan pembentukan fitur, lalu digunakan untuk melatih enam algoritma klasifikasi. Hasil dari setiap algoritma dievaluasi dan dibandingkan dengan model Markov Chain, kemudian model terbaik diterapkan ke dalam aplikasi web.</w:t>
       </w:r>
     </w:p>
     <w:p>
@@ -2784,7 +1572,7 @@
       <w:r>
         <w:drawing>
           <wp:inline distT="0" distB="0" distL="0" distR="0">
-            <wp:extent cx="5334000" cy="3676650"/>
+            <wp:extent cx="4762500" cy="3286125"/>
             <wp:effectExtent t="0" r="0" b="0" l="0"/>
             <wp:docPr id="3" name="fig_metode.png" descr="Alur metode yang diusulkan" title="Alur metode yang diusulkan"/>
             <wp:cNvGraphicFramePr>
@@ -2809,7 +1597,7 @@
                   <pic:spPr bwMode="auto">
                     <a:xfrm>
                       <a:off x="0" y="0"/>
-                      <a:ext cx="5334000" cy="3676650"/>
+                      <a:ext cx="4762500" cy="3286125"/>
                     </a:xfrm>
                     <a:prstGeom prst="rect">
                       <a:avLst/>
@@ -2845,7 +1633,7 @@
         <w:jc w:val="both"/>
       </w:pPr>
       <w:r>
-        <w:t xml:space="preserve">Sebagai acuan teori, sistem pity dimodelkan dengan Markov Chain, yaitu proses stokastik ketika peluang keadaan berikutnya hanya bergantung pada keadaan saat ini [18]. Peluang mendapatkan S-Rank pada pull ke-n, dengan syarat belum mendapat S-Rank sebelumnya, disebut </w:t>
+        <w:t xml:space="preserve">Markov Chain adalah proses acak di mana peluang keadaan berikutnya hanya bergantung pada keadaan saat ini [18]. Pada sistem pity, peluang mendapatkan S-Rank pada pull ke-n dengan syarat belum mendapat S-Rank sebelumnya disebut </w:t>
       </w:r>
       <w:r>
         <w:rPr>
@@ -2855,7 +1643,7 @@
         <w:t xml:space="preserve">hazard</w:t>
       </w:r>
       <w:r>
-        <w:t xml:space="preserve"> h(n):</w:t>
+        <w:t xml:space="preserve"> h(n), yang dihitung dengan rumus berikut.</w:t>
       </w:r>
     </w:p>
     <w:p>
@@ -2868,26 +1656,33 @@
           <w:i/>
           <w:iCs/>
         </w:rPr>
-        <w:t xml:space="preserve">h(n) = p untuk n &lt; s;   h(n) = min(1, p + k·(n − s + 1)) untuk n ≥ s;   h(hard pity) = 1</w:t>
-      </w:r>
-    </w:p>
-    <w:p>
-      <w:pPr>
-        <w:spacing w:after="0" w:line="276"/>
-        <w:jc w:val="both"/>
-      </w:pPr>
-      <w:r>
-        <w:t xml:space="preserve">dengan p = rate dasar, s = titik mulai </w:t>
-      </w:r>
+        <w:t xml:space="preserve">h(n) = p,  untuk n &lt; s</w:t>
+      </w:r>
+    </w:p>
+    <w:p>
+      <w:pPr>
+        <w:spacing w:after="60" w:before="60" w:line="276"/>
+        <w:jc w:val="center"/>
+      </w:pPr>
       <w:r>
         <w:rPr>
           <w:i/>
           <w:iCs/>
         </w:rPr>
-        <w:t xml:space="preserve">soft pity</w:t>
-      </w:r>
-      <w:r>
-        <w:t xml:space="preserve">, dan k = kenaikan peluang per pull. Nilai k dicari dengan metode biseksi sehingga rata-rata jumlah pull per S-Rank sama dengan kebalikan rate gabungan resmi, yaitu k ≈ 5,30% untuk Agent (s = 74) dan k ≈ 5,52% untuk W-Engine (s = 65). Nilai s merupakan estimasi komunitas yang akan diperiksa dengan data asli.</w:t>
+        <w:t xml:space="preserve">h(n) = min(1, p + k(n − s + 1)),  untuk n ≥ s</w:t>
+      </w:r>
+    </w:p>
+    <w:p>
+      <w:pPr>
+        <w:spacing w:after="60" w:before="60" w:line="276"/>
+        <w:jc w:val="center"/>
+      </w:pPr>
+      <w:r>
+        <w:rPr>
+          <w:i/>
+          <w:iCs/>
+        </w:rPr>
+        <w:t xml:space="preserve">h(hard pity) = 1</w:t>
       </w:r>
     </w:p>
     <w:p>
@@ -2897,17 +1692,27 @@
         <w:jc w:val="both"/>
       </w:pPr>
       <w:r>
-        <w:t xml:space="preserve">Keenam algoritma yang dibandingkan beserta ruang pencarian </w:t>
+        <w:t xml:space="preserve">Keterangan: p adalah peluang dasar, s adalah titik mulai </w:t>
       </w:r>
       <w:r>
         <w:rPr>
           <w:i/>
           <w:iCs/>
         </w:rPr>
-        <w:t xml:space="preserve">grid search</w:t>
-      </w:r>
-      <w:r>
-        <w:t xml:space="preserve">-nya ditunjukkan pada Tabel 2.2. Nilai pertama pada setiap ruang pencarian adalah pengaturan awal sebelum </w:t>
+        <w:t xml:space="preserve">soft pity</w:t>
+      </w:r>
+      <w:r>
+        <w:t xml:space="preserve">, dan k adalah kenaikan peluang setiap pull. Nilai k dicari menggunakan metode biseksi agar rata-rata jumlah pull untuk mendapatkan S-Rank sama dengan kebalikan dari peluang gabungan resmi. Hasilnya, k sekitar 5,30% untuk Agent dengan s = 74 dan sekitar 5,52% untuk W-Engine dengan s = 65. Nilai s ini merupakan perkiraan dari komunitas pemain dan akan diperiksa kembali menggunakan data asli.</w:t>
+      </w:r>
+    </w:p>
+    <w:p>
+      <w:pPr>
+        <w:spacing w:after="0" w:line="276"/>
+        <w:ind w:firstLine="720"/>
+        <w:jc w:val="both"/>
+      </w:pPr>
+      <w:r>
+        <w:t xml:space="preserve">Algoritma yang dibandingkan beserta pengaturan yang dicoba pada </w:t>
       </w:r>
       <w:r>
         <w:rPr>
@@ -2917,7 +1722,7 @@
         <w:t xml:space="preserve">grid search</w:t>
       </w:r>
       <w:r>
-        <w:t xml:space="preserve">, sehingga pengaturan awal dipertahankan jika beberapa kombinasi memperoleh skor yang sama persis.</w:t>
+        <w:t xml:space="preserve"> dapat dilihat pada Tabel 2.1.</w:t>
       </w:r>
     </w:p>
     <w:p>
@@ -2932,10 +1737,10 @@
           <w:b/>
           <w:bCs/>
         </w:rPr>
-        <w:t xml:space="preserve">Tabel 2.2</w:t>
-      </w:r>
-      <w:r>
-        <w:t xml:space="preserve"> Algoritma yang dibandingkan dan ruang pencarian grid search</w:t>
+        <w:t xml:space="preserve">Tabel 2.1</w:t>
+      </w:r>
+      <w:r>
+        <w:t xml:space="preserve"> Algoritma yang dibandingkan</w:t>
       </w:r>
     </w:p>
     <w:tbl>
@@ -2952,8 +1757,8 @@
       </w:tblPr>
       <w:tblGrid>
         <w:gridCol w:w="2121"/>
-        <w:gridCol w:w="3535"/>
-        <w:gridCol w:w="3182"/>
+        <w:gridCol w:w="3712"/>
+        <w:gridCol w:w="3005"/>
       </w:tblGrid>
       <w:tr>
         <w:trPr>
@@ -2964,12 +1769,11 @@
           <w:tcPr>
             <w:tcW w:type="dxa" w:w="2121"/>
             <w:tcBorders>
-              <w:top w:val="single" w:color="808080" w:sz="4"/>
-              <w:left w:val="single" w:color="808080" w:sz="4"/>
-              <w:bottom w:val="single" w:color="808080" w:sz="4"/>
-              <w:right w:val="single" w:color="808080" w:sz="4"/>
-            </w:tcBorders>
-            <w:shd w:fill="D9E2F3" w:color="auto" w:val="clear"/>
+              <w:top w:val="single" w:color="000000" w:sz="4"/>
+              <w:left w:val="single" w:color="000000" w:sz="4"/>
+              <w:bottom w:val="single" w:color="000000" w:sz="4"/>
+              <w:right w:val="single" w:color="000000" w:sz="4"/>
+            </w:tcBorders>
             <w:tcMar>
               <w:top w:type="dxa" w:w="60"/>
               <w:left w:type="dxa" w:w="100"/>
@@ -2988,8 +1792,8 @@
               <w:rPr>
                 <w:b/>
                 <w:bCs/>
-                <w:sz w:val="19"/>
-                <w:szCs w:val="19"/>
+                <w:sz w:val="20"/>
+                <w:szCs w:val="20"/>
               </w:rPr>
               <w:t xml:space="preserve">Algoritma</w:t>
             </w:r>
@@ -2997,14 +1801,13 @@
         </w:tc>
         <w:tc>
           <w:tcPr>
-            <w:tcW w:type="dxa" w:w="3535"/>
-            <w:tcBorders>
-              <w:top w:val="single" w:color="808080" w:sz="4"/>
-              <w:left w:val="single" w:color="808080" w:sz="4"/>
-              <w:bottom w:val="single" w:color="808080" w:sz="4"/>
-              <w:right w:val="single" w:color="808080" w:sz="4"/>
-            </w:tcBorders>
-            <w:shd w:fill="D9E2F3" w:color="auto" w:val="clear"/>
+            <w:tcW w:type="dxa" w:w="3712"/>
+            <w:tcBorders>
+              <w:top w:val="single" w:color="000000" w:sz="4"/>
+              <w:left w:val="single" w:color="000000" w:sz="4"/>
+              <w:bottom w:val="single" w:color="000000" w:sz="4"/>
+              <w:right w:val="single" w:color="000000" w:sz="4"/>
+            </w:tcBorders>
             <w:tcMar>
               <w:top w:type="dxa" w:w="60"/>
               <w:left w:type="dxa" w:w="100"/>
@@ -3023,23 +1826,22 @@
               <w:rPr>
                 <w:b/>
                 <w:bCs/>
-                <w:sz w:val="19"/>
-                <w:szCs w:val="19"/>
-              </w:rPr>
-              <w:t xml:space="preserve">Prinsip kerja dan pengaturan tetap</w:t>
-            </w:r>
-          </w:p>
-        </w:tc>
-        <w:tc>
-          <w:tcPr>
-            <w:tcW w:type="dxa" w:w="3182"/>
-            <w:tcBorders>
-              <w:top w:val="single" w:color="808080" w:sz="4"/>
-              <w:left w:val="single" w:color="808080" w:sz="4"/>
-              <w:bottom w:val="single" w:color="808080" w:sz="4"/>
-              <w:right w:val="single" w:color="808080" w:sz="4"/>
-            </w:tcBorders>
-            <w:shd w:fill="D9E2F3" w:color="auto" w:val="clear"/>
+                <w:sz w:val="20"/>
+                <w:szCs w:val="20"/>
+              </w:rPr>
+              <w:t xml:space="preserve">Cara kerja</w:t>
+            </w:r>
+          </w:p>
+        </w:tc>
+        <w:tc>
+          <w:tcPr>
+            <w:tcW w:type="dxa" w:w="3005"/>
+            <w:tcBorders>
+              <w:top w:val="single" w:color="000000" w:sz="4"/>
+              <w:left w:val="single" w:color="000000" w:sz="4"/>
+              <w:bottom w:val="single" w:color="000000" w:sz="4"/>
+              <w:right w:val="single" w:color="000000" w:sz="4"/>
+            </w:tcBorders>
             <w:tcMar>
               <w:top w:type="dxa" w:w="60"/>
               <w:left w:type="dxa" w:w="100"/>
@@ -3058,10 +1860,10 @@
               <w:rPr>
                 <w:b/>
                 <w:bCs/>
-                <w:sz w:val="19"/>
-                <w:szCs w:val="19"/>
-              </w:rPr>
-              <w:t xml:space="preserve">Ruang pencarian grid search</w:t>
+                <w:sz w:val="20"/>
+                <w:szCs w:val="20"/>
+              </w:rPr>
+              <w:t xml:space="preserve">Pengaturan yang dicoba</w:t>
             </w:r>
           </w:p>
         </w:tc>
@@ -3074,10 +1876,10 @@
           <w:tcPr>
             <w:tcW w:type="dxa" w:w="2121"/>
             <w:tcBorders>
-              <w:top w:val="single" w:color="808080" w:sz="4"/>
-              <w:left w:val="single" w:color="808080" w:sz="4"/>
-              <w:bottom w:val="single" w:color="808080" w:sz="4"/>
-              <w:right w:val="single" w:color="808080" w:sz="4"/>
+              <w:top w:val="single" w:color="000000" w:sz="4"/>
+              <w:left w:val="single" w:color="000000" w:sz="4"/>
+              <w:bottom w:val="single" w:color="000000" w:sz="4"/>
+              <w:right w:val="single" w:color="000000" w:sz="4"/>
             </w:tcBorders>
             <w:tcMar>
               <w:top w:type="dxa" w:w="60"/>
@@ -3095,8 +1897,8 @@
             </w:pPr>
             <w:r>
               <w:rPr>
-                <w:sz w:val="19"/>
-                <w:szCs w:val="19"/>
+                <w:sz w:val="20"/>
+                <w:szCs w:val="20"/>
               </w:rPr>
               <w:t xml:space="preserve">Naive Bayes</w:t>
             </w:r>
@@ -3104,12 +1906,12 @@
         </w:tc>
         <w:tc>
           <w:tcPr>
-            <w:tcW w:type="dxa" w:w="3535"/>
-            <w:tcBorders>
-              <w:top w:val="single" w:color="808080" w:sz="4"/>
-              <w:left w:val="single" w:color="808080" w:sz="4"/>
-              <w:bottom w:val="single" w:color="808080" w:sz="4"/>
-              <w:right w:val="single" w:color="808080" w:sz="4"/>
+            <w:tcW w:type="dxa" w:w="3712"/>
+            <w:tcBorders>
+              <w:top w:val="single" w:color="000000" w:sz="4"/>
+              <w:left w:val="single" w:color="000000" w:sz="4"/>
+              <w:bottom w:val="single" w:color="000000" w:sz="4"/>
+              <w:right w:val="single" w:color="000000" w:sz="4"/>
             </w:tcBorders>
             <w:tcMar>
               <w:top w:type="dxa" w:w="60"/>
@@ -3127,21 +1929,21 @@
             </w:pPr>
             <w:r>
               <w:rPr>
-                <w:sz w:val="19"/>
-                <w:szCs w:val="19"/>
-              </w:rPr>
-              <w:t xml:space="preserve">Teorema Bayes dengan asumsi fitur saling bebas (Gaussian)</w:t>
-            </w:r>
-          </w:p>
-        </w:tc>
-        <w:tc>
-          <w:tcPr>
-            <w:tcW w:type="dxa" w:w="3182"/>
-            <w:tcBorders>
-              <w:top w:val="single" w:color="808080" w:sz="4"/>
-              <w:left w:val="single" w:color="808080" w:sz="4"/>
-              <w:bottom w:val="single" w:color="808080" w:sz="4"/>
-              <w:right w:val="single" w:color="808080" w:sz="4"/>
+                <w:sz w:val="20"/>
+                <w:szCs w:val="20"/>
+              </w:rPr>
+              <w:t xml:space="preserve">menghitung peluang dengan Teorema Bayes, dengan asumsi setiap fitur saling bebas</w:t>
+            </w:r>
+          </w:p>
+        </w:tc>
+        <w:tc>
+          <w:tcPr>
+            <w:tcW w:type="dxa" w:w="3005"/>
+            <w:tcBorders>
+              <w:top w:val="single" w:color="000000" w:sz="4"/>
+              <w:left w:val="single" w:color="000000" w:sz="4"/>
+              <w:bottom w:val="single" w:color="000000" w:sz="4"/>
+              <w:right w:val="single" w:color="000000" w:sz="4"/>
             </w:tcBorders>
             <w:tcMar>
               <w:top w:type="dxa" w:w="60"/>
@@ -3159,8 +1961,8 @@
             </w:pPr>
             <w:r>
               <w:rPr>
-                <w:sz w:val="19"/>
-                <w:szCs w:val="19"/>
+                <w:sz w:val="20"/>
+                <w:szCs w:val="20"/>
               </w:rPr>
               <w:t xml:space="preserve">var_smoothing ∈ {10⁻⁹; 10⁻⁶; 10⁻³; 0,01; 0,1; 1}</w:t>
             </w:r>
@@ -3175,10 +1977,10 @@
           <w:tcPr>
             <w:tcW w:type="dxa" w:w="2121"/>
             <w:tcBorders>
-              <w:top w:val="single" w:color="808080" w:sz="4"/>
-              <w:left w:val="single" w:color="808080" w:sz="4"/>
-              <w:bottom w:val="single" w:color="808080" w:sz="4"/>
-              <w:right w:val="single" w:color="808080" w:sz="4"/>
+              <w:top w:val="single" w:color="000000" w:sz="4"/>
+              <w:left w:val="single" w:color="000000" w:sz="4"/>
+              <w:bottom w:val="single" w:color="000000" w:sz="4"/>
+              <w:right w:val="single" w:color="000000" w:sz="4"/>
             </w:tcBorders>
             <w:tcMar>
               <w:top w:type="dxa" w:w="60"/>
@@ -3196,8 +1998,8 @@
             </w:pPr>
             <w:r>
               <w:rPr>
-                <w:sz w:val="19"/>
-                <w:szCs w:val="19"/>
+                <w:sz w:val="20"/>
+                <w:szCs w:val="20"/>
               </w:rPr>
               <w:t xml:space="preserve">KNN [19]</w:t>
             </w:r>
@@ -3205,12 +2007,12 @@
         </w:tc>
         <w:tc>
           <w:tcPr>
-            <w:tcW w:type="dxa" w:w="3535"/>
-            <w:tcBorders>
-              <w:top w:val="single" w:color="808080" w:sz="4"/>
-              <w:left w:val="single" w:color="808080" w:sz="4"/>
-              <w:bottom w:val="single" w:color="808080" w:sz="4"/>
-              <w:right w:val="single" w:color="808080" w:sz="4"/>
+            <w:tcW w:type="dxa" w:w="3712"/>
+            <w:tcBorders>
+              <w:top w:val="single" w:color="000000" w:sz="4"/>
+              <w:left w:val="single" w:color="000000" w:sz="4"/>
+              <w:bottom w:val="single" w:color="000000" w:sz="4"/>
+              <w:right w:val="single" w:color="000000" w:sz="4"/>
             </w:tcBorders>
             <w:tcMar>
               <w:top w:type="dxa" w:w="60"/>
@@ -3228,21 +2030,21 @@
             </w:pPr>
             <w:r>
               <w:rPr>
-                <w:sz w:val="19"/>
-                <w:szCs w:val="19"/>
-              </w:rPr>
-              <w:t xml:space="preserve">mayoritas label k data latih terdekat; jarak Euclidean, fitur dinormalisasi</w:t>
-            </w:r>
-          </w:p>
-        </w:tc>
-        <w:tc>
-          <w:tcPr>
-            <w:tcW w:type="dxa" w:w="3182"/>
-            <w:tcBorders>
-              <w:top w:val="single" w:color="808080" w:sz="4"/>
-              <w:left w:val="single" w:color="808080" w:sz="4"/>
-              <w:bottom w:val="single" w:color="808080" w:sz="4"/>
-              <w:right w:val="single" w:color="808080" w:sz="4"/>
+                <w:sz w:val="20"/>
+                <w:szCs w:val="20"/>
+              </w:rPr>
+              <w:t xml:space="preserve">mengikuti label mayoritas dari k data latih terdekat</w:t>
+            </w:r>
+          </w:p>
+        </w:tc>
+        <w:tc>
+          <w:tcPr>
+            <w:tcW w:type="dxa" w:w="3005"/>
+            <w:tcBorders>
+              <w:top w:val="single" w:color="000000" w:sz="4"/>
+              <w:left w:val="single" w:color="000000" w:sz="4"/>
+              <w:bottom w:val="single" w:color="000000" w:sz="4"/>
+              <w:right w:val="single" w:color="000000" w:sz="4"/>
             </w:tcBorders>
             <w:tcMar>
               <w:top w:type="dxa" w:w="60"/>
@@ -3260,8 +2062,8 @@
             </w:pPr>
             <w:r>
               <w:rPr>
-                <w:sz w:val="19"/>
-                <w:szCs w:val="19"/>
+                <w:sz w:val="20"/>
+                <w:szCs w:val="20"/>
               </w:rPr>
               <w:t xml:space="preserve">k ∈ {101; 5; 15; 31; 51; 201}</w:t>
             </w:r>
@@ -3276,10 +2078,10 @@
           <w:tcPr>
             <w:tcW w:type="dxa" w:w="2121"/>
             <w:tcBorders>
-              <w:top w:val="single" w:color="808080" w:sz="4"/>
-              <w:left w:val="single" w:color="808080" w:sz="4"/>
-              <w:bottom w:val="single" w:color="808080" w:sz="4"/>
-              <w:right w:val="single" w:color="808080" w:sz="4"/>
+              <w:top w:val="single" w:color="000000" w:sz="4"/>
+              <w:left w:val="single" w:color="000000" w:sz="4"/>
+              <w:bottom w:val="single" w:color="000000" w:sz="4"/>
+              <w:right w:val="single" w:color="000000" w:sz="4"/>
             </w:tcBorders>
             <w:tcMar>
               <w:top w:type="dxa" w:w="60"/>
@@ -3297,8 +2099,8 @@
             </w:pPr>
             <w:r>
               <w:rPr>
-                <w:sz w:val="19"/>
-                <w:szCs w:val="19"/>
+                <w:sz w:val="20"/>
+                <w:szCs w:val="20"/>
               </w:rPr>
               <w:t xml:space="preserve">Logistic Regression [20]</w:t>
             </w:r>
@@ -3306,12 +2108,12 @@
         </w:tc>
         <w:tc>
           <w:tcPr>
-            <w:tcW w:type="dxa" w:w="3535"/>
-            <w:tcBorders>
-              <w:top w:val="single" w:color="808080" w:sz="4"/>
-              <w:left w:val="single" w:color="808080" w:sz="4"/>
-              <w:bottom w:val="single" w:color="808080" w:sz="4"/>
-              <w:right w:val="single" w:color="808080" w:sz="4"/>
+            <w:tcW w:type="dxa" w:w="3712"/>
+            <w:tcBorders>
+              <w:top w:val="single" w:color="000000" w:sz="4"/>
+              <w:left w:val="single" w:color="000000" w:sz="4"/>
+              <w:bottom w:val="single" w:color="000000" w:sz="4"/>
+              <w:right w:val="single" w:color="000000" w:sz="4"/>
             </w:tcBorders>
             <w:tcMar>
               <w:top w:type="dxa" w:w="60"/>
@@ -3329,21 +2131,21 @@
             </w:pPr>
             <w:r>
               <w:rPr>
-                <w:sz w:val="19"/>
-                <w:szCs w:val="19"/>
-              </w:rPr>
-              <w:t xml:space="preserve">fungsi sigmoid dari kombinasi linear fitur; fitur dinormalisasi</w:t>
-            </w:r>
-          </w:p>
-        </w:tc>
-        <w:tc>
-          <w:tcPr>
-            <w:tcW w:type="dxa" w:w="3182"/>
-            <w:tcBorders>
-              <w:top w:val="single" w:color="808080" w:sz="4"/>
-              <w:left w:val="single" w:color="808080" w:sz="4"/>
-              <w:bottom w:val="single" w:color="808080" w:sz="4"/>
-              <w:right w:val="single" w:color="808080" w:sz="4"/>
+                <w:sz w:val="20"/>
+                <w:szCs w:val="20"/>
+              </w:rPr>
+              <w:t xml:space="preserve">fungsi sigmoid dari kombinasi linear fitur</w:t>
+            </w:r>
+          </w:p>
+        </w:tc>
+        <w:tc>
+          <w:tcPr>
+            <w:tcW w:type="dxa" w:w="3005"/>
+            <w:tcBorders>
+              <w:top w:val="single" w:color="000000" w:sz="4"/>
+              <w:left w:val="single" w:color="000000" w:sz="4"/>
+              <w:bottom w:val="single" w:color="000000" w:sz="4"/>
+              <w:right w:val="single" w:color="000000" w:sz="4"/>
             </w:tcBorders>
             <w:tcMar>
               <w:top w:type="dxa" w:w="60"/>
@@ -3361,8 +2163,8 @@
             </w:pPr>
             <w:r>
               <w:rPr>
-                <w:sz w:val="19"/>
-                <w:szCs w:val="19"/>
+                <w:sz w:val="20"/>
+                <w:szCs w:val="20"/>
               </w:rPr>
               <w:t xml:space="preserve">C ∈ {1; 0,01; 0,1; 10}</w:t>
             </w:r>
@@ -3377,10 +2179,10 @@
           <w:tcPr>
             <w:tcW w:type="dxa" w:w="2121"/>
             <w:tcBorders>
-              <w:top w:val="single" w:color="808080" w:sz="4"/>
-              <w:left w:val="single" w:color="808080" w:sz="4"/>
-              <w:bottom w:val="single" w:color="808080" w:sz="4"/>
-              <w:right w:val="single" w:color="808080" w:sz="4"/>
+              <w:top w:val="single" w:color="000000" w:sz="4"/>
+              <w:left w:val="single" w:color="000000" w:sz="4"/>
+              <w:bottom w:val="single" w:color="000000" w:sz="4"/>
+              <w:right w:val="single" w:color="000000" w:sz="4"/>
             </w:tcBorders>
             <w:tcMar>
               <w:top w:type="dxa" w:w="60"/>
@@ -3398,8 +2200,8 @@
             </w:pPr>
             <w:r>
               <w:rPr>
-                <w:sz w:val="19"/>
-                <w:szCs w:val="19"/>
+                <w:sz w:val="20"/>
+                <w:szCs w:val="20"/>
               </w:rPr>
               <w:t xml:space="preserve">Decision Tree [21]</w:t>
             </w:r>
@@ -3407,12 +2209,12 @@
         </w:tc>
         <w:tc>
           <w:tcPr>
-            <w:tcW w:type="dxa" w:w="3535"/>
-            <w:tcBorders>
-              <w:top w:val="single" w:color="808080" w:sz="4"/>
-              <w:left w:val="single" w:color="808080" w:sz="4"/>
-              <w:bottom w:val="single" w:color="808080" w:sz="4"/>
-              <w:right w:val="single" w:color="808080" w:sz="4"/>
+            <w:tcW w:type="dxa" w:w="3712"/>
+            <w:tcBorders>
+              <w:top w:val="single" w:color="000000" w:sz="4"/>
+              <w:left w:val="single" w:color="000000" w:sz="4"/>
+              <w:bottom w:val="single" w:color="000000" w:sz="4"/>
+              <w:right w:val="single" w:color="000000" w:sz="4"/>
             </w:tcBorders>
             <w:tcMar>
               <w:top w:type="dxa" w:w="60"/>
@@ -3430,21 +2232,21 @@
             </w:pPr>
             <w:r>
               <w:rPr>
-                <w:sz w:val="19"/>
-                <w:szCs w:val="19"/>
-              </w:rPr>
-              <w:t xml:space="preserve">aturan jika–maka hasil pembagian data (indeks Gini)</w:t>
-            </w:r>
-          </w:p>
-        </w:tc>
-        <w:tc>
-          <w:tcPr>
-            <w:tcW w:type="dxa" w:w="3182"/>
-            <w:tcBorders>
-              <w:top w:val="single" w:color="808080" w:sz="4"/>
-              <w:left w:val="single" w:color="808080" w:sz="4"/>
-              <w:bottom w:val="single" w:color="808080" w:sz="4"/>
-              <w:right w:val="single" w:color="808080" w:sz="4"/>
+                <w:sz w:val="20"/>
+                <w:szCs w:val="20"/>
+              </w:rPr>
+              <w:t xml:space="preserve">aturan jika-maka dari hasil pembagian data</w:t>
+            </w:r>
+          </w:p>
+        </w:tc>
+        <w:tc>
+          <w:tcPr>
+            <w:tcW w:type="dxa" w:w="3005"/>
+            <w:tcBorders>
+              <w:top w:val="single" w:color="000000" w:sz="4"/>
+              <w:left w:val="single" w:color="000000" w:sz="4"/>
+              <w:bottom w:val="single" w:color="000000" w:sz="4"/>
+              <w:right w:val="single" w:color="000000" w:sz="4"/>
             </w:tcBorders>
             <w:tcMar>
               <w:top w:type="dxa" w:w="60"/>
@@ -3462,8 +2264,8 @@
             </w:pPr>
             <w:r>
               <w:rPr>
-                <w:sz w:val="19"/>
-                <w:szCs w:val="19"/>
+                <w:sz w:val="20"/>
+                <w:szCs w:val="20"/>
               </w:rPr>
               <w:t xml:space="preserve">max_depth ∈ {6; 3; 4; 8}; min_samples_leaf ∈ {50; 20; 100}</w:t>
             </w:r>
@@ -3478,10 +2280,10 @@
           <w:tcPr>
             <w:tcW w:type="dxa" w:w="2121"/>
             <w:tcBorders>
-              <w:top w:val="single" w:color="808080" w:sz="4"/>
-              <w:left w:val="single" w:color="808080" w:sz="4"/>
-              <w:bottom w:val="single" w:color="808080" w:sz="4"/>
-              <w:right w:val="single" w:color="808080" w:sz="4"/>
+              <w:top w:val="single" w:color="000000" w:sz="4"/>
+              <w:left w:val="single" w:color="000000" w:sz="4"/>
+              <w:bottom w:val="single" w:color="000000" w:sz="4"/>
+              <w:right w:val="single" w:color="000000" w:sz="4"/>
             </w:tcBorders>
             <w:tcMar>
               <w:top w:type="dxa" w:w="60"/>
@@ -3499,8 +2301,8 @@
             </w:pPr>
             <w:r>
               <w:rPr>
-                <w:sz w:val="19"/>
-                <w:szCs w:val="19"/>
+                <w:sz w:val="20"/>
+                <w:szCs w:val="20"/>
               </w:rPr>
               <w:t xml:space="preserve">Random Forest [22]</w:t>
             </w:r>
@@ -3508,12 +2310,12 @@
         </w:tc>
         <w:tc>
           <w:tcPr>
-            <w:tcW w:type="dxa" w:w="3535"/>
-            <w:tcBorders>
-              <w:top w:val="single" w:color="808080" w:sz="4"/>
-              <w:left w:val="single" w:color="808080" w:sz="4"/>
-              <w:bottom w:val="single" w:color="808080" w:sz="4"/>
-              <w:right w:val="single" w:color="808080" w:sz="4"/>
+            <w:tcW w:type="dxa" w:w="3712"/>
+            <w:tcBorders>
+              <w:top w:val="single" w:color="000000" w:sz="4"/>
+              <w:left w:val="single" w:color="000000" w:sz="4"/>
+              <w:bottom w:val="single" w:color="000000" w:sz="4"/>
+              <w:right w:val="single" w:color="000000" w:sz="4"/>
             </w:tcBorders>
             <w:tcMar>
               <w:top w:type="dxa" w:w="60"/>
@@ -3531,37 +2333,21 @@
             </w:pPr>
             <w:r>
               <w:rPr>
-                <w:sz w:val="19"/>
-                <w:szCs w:val="19"/>
-              </w:rPr>
-              <w:t xml:space="preserve">gabungan 150 pohon dari sampel acak (</w:t>
-            </w:r>
-            <w:r>
-              <w:rPr>
-                <w:i/>
-                <w:iCs/>
-                <w:sz w:val="19"/>
-                <w:szCs w:val="19"/>
-              </w:rPr>
-              <w:t xml:space="preserve">bagging</w:t>
-            </w:r>
-            <w:r>
-              <w:rPr>
-                <w:sz w:val="19"/>
-                <w:szCs w:val="19"/>
-              </w:rPr>
-              <w:t xml:space="preserve">)</w:t>
-            </w:r>
-          </w:p>
-        </w:tc>
-        <w:tc>
-          <w:tcPr>
-            <w:tcW w:type="dxa" w:w="3182"/>
-            <w:tcBorders>
-              <w:top w:val="single" w:color="808080" w:sz="4"/>
-              <w:left w:val="single" w:color="808080" w:sz="4"/>
-              <w:bottom w:val="single" w:color="808080" w:sz="4"/>
-              <w:right w:val="single" w:color="808080" w:sz="4"/>
+                <w:sz w:val="20"/>
+                <w:szCs w:val="20"/>
+              </w:rPr>
+              <w:t xml:space="preserve">gabungan 150 pohon keputusan dari sampel acak</w:t>
+            </w:r>
+          </w:p>
+        </w:tc>
+        <w:tc>
+          <w:tcPr>
+            <w:tcW w:type="dxa" w:w="3005"/>
+            <w:tcBorders>
+              <w:top w:val="single" w:color="000000" w:sz="4"/>
+              <w:left w:val="single" w:color="000000" w:sz="4"/>
+              <w:bottom w:val="single" w:color="000000" w:sz="4"/>
+              <w:right w:val="single" w:color="000000" w:sz="4"/>
             </w:tcBorders>
             <w:tcMar>
               <w:top w:type="dxa" w:w="60"/>
@@ -3579,8 +2365,8 @@
             </w:pPr>
             <w:r>
               <w:rPr>
-                <w:sz w:val="19"/>
-                <w:szCs w:val="19"/>
+                <w:sz w:val="20"/>
+                <w:szCs w:val="20"/>
               </w:rPr>
               <w:t xml:space="preserve">max_depth ∈ {8; 6; 12}; min_samples_leaf ∈ {20; 10; 50}</w:t>
             </w:r>
@@ -3595,10 +2381,10 @@
           <w:tcPr>
             <w:tcW w:type="dxa" w:w="2121"/>
             <w:tcBorders>
-              <w:top w:val="single" w:color="808080" w:sz="4"/>
-              <w:left w:val="single" w:color="808080" w:sz="4"/>
-              <w:bottom w:val="single" w:color="808080" w:sz="4"/>
-              <w:right w:val="single" w:color="808080" w:sz="4"/>
+              <w:top w:val="single" w:color="000000" w:sz="4"/>
+              <w:left w:val="single" w:color="000000" w:sz="4"/>
+              <w:bottom w:val="single" w:color="000000" w:sz="4"/>
+              <w:right w:val="single" w:color="000000" w:sz="4"/>
             </w:tcBorders>
             <w:tcMar>
               <w:top w:type="dxa" w:w="60"/>
@@ -3616,8 +2402,8 @@
             </w:pPr>
             <w:r>
               <w:rPr>
-                <w:sz w:val="19"/>
-                <w:szCs w:val="19"/>
+                <w:sz w:val="20"/>
+                <w:szCs w:val="20"/>
               </w:rPr>
               <w:t xml:space="preserve">XGBoost [23]</w:t>
             </w:r>
@@ -3625,12 +2411,12 @@
         </w:tc>
         <w:tc>
           <w:tcPr>
-            <w:tcW w:type="dxa" w:w="3535"/>
-            <w:tcBorders>
-              <w:top w:val="single" w:color="808080" w:sz="4"/>
-              <w:left w:val="single" w:color="808080" w:sz="4"/>
-              <w:bottom w:val="single" w:color="808080" w:sz="4"/>
-              <w:right w:val="single" w:color="808080" w:sz="4"/>
+            <w:tcW w:type="dxa" w:w="3712"/>
+            <w:tcBorders>
+              <w:top w:val="single" w:color="000000" w:sz="4"/>
+              <w:left w:val="single" w:color="000000" w:sz="4"/>
+              <w:bottom w:val="single" w:color="000000" w:sz="4"/>
+              <w:right w:val="single" w:color="000000" w:sz="4"/>
             </w:tcBorders>
             <w:tcMar>
               <w:top w:type="dxa" w:w="60"/>
@@ -3648,37 +2434,21 @@
             </w:pPr>
             <w:r>
               <w:rPr>
-                <w:sz w:val="19"/>
-                <w:szCs w:val="19"/>
-              </w:rPr>
-              <w:t xml:space="preserve">300 pohon berurutan yang saling memperbaiki (</w:t>
-            </w:r>
-            <w:r>
-              <w:rPr>
-                <w:i/>
-                <w:iCs/>
-                <w:sz w:val="19"/>
-                <w:szCs w:val="19"/>
-              </w:rPr>
-              <w:t xml:space="preserve">gradient boosting</w:t>
-            </w:r>
-            <w:r>
-              <w:rPr>
-                <w:sz w:val="19"/>
-                <w:szCs w:val="19"/>
-              </w:rPr>
-              <w:t xml:space="preserve">), subsample 0,8</w:t>
-            </w:r>
-          </w:p>
-        </w:tc>
-        <w:tc>
-          <w:tcPr>
-            <w:tcW w:type="dxa" w:w="3182"/>
-            <w:tcBorders>
-              <w:top w:val="single" w:color="808080" w:sz="4"/>
-              <w:left w:val="single" w:color="808080" w:sz="4"/>
-              <w:bottom w:val="single" w:color="808080" w:sz="4"/>
-              <w:right w:val="single" w:color="808080" w:sz="4"/>
+                <w:sz w:val="20"/>
+                <w:szCs w:val="20"/>
+              </w:rPr>
+              <w:t xml:space="preserve">gabungan 300 pohon yang dibangun berurutan untuk memperbaiki kesalahan pohon sebelumnya</w:t>
+            </w:r>
+          </w:p>
+        </w:tc>
+        <w:tc>
+          <w:tcPr>
+            <w:tcW w:type="dxa" w:w="3005"/>
+            <w:tcBorders>
+              <w:top w:val="single" w:color="000000" w:sz="4"/>
+              <w:left w:val="single" w:color="000000" w:sz="4"/>
+              <w:bottom w:val="single" w:color="000000" w:sz="4"/>
+              <w:right w:val="single" w:color="000000" w:sz="4"/>
             </w:tcBorders>
             <w:tcMar>
               <w:top w:type="dxa" w:w="60"/>
@@ -3696,8 +2466,8 @@
             </w:pPr>
             <w:r>
               <w:rPr>
-                <w:sz w:val="19"/>
-                <w:szCs w:val="19"/>
+                <w:sz w:val="20"/>
+                <w:szCs w:val="20"/>
               </w:rPr>
               <w:t xml:space="preserve">max_depth ∈ {4; 3; 6}; learning_rate ∈ {0,05; 0,1}</w:t>
             </w:r>
@@ -3712,10 +2482,10 @@
           <w:tcPr>
             <w:tcW w:type="dxa" w:w="2121"/>
             <w:tcBorders>
-              <w:top w:val="single" w:color="808080" w:sz="4"/>
-              <w:left w:val="single" w:color="808080" w:sz="4"/>
-              <w:bottom w:val="single" w:color="808080" w:sz="4"/>
-              <w:right w:val="single" w:color="808080" w:sz="4"/>
+              <w:top w:val="single" w:color="000000" w:sz="4"/>
+              <w:left w:val="single" w:color="000000" w:sz="4"/>
+              <w:bottom w:val="single" w:color="000000" w:sz="4"/>
+              <w:right w:val="single" w:color="000000" w:sz="4"/>
             </w:tcBorders>
             <w:tcMar>
               <w:top w:type="dxa" w:w="60"/>
@@ -3733,21 +2503,21 @@
             </w:pPr>
             <w:r>
               <w:rPr>
-                <w:sz w:val="19"/>
-                <w:szCs w:val="19"/>
-              </w:rPr>
-              <w:t xml:space="preserve">Pembanding: Baseline</w:t>
-            </w:r>
-          </w:p>
-        </w:tc>
-        <w:tc>
-          <w:tcPr>
-            <w:tcW w:type="dxa" w:w="3535"/>
-            <w:tcBorders>
-              <w:top w:val="single" w:color="808080" w:sz="4"/>
-              <w:left w:val="single" w:color="808080" w:sz="4"/>
-              <w:bottom w:val="single" w:color="808080" w:sz="4"/>
-              <w:right w:val="single" w:color="808080" w:sz="4"/>
+                <w:sz w:val="20"/>
+                <w:szCs w:val="20"/>
+              </w:rPr>
+              <w:t xml:space="preserve">Baseline (pembanding)</w:t>
+            </w:r>
+          </w:p>
+        </w:tc>
+        <w:tc>
+          <w:tcPr>
+            <w:tcW w:type="dxa" w:w="3712"/>
+            <w:tcBorders>
+              <w:top w:val="single" w:color="000000" w:sz="4"/>
+              <w:left w:val="single" w:color="000000" w:sz="4"/>
+              <w:bottom w:val="single" w:color="000000" w:sz="4"/>
+              <w:right w:val="single" w:color="000000" w:sz="4"/>
             </w:tcBorders>
             <w:tcMar>
               <w:top w:type="dxa" w:w="60"/>
@@ -3765,8 +2535,8 @@
             </w:pPr>
             <w:r>
               <w:rPr>
-                <w:sz w:val="19"/>
-                <w:szCs w:val="19"/>
+                <w:sz w:val="20"/>
+                <w:szCs w:val="20"/>
               </w:rPr>
               <w:t xml:space="preserve">selalu menebak "tidak dapat S-Rank"</w:t>
             </w:r>
@@ -3774,12 +2544,12 @@
         </w:tc>
         <w:tc>
           <w:tcPr>
-            <w:tcW w:type="dxa" w:w="3182"/>
-            <w:tcBorders>
-              <w:top w:val="single" w:color="808080" w:sz="4"/>
-              <w:left w:val="single" w:color="808080" w:sz="4"/>
-              <w:bottom w:val="single" w:color="808080" w:sz="4"/>
-              <w:right w:val="single" w:color="808080" w:sz="4"/>
+            <w:tcW w:type="dxa" w:w="3005"/>
+            <w:tcBorders>
+              <w:top w:val="single" w:color="000000" w:sz="4"/>
+              <w:left w:val="single" w:color="000000" w:sz="4"/>
+              <w:bottom w:val="single" w:color="000000" w:sz="4"/>
+              <w:right w:val="single" w:color="000000" w:sz="4"/>
             </w:tcBorders>
             <w:tcMar>
               <w:top w:type="dxa" w:w="60"/>
@@ -3797,10 +2567,10 @@
             </w:pPr>
             <w:r>
               <w:rPr>
-                <w:sz w:val="19"/>
-                <w:szCs w:val="19"/>
-              </w:rPr>
-              <w:t xml:space="preserve">–</w:t>
+                <w:sz w:val="20"/>
+                <w:szCs w:val="20"/>
+              </w:rPr>
+              <w:t xml:space="preserve">-</w:t>
             </w:r>
           </w:p>
         </w:tc>
@@ -3813,10 +2583,10 @@
           <w:tcPr>
             <w:tcW w:type="dxa" w:w="2121"/>
             <w:tcBorders>
-              <w:top w:val="single" w:color="808080" w:sz="4"/>
-              <w:left w:val="single" w:color="808080" w:sz="4"/>
-              <w:bottom w:val="single" w:color="808080" w:sz="4"/>
-              <w:right w:val="single" w:color="808080" w:sz="4"/>
+              <w:top w:val="single" w:color="000000" w:sz="4"/>
+              <w:left w:val="single" w:color="000000" w:sz="4"/>
+              <w:bottom w:val="single" w:color="000000" w:sz="4"/>
+              <w:right w:val="single" w:color="000000" w:sz="4"/>
             </w:tcBorders>
             <w:tcMar>
               <w:top w:type="dxa" w:w="60"/>
@@ -3834,21 +2604,21 @@
             </w:pPr>
             <w:r>
               <w:rPr>
-                <w:sz w:val="19"/>
-                <w:szCs w:val="19"/>
-              </w:rPr>
-              <w:t xml:space="preserve">Pembanding: Markov Chain</w:t>
-            </w:r>
-          </w:p>
-        </w:tc>
-        <w:tc>
-          <w:tcPr>
-            <w:tcW w:type="dxa" w:w="3535"/>
-            <w:tcBorders>
-              <w:top w:val="single" w:color="808080" w:sz="4"/>
-              <w:left w:val="single" w:color="808080" w:sz="4"/>
-              <w:bottom w:val="single" w:color="808080" w:sz="4"/>
-              <w:right w:val="single" w:color="808080" w:sz="4"/>
+                <w:sz w:val="20"/>
+                <w:szCs w:val="20"/>
+              </w:rPr>
+              <w:t xml:space="preserve">Markov Chain (pembanding)</w:t>
+            </w:r>
+          </w:p>
+        </w:tc>
+        <w:tc>
+          <w:tcPr>
+            <w:tcW w:type="dxa" w:w="3712"/>
+            <w:tcBorders>
+              <w:top w:val="single" w:color="000000" w:sz="4"/>
+              <w:left w:val="single" w:color="000000" w:sz="4"/>
+              <w:bottom w:val="single" w:color="000000" w:sz="4"/>
+              <w:right w:val="single" w:color="000000" w:sz="4"/>
             </w:tcBorders>
             <w:tcMar>
               <w:top w:type="dxa" w:w="60"/>
@@ -3866,21 +2636,21 @@
             </w:pPr>
             <w:r>
               <w:rPr>
-                <w:sz w:val="19"/>
-                <w:szCs w:val="19"/>
-              </w:rPr>
-              <w:t xml:space="preserve">peluang teoretis dari model hazard di atas</w:t>
-            </w:r>
-          </w:p>
-        </w:tc>
-        <w:tc>
-          <w:tcPr>
-            <w:tcW w:type="dxa" w:w="3182"/>
-            <w:tcBorders>
-              <w:top w:val="single" w:color="808080" w:sz="4"/>
-              <w:left w:val="single" w:color="808080" w:sz="4"/>
-              <w:bottom w:val="single" w:color="808080" w:sz="4"/>
-              <w:right w:val="single" w:color="808080" w:sz="4"/>
+                <w:sz w:val="20"/>
+                <w:szCs w:val="20"/>
+              </w:rPr>
+              <w:t xml:space="preserve">peluang teori dari rumus hazard</w:t>
+            </w:r>
+          </w:p>
+        </w:tc>
+        <w:tc>
+          <w:tcPr>
+            <w:tcW w:type="dxa" w:w="3005"/>
+            <w:tcBorders>
+              <w:top w:val="single" w:color="000000" w:sz="4"/>
+              <w:left w:val="single" w:color="000000" w:sz="4"/>
+              <w:bottom w:val="single" w:color="000000" w:sz="4"/>
+              <w:right w:val="single" w:color="000000" w:sz="4"/>
             </w:tcBorders>
             <w:tcMar>
               <w:top w:type="dxa" w:w="60"/>
@@ -3898,10 +2668,10 @@
             </w:pPr>
             <w:r>
               <w:rPr>
-                <w:sz w:val="19"/>
-                <w:szCs w:val="19"/>
-              </w:rPr>
-              <w:t xml:space="preserve">–</w:t>
+                <w:sz w:val="20"/>
+                <w:szCs w:val="20"/>
+              </w:rPr>
+              <w:t xml:space="preserve">-</w:t>
             </w:r>
           </w:p>
         </w:tc>
@@ -3919,7 +2689,7 @@
         <w:jc w:val="both"/>
       </w:pPr>
       <w:r>
-        <w:t xml:space="preserve">Evaluasi memakai </w:t>
+        <w:t xml:space="preserve">Model dievaluasi menggunakan </w:t>
       </w:r>
       <w:r>
         <w:rPr>
@@ -3929,27 +2699,27 @@
         <w:t xml:space="preserve">confusion matrix</w:t>
       </w:r>
       <w:r>
-        <w:t xml:space="preserve"> dengan metrik Accuracy, Balanced Accuracy, Precision, Recall, F1-score, ROC-AUC, Log Loss, dan Brier Score. Accuracy dipakai sebagai metrik utama, sedangkan metrik lain dipakai sebagai pendamping karena data tidak seimbang. Jika data terbatas, hyperparameter dipilih dengan </w:t>
+        <w:t xml:space="preserve"> dengan metrik Accuracy, Balanced Accuracy, Precision, Recall, F1-score, ROC-AUC, Log Loss, dan Brier Score. Accuracy digunakan sebagai metrik utama, sedangkan metrik lainnya digunakan sebagai pendamping karena data tidak seimbang. Untuk data asli yang jumlahnya terbatas, </w:t>
       </w:r>
       <w:r>
         <w:rPr>
           <w:i/>
           <w:iCs/>
         </w:rPr>
-        <w:t xml:space="preserve">nested cross-validation</w:t>
-      </w:r>
-      <w:r>
-        <w:t xml:space="preserve">, yaitu </w:t>
+        <w:t xml:space="preserve">grid search</w:t>
+      </w:r>
+      <w:r>
+        <w:t xml:space="preserve"> hanya dijalankan di dalam data latih pada setiap fold (</w:t>
       </w:r>
       <w:r>
         <w:rPr>
           <w:i/>
           <w:iCs/>
         </w:rPr>
-        <w:t xml:space="preserve">grid search</w:t>
-      </w:r>
-      <w:r>
-        <w:t xml:space="preserve"> dijalankan hanya di dalam data latih setiap fold [24]. Selisih akurasi dua algoritma pada k fold diuji dengan uji t berpasangan terkoreksi [14]:</w:t>
+        <w:t xml:space="preserve">nested cross-validation</w:t>
+      </w:r>
+      <w:r>
+        <w:t xml:space="preserve">) agar data uji tidak ikut memengaruhi pemilihan hyperparameter [24]. Perbedaan akurasi antara dua algoritma diuji menggunakan uji t berpasangan terkoreksi [14] dengan rumus berikut.</w:t>
       </w:r>
     </w:p>
     <w:p>
@@ -3962,16 +2732,17 @@
           <w:i/>
           <w:iCs/>
         </w:rPr>
-        <w:t xml:space="preserve">t = d̄ / √( (1/k + n_uji / n_latih) · s²_d )</w:t>
+        <w:t xml:space="preserve">t = d̄ / √((1/k + n_uji / n_latih) × s²)</w:t>
       </w:r>
     </w:p>
     <w:p>
       <w:pPr>
         <w:spacing w:after="0" w:line="276"/>
+        <w:ind w:firstLine="720"/>
         <w:jc w:val="both"/>
       </w:pPr>
       <w:r>
-        <w:t xml:space="preserve">dengan d̄ dan s²_d adalah rata-rata dan varians selisih akurasi pada setiap fold, sedangkan n_uji/n_latih adalah perbandingan ukuran data uji dan data latih. Nilai t dibandingkan dengan distribusi t berderajat bebas k − 1, dan selisih dinyatakan signifikan jika p-value kurang dari 0,05. Uji ini dipakai karena uji t biasa terlalu mudah menyatakan dua model berbeda ketika data latih antarfold saling tumpang tindih.</w:t>
+        <w:t xml:space="preserve">Keterangan: d̄ adalah rata-rata selisih akurasi, s² adalah varians selisih akurasi, k adalah jumlah fold, sedangkan n_uji dan n_latih adalah jumlah data uji dan data latih. Perbedaan dinyatakan signifikan jika nilai p kurang dari 0,05. Uji ini digunakan karena data latih pada setiap fold saling tumpang tindih, sehingga uji t biasa akan terlalu mudah menyatakan bahwa dua model berbeda.</w:t>
       </w:r>
     </w:p>
     <w:p>
@@ -3991,7 +2762,7 @@
         <w:jc w:val="both"/>
       </w:pPr>
       <w:r>
-        <w:t xml:space="preserve">Penelitian ini memakai dua jenis data, yaitu riwayat gacha asli pemain dan data simulasi, seperti pada Tabel 2.3.</w:t>
+        <w:t xml:space="preserve">Penelitian ini menggunakan dua jenis data, yaitu data riwayat gacha asli dan data simulasi. Keterangan setiap data dapat dilihat pada Tabel 2.2.</w:t>
       </w:r>
     </w:p>
     <w:p>
@@ -4006,7 +2777,7 @@
           <w:b/>
           <w:bCs/>
         </w:rPr>
-        <w:t xml:space="preserve">Tabel 2.3</w:t>
+        <w:t xml:space="preserve">Tabel 2.2</w:t>
       </w:r>
       <w:r>
         <w:t xml:space="preserve"> Sumber data penelitian</w:t>
@@ -4026,8 +2797,8 @@
       </w:tblPr>
       <w:tblGrid>
         <w:gridCol w:w="1944"/>
-        <w:gridCol w:w="4242"/>
-        <w:gridCol w:w="2652"/>
+        <w:gridCol w:w="4065"/>
+        <w:gridCol w:w="2829"/>
       </w:tblGrid>
       <w:tr>
         <w:trPr>
@@ -4038,12 +2809,11 @@
           <w:tcPr>
             <w:tcW w:type="dxa" w:w="1944"/>
             <w:tcBorders>
-              <w:top w:val="single" w:color="808080" w:sz="4"/>
-              <w:left w:val="single" w:color="808080" w:sz="4"/>
-              <w:bottom w:val="single" w:color="808080" w:sz="4"/>
-              <w:right w:val="single" w:color="808080" w:sz="4"/>
-            </w:tcBorders>
-            <w:shd w:fill="D9E2F3" w:color="auto" w:val="clear"/>
+              <w:top w:val="single" w:color="000000" w:sz="4"/>
+              <w:left w:val="single" w:color="000000" w:sz="4"/>
+              <w:bottom w:val="single" w:color="000000" w:sz="4"/>
+              <w:right w:val="single" w:color="000000" w:sz="4"/>
+            </w:tcBorders>
             <w:tcMar>
               <w:top w:type="dxa" w:w="60"/>
               <w:left w:type="dxa" w:w="100"/>
@@ -4062,23 +2832,22 @@
               <w:rPr>
                 <w:b/>
                 <w:bCs/>
-                <w:sz w:val="19"/>
-                <w:szCs w:val="19"/>
-              </w:rPr>
-              <w:t xml:space="preserve">Sumber</w:t>
-            </w:r>
-          </w:p>
-        </w:tc>
-        <w:tc>
-          <w:tcPr>
-            <w:tcW w:type="dxa" w:w="4242"/>
-            <w:tcBorders>
-              <w:top w:val="single" w:color="808080" w:sz="4"/>
-              <w:left w:val="single" w:color="808080" w:sz="4"/>
-              <w:bottom w:val="single" w:color="808080" w:sz="4"/>
-              <w:right w:val="single" w:color="808080" w:sz="4"/>
-            </w:tcBorders>
-            <w:shd w:fill="D9E2F3" w:color="auto" w:val="clear"/>
+                <w:sz w:val="20"/>
+                <w:szCs w:val="20"/>
+              </w:rPr>
+              <w:t xml:space="preserve">Sumber data</w:t>
+            </w:r>
+          </w:p>
+        </w:tc>
+        <w:tc>
+          <w:tcPr>
+            <w:tcW w:type="dxa" w:w="4065"/>
+            <w:tcBorders>
+              <w:top w:val="single" w:color="000000" w:sz="4"/>
+              <w:left w:val="single" w:color="000000" w:sz="4"/>
+              <w:bottom w:val="single" w:color="000000" w:sz="4"/>
+              <w:right w:val="single" w:color="000000" w:sz="4"/>
+            </w:tcBorders>
             <w:tcMar>
               <w:top w:type="dxa" w:w="60"/>
               <w:left w:type="dxa" w:w="100"/>
@@ -4097,8 +2866,8 @@
               <w:rPr>
                 <w:b/>
                 <w:bCs/>
-                <w:sz w:val="19"/>
-                <w:szCs w:val="19"/>
+                <w:sz w:val="20"/>
+                <w:szCs w:val="20"/>
               </w:rPr>
               <w:t xml:space="preserve">Keterangan</w:t>
             </w:r>
@@ -4106,14 +2875,13 @@
         </w:tc>
         <w:tc>
           <w:tcPr>
-            <w:tcW w:type="dxa" w:w="2652"/>
-            <w:tcBorders>
-              <w:top w:val="single" w:color="808080" w:sz="4"/>
-              <w:left w:val="single" w:color="808080" w:sz="4"/>
-              <w:bottom w:val="single" w:color="808080" w:sz="4"/>
-              <w:right w:val="single" w:color="808080" w:sz="4"/>
-            </w:tcBorders>
-            <w:shd w:fill="D9E2F3" w:color="auto" w:val="clear"/>
+            <w:tcW w:type="dxa" w:w="2829"/>
+            <w:tcBorders>
+              <w:top w:val="single" w:color="000000" w:sz="4"/>
+              <w:left w:val="single" w:color="000000" w:sz="4"/>
+              <w:bottom w:val="single" w:color="000000" w:sz="4"/>
+              <w:right w:val="single" w:color="000000" w:sz="4"/>
+            </w:tcBorders>
             <w:tcMar>
               <w:top w:type="dxa" w:w="60"/>
               <w:left w:type="dxa" w:w="100"/>
@@ -4132,8 +2900,8 @@
               <w:rPr>
                 <w:b/>
                 <w:bCs/>
-                <w:sz w:val="19"/>
-                <w:szCs w:val="19"/>
+                <w:sz w:val="20"/>
+                <w:szCs w:val="20"/>
               </w:rPr>
               <w:t xml:space="preserve">Kegunaan</w:t>
             </w:r>
@@ -4148,10 +2916,10 @@
           <w:tcPr>
             <w:tcW w:type="dxa" w:w="1944"/>
             <w:tcBorders>
-              <w:top w:val="single" w:color="808080" w:sz="4"/>
-              <w:left w:val="single" w:color="808080" w:sz="4"/>
-              <w:bottom w:val="single" w:color="808080" w:sz="4"/>
-              <w:right w:val="single" w:color="808080" w:sz="4"/>
+              <w:top w:val="single" w:color="000000" w:sz="4"/>
+              <w:left w:val="single" w:color="000000" w:sz="4"/>
+              <w:bottom w:val="single" w:color="000000" w:sz="4"/>
+              <w:right w:val="single" w:color="000000" w:sz="4"/>
             </w:tcBorders>
             <w:tcMar>
               <w:top w:type="dxa" w:w="60"/>
@@ -4169,8 +2937,8 @@
             </w:pPr>
             <w:r>
               <w:rPr>
-                <w:sz w:val="19"/>
-                <w:szCs w:val="19"/>
+                <w:sz w:val="20"/>
+                <w:szCs w:val="20"/>
               </w:rPr>
               <w:t xml:space="preserve">Data asli pemain</w:t>
             </w:r>
@@ -4178,12 +2946,12 @@
         </w:tc>
         <w:tc>
           <w:tcPr>
-            <w:tcW w:type="dxa" w:w="4242"/>
-            <w:tcBorders>
-              <w:top w:val="single" w:color="808080" w:sz="4"/>
-              <w:left w:val="single" w:color="808080" w:sz="4"/>
-              <w:bottom w:val="single" w:color="808080" w:sz="4"/>
-              <w:right w:val="single" w:color="808080" w:sz="4"/>
+            <w:tcW w:type="dxa" w:w="4065"/>
+            <w:tcBorders>
+              <w:top w:val="single" w:color="000000" w:sz="4"/>
+              <w:left w:val="single" w:color="000000" w:sz="4"/>
+              <w:bottom w:val="single" w:color="000000" w:sz="4"/>
+              <w:right w:val="single" w:color="000000" w:sz="4"/>
             </w:tcBorders>
             <w:tcMar>
               <w:top w:type="dxa" w:w="60"/>
@@ -4201,21 +2969,21 @@
             </w:pPr>
             <w:r>
               <w:rPr>
-                <w:sz w:val="19"/>
-                <w:szCs w:val="19"/>
-              </w:rPr>
-              <w:t xml:space="preserve">3 akun (anggota kelompok dan teman), 1.751 pull, 28 S-Rank; anonim tanpa UID, nama item, dan waktu</w:t>
-            </w:r>
-          </w:p>
-        </w:tc>
-        <w:tc>
-          <w:tcPr>
-            <w:tcW w:type="dxa" w:w="2652"/>
-            <w:tcBorders>
-              <w:top w:val="single" w:color="808080" w:sz="4"/>
-              <w:left w:val="single" w:color="808080" w:sz="4"/>
-              <w:bottom w:val="single" w:color="808080" w:sz="4"/>
-              <w:right w:val="single" w:color="808080" w:sz="4"/>
+                <w:sz w:val="20"/>
+                <w:szCs w:val="20"/>
+              </w:rPr>
+              <w:t xml:space="preserve">3 akun milik anggota kelompok dan teman, 1.751 pull, 28 S-Rank, tanpa UID, nama item, dan waktu</w:t>
+            </w:r>
+          </w:p>
+        </w:tc>
+        <w:tc>
+          <w:tcPr>
+            <w:tcW w:type="dxa" w:w="2829"/>
+            <w:tcBorders>
+              <w:top w:val="single" w:color="000000" w:sz="4"/>
+              <w:left w:val="single" w:color="000000" w:sz="4"/>
+              <w:bottom w:val="single" w:color="000000" w:sz="4"/>
+              <w:right w:val="single" w:color="000000" w:sz="4"/>
             </w:tcBorders>
             <w:tcMar>
               <w:top w:type="dxa" w:w="60"/>
@@ -4233,19 +3001,10 @@
             </w:pPr>
             <w:r>
               <w:rPr>
-                <w:sz w:val="19"/>
-                <w:szCs w:val="19"/>
-              </w:rPr>
-              <w:t xml:space="preserve">Uji model simulasi, eksperimen latih–uji dengan data asli saja, dan analisis </w:t>
-            </w:r>
-            <w:r>
-              <w:rPr>
-                <w:i/>
-                <w:iCs/>
-                <w:sz w:val="19"/>
-                <w:szCs w:val="19"/>
-              </w:rPr>
-              <w:t xml:space="preserve">soft pity</w:t>
+                <w:sz w:val="20"/>
+                <w:szCs w:val="20"/>
+              </w:rPr>
+              <w:t xml:space="preserve">pengujian model, eksperimen dengan data asli, dan analisis soft pity</w:t>
             </w:r>
           </w:p>
         </w:tc>
@@ -4258,10 +3017,10 @@
           <w:tcPr>
             <w:tcW w:type="dxa" w:w="1944"/>
             <w:tcBorders>
-              <w:top w:val="single" w:color="808080" w:sz="4"/>
-              <w:left w:val="single" w:color="808080" w:sz="4"/>
-              <w:bottom w:val="single" w:color="808080" w:sz="4"/>
-              <w:right w:val="single" w:color="808080" w:sz="4"/>
+              <w:top w:val="single" w:color="000000" w:sz="4"/>
+              <w:left w:val="single" w:color="000000" w:sz="4"/>
+              <w:bottom w:val="single" w:color="000000" w:sz="4"/>
+              <w:right w:val="single" w:color="000000" w:sz="4"/>
             </w:tcBorders>
             <w:tcMar>
               <w:top w:type="dxa" w:w="60"/>
@@ -4279,8 +3038,8 @@
             </w:pPr>
             <w:r>
               <w:rPr>
-                <w:sz w:val="19"/>
-                <w:szCs w:val="19"/>
+                <w:sz w:val="20"/>
+                <w:szCs w:val="20"/>
               </w:rPr>
               <w:t xml:space="preserve">Simulasi Monte Carlo</w:t>
             </w:r>
@@ -4288,12 +3047,12 @@
         </w:tc>
         <w:tc>
           <w:tcPr>
-            <w:tcW w:type="dxa" w:w="4242"/>
-            <w:tcBorders>
-              <w:top w:val="single" w:color="808080" w:sz="4"/>
-              <w:left w:val="single" w:color="808080" w:sz="4"/>
-              <w:bottom w:val="single" w:color="808080" w:sz="4"/>
-              <w:right w:val="single" w:color="808080" w:sz="4"/>
+            <w:tcW w:type="dxa" w:w="4065"/>
+            <w:tcBorders>
+              <w:top w:val="single" w:color="000000" w:sz="4"/>
+              <w:left w:val="single" w:color="000000" w:sz="4"/>
+              <w:bottom w:val="single" w:color="000000" w:sz="4"/>
+              <w:right w:val="single" w:color="000000" w:sz="4"/>
             </w:tcBorders>
             <w:tcMar>
               <w:top w:type="dxa" w:w="60"/>
@@ -4311,21 +3070,21 @@
             </w:pPr>
             <w:r>
               <w:rPr>
-                <w:sz w:val="19"/>
-                <w:szCs w:val="19"/>
-              </w:rPr>
-              <w:t xml:space="preserve">400 akun virtual, 80–700 pull per banner, dibangkitkan dari model hazard (seed 42); ±314 ribu pull</w:t>
-            </w:r>
-          </w:p>
-        </w:tc>
-        <w:tc>
-          <w:tcPr>
-            <w:tcW w:type="dxa" w:w="2652"/>
-            <w:tcBorders>
-              <w:top w:val="single" w:color="808080" w:sz="4"/>
-              <w:left w:val="single" w:color="808080" w:sz="4"/>
-              <w:bottom w:val="single" w:color="808080" w:sz="4"/>
-              <w:right w:val="single" w:color="808080" w:sz="4"/>
+                <w:sz w:val="20"/>
+                <w:szCs w:val="20"/>
+              </w:rPr>
+              <w:t xml:space="preserve">400 akun, 80-700 pull per banner, sekitar 314 ribu pull</w:t>
+            </w:r>
+          </w:p>
+        </w:tc>
+        <w:tc>
+          <w:tcPr>
+            <w:tcW w:type="dxa" w:w="2829"/>
+            <w:tcBorders>
+              <w:top w:val="single" w:color="000000" w:sz="4"/>
+              <w:left w:val="single" w:color="000000" w:sz="4"/>
+              <w:bottom w:val="single" w:color="000000" w:sz="4"/>
+              <w:right w:val="single" w:color="000000" w:sz="4"/>
             </w:tcBorders>
             <w:tcMar>
               <w:top w:type="dxa" w:w="60"/>
@@ -4343,10 +3102,10 @@
             </w:pPr>
             <w:r>
               <w:rPr>
-                <w:sz w:val="19"/>
-                <w:szCs w:val="19"/>
-              </w:rPr>
-              <w:t xml:space="preserve">Data latih dan uji utama</w:t>
+                <w:sz w:val="20"/>
+                <w:szCs w:val="20"/>
+              </w:rPr>
+              <w:t xml:space="preserve">data latih dan data uji utama</w:t>
             </w:r>
           </w:p>
         </w:tc>
@@ -4359,10 +3118,10 @@
           <w:tcPr>
             <w:tcW w:type="dxa" w:w="1944"/>
             <w:tcBorders>
-              <w:top w:val="single" w:color="808080" w:sz="4"/>
-              <w:left w:val="single" w:color="808080" w:sz="4"/>
-              <w:bottom w:val="single" w:color="808080" w:sz="4"/>
-              <w:right w:val="single" w:color="808080" w:sz="4"/>
+              <w:top w:val="single" w:color="000000" w:sz="4"/>
+              <w:left w:val="single" w:color="000000" w:sz="4"/>
+              <w:bottom w:val="single" w:color="000000" w:sz="4"/>
+              <w:right w:val="single" w:color="000000" w:sz="4"/>
             </w:tcBorders>
             <w:tcMar>
               <w:top w:type="dxa" w:w="60"/>
@@ -4380,21 +3139,21 @@
             </w:pPr>
             <w:r>
               <w:rPr>
-                <w:sz w:val="19"/>
-                <w:szCs w:val="19"/>
-              </w:rPr>
-              <w:t xml:space="preserve">Simulasi untuk grid search</w:t>
-            </w:r>
-          </w:p>
-        </w:tc>
-        <w:tc>
-          <w:tcPr>
-            <w:tcW w:type="dxa" w:w="4242"/>
-            <w:tcBorders>
-              <w:top w:val="single" w:color="808080" w:sz="4"/>
-              <w:left w:val="single" w:color="808080" w:sz="4"/>
-              <w:bottom w:val="single" w:color="808080" w:sz="4"/>
-              <w:right w:val="single" w:color="808080" w:sz="4"/>
+                <w:sz w:val="20"/>
+                <w:szCs w:val="20"/>
+              </w:rPr>
+              <w:t xml:space="preserve">Simulasi tambahan</w:t>
+            </w:r>
+          </w:p>
+        </w:tc>
+        <w:tc>
+          <w:tcPr>
+            <w:tcW w:type="dxa" w:w="4065"/>
+            <w:tcBorders>
+              <w:top w:val="single" w:color="000000" w:sz="4"/>
+              <w:left w:val="single" w:color="000000" w:sz="4"/>
+              <w:bottom w:val="single" w:color="000000" w:sz="4"/>
+              <w:right w:val="single" w:color="000000" w:sz="4"/>
             </w:tcBorders>
             <w:tcMar>
               <w:top w:type="dxa" w:w="60"/>
@@ -4412,21 +3171,21 @@
             </w:pPr>
             <w:r>
               <w:rPr>
-                <w:sz w:val="19"/>
-                <w:szCs w:val="19"/>
-              </w:rPr>
-              <w:t xml:space="preserve">100 akun virtual tambahan (seed 43); ±77 ribu baris</w:t>
-            </w:r>
-          </w:p>
-        </w:tc>
-        <w:tc>
-          <w:tcPr>
-            <w:tcW w:type="dxa" w:w="2652"/>
-            <w:tcBorders>
-              <w:top w:val="single" w:color="808080" w:sz="4"/>
-              <w:left w:val="single" w:color="808080" w:sz="4"/>
-              <w:bottom w:val="single" w:color="808080" w:sz="4"/>
-              <w:right w:val="single" w:color="808080" w:sz="4"/>
+                <w:sz w:val="20"/>
+                <w:szCs w:val="20"/>
+              </w:rPr>
+              <w:t xml:space="preserve">100 akun, sekitar 77 ribu baris</w:t>
+            </w:r>
+          </w:p>
+        </w:tc>
+        <w:tc>
+          <w:tcPr>
+            <w:tcW w:type="dxa" w:w="2829"/>
+            <w:tcBorders>
+              <w:top w:val="single" w:color="000000" w:sz="4"/>
+              <w:left w:val="single" w:color="000000" w:sz="4"/>
+              <w:bottom w:val="single" w:color="000000" w:sz="4"/>
+              <w:right w:val="single" w:color="000000" w:sz="4"/>
             </w:tcBorders>
             <w:tcMar>
               <w:top w:type="dxa" w:w="60"/>
@@ -4444,10 +3203,10 @@
             </w:pPr>
             <w:r>
               <w:rPr>
-                <w:sz w:val="19"/>
-                <w:szCs w:val="19"/>
-              </w:rPr>
-              <w:t xml:space="preserve">Pemilihan hyperparameter, tidak dipakai untuk evaluasi</w:t>
+                <w:sz w:val="20"/>
+                <w:szCs w:val="20"/>
+              </w:rPr>
+              <w:t xml:space="preserve">pemilihan hyperparameter (grid search)</w:t>
             </w:r>
           </w:p>
         </w:tc>
@@ -4465,7 +3224,7 @@
         <w:jc w:val="both"/>
       </w:pPr>
       <w:r>
-        <w:t xml:space="preserve">Simulasi dipakai karena riwayat satu akun hanya berisi ratusan pull dengan sedikit S-Rank. Namun, simulasi dibangkitkan dari model Markov yang memuat estimasi </w:t>
+        <w:t xml:space="preserve">Data simulasi digunakan karena riwayat dari satu akun hanya berisi ratusan pull dengan sedikit S-Rank. Namun, data simulasi dibuat dari model Markov yang sudah memuat perkiraan </w:t>
       </w:r>
       <w:r>
         <w:rPr>
@@ -4475,17 +3234,7 @@
         <w:t xml:space="preserve">soft pity</w:t>
       </w:r>
       <w:r>
-        <w:t xml:space="preserve">, sehingga model yang dilatih dengan simulasi pada dasarnya mempelajari ulang asumsi tersebut. Karena itu data asli berperan penting untuk menguji apakah hasilnya berlaku bagi pemain sungguhan dan untuk memeriksa pola </w:t>
-      </w:r>
-      <w:r>
-        <w:rPr>
-          <w:i/>
-          <w:iCs/>
-        </w:rPr>
-        <w:t xml:space="preserve">soft pity</w:t>
-      </w:r>
-      <w:r>
-        <w:t xml:space="preserve"> langsung dari data. Data asli juga dipakai pada eksperimen kedua, yaitu melatih dan menguji keenam algoritma hanya dengan data asli (1.425 baris tugas B), yang sudah memenuhi ketentuan dataset tabel minimal 500–1.000 baris. Fitur dan target yang dipakai ditunjukkan pada Tabel 2.4.</w:t>
+        <w:t xml:space="preserve">, sehingga model yang dilatih dengan data simulasi pada dasarnya hanya mempelajari ulang perkiraan tersebut. Oleh karena itu, data asli tetap penting untuk menguji apakah hasilnya juga berlaku pada pemain sungguhan. Data asli juga digunakan pada eksperimen kedua, yaitu melatih dan menguji keenam algoritma hanya dengan data asli sebanyak 1.425 baris, yang sudah memenuhi ketentuan dataset minimal 500-1.000 baris. Fitur dan target yang digunakan dapat dilihat pada Tabel 2.3.</w:t>
       </w:r>
     </w:p>
     <w:p>
@@ -4500,7 +3249,7 @@
           <w:b/>
           <w:bCs/>
         </w:rPr>
-        <w:t xml:space="preserve">Tabel 2.4</w:t>
+        <w:t xml:space="preserve">Tabel 2.3</w:t>
       </w:r>
       <w:r>
         <w:t xml:space="preserve"> Fitur dan target</w:t>
@@ -4519,8 +3268,8 @@
         </w:tblBorders>
       </w:tblPr>
       <w:tblGrid>
-        <w:gridCol w:w="2121"/>
-        <w:gridCol w:w="6717"/>
+        <w:gridCol w:w="2298"/>
+        <w:gridCol w:w="6540"/>
       </w:tblGrid>
       <w:tr>
         <w:trPr>
@@ -4529,14 +3278,13 @@
         </w:trPr>
         <w:tc>
           <w:tcPr>
-            <w:tcW w:type="dxa" w:w="2121"/>
-            <w:tcBorders>
-              <w:top w:val="single" w:color="808080" w:sz="4"/>
-              <w:left w:val="single" w:color="808080" w:sz="4"/>
-              <w:bottom w:val="single" w:color="808080" w:sz="4"/>
-              <w:right w:val="single" w:color="808080" w:sz="4"/>
-            </w:tcBorders>
-            <w:shd w:fill="D9E2F3" w:color="auto" w:val="clear"/>
+            <w:tcW w:type="dxa" w:w="2298"/>
+            <w:tcBorders>
+              <w:top w:val="single" w:color="000000" w:sz="4"/>
+              <w:left w:val="single" w:color="000000" w:sz="4"/>
+              <w:bottom w:val="single" w:color="000000" w:sz="4"/>
+              <w:right w:val="single" w:color="000000" w:sz="4"/>
+            </w:tcBorders>
             <w:tcMar>
               <w:top w:type="dxa" w:w="60"/>
               <w:left w:type="dxa" w:w="100"/>
@@ -4555,23 +3303,22 @@
               <w:rPr>
                 <w:b/>
                 <w:bCs/>
-                <w:sz w:val="19"/>
-                <w:szCs w:val="19"/>
-              </w:rPr>
-              <w:t xml:space="preserve">Kolom</w:t>
-            </w:r>
-          </w:p>
-        </w:tc>
-        <w:tc>
-          <w:tcPr>
-            <w:tcW w:type="dxa" w:w="6717"/>
-            <w:tcBorders>
-              <w:top w:val="single" w:color="808080" w:sz="4"/>
-              <w:left w:val="single" w:color="808080" w:sz="4"/>
-              <w:bottom w:val="single" w:color="808080" w:sz="4"/>
-              <w:right w:val="single" w:color="808080" w:sz="4"/>
-            </w:tcBorders>
-            <w:shd w:fill="D9E2F3" w:color="auto" w:val="clear"/>
+                <w:sz w:val="20"/>
+                <w:szCs w:val="20"/>
+              </w:rPr>
+              <w:t xml:space="preserve">Nama kolom</w:t>
+            </w:r>
+          </w:p>
+        </w:tc>
+        <w:tc>
+          <w:tcPr>
+            <w:tcW w:type="dxa" w:w="6540"/>
+            <w:tcBorders>
+              <w:top w:val="single" w:color="000000" w:sz="4"/>
+              <w:left w:val="single" w:color="000000" w:sz="4"/>
+              <w:bottom w:val="single" w:color="000000" w:sz="4"/>
+              <w:right w:val="single" w:color="000000" w:sz="4"/>
+            </w:tcBorders>
             <w:tcMar>
               <w:top w:type="dxa" w:w="60"/>
               <w:left w:type="dxa" w:w="100"/>
@@ -4590,8 +3337,8 @@
               <w:rPr>
                 <w:b/>
                 <w:bCs/>
-                <w:sz w:val="19"/>
-                <w:szCs w:val="19"/>
+                <w:sz w:val="20"/>
+                <w:szCs w:val="20"/>
               </w:rPr>
               <w:t xml:space="preserve">Keterangan</w:t>
             </w:r>
@@ -4604,12 +3351,12 @@
         </w:trPr>
         <w:tc>
           <w:tcPr>
-            <w:tcW w:type="dxa" w:w="2121"/>
-            <w:tcBorders>
-              <w:top w:val="single" w:color="808080" w:sz="4"/>
-              <w:left w:val="single" w:color="808080" w:sz="4"/>
-              <w:bottom w:val="single" w:color="808080" w:sz="4"/>
-              <w:right w:val="single" w:color="808080" w:sz="4"/>
+            <w:tcW w:type="dxa" w:w="2298"/>
+            <w:tcBorders>
+              <w:top w:val="single" w:color="000000" w:sz="4"/>
+              <w:left w:val="single" w:color="000000" w:sz="4"/>
+              <w:bottom w:val="single" w:color="000000" w:sz="4"/>
+              <w:right w:val="single" w:color="000000" w:sz="4"/>
             </w:tcBorders>
             <w:tcMar>
               <w:top w:type="dxa" w:w="60"/>
@@ -4627,8 +3374,8 @@
             </w:pPr>
             <w:r>
               <w:rPr>
-                <w:sz w:val="19"/>
-                <w:szCs w:val="19"/>
+                <w:sz w:val="20"/>
+                <w:szCs w:val="20"/>
               </w:rPr>
               <w:t xml:space="preserve">pity</w:t>
             </w:r>
@@ -4636,12 +3383,12 @@
         </w:tc>
         <w:tc>
           <w:tcPr>
-            <w:tcW w:type="dxa" w:w="6717"/>
-            <w:tcBorders>
-              <w:top w:val="single" w:color="808080" w:sz="4"/>
-              <w:left w:val="single" w:color="808080" w:sz="4"/>
-              <w:bottom w:val="single" w:color="808080" w:sz="4"/>
-              <w:right w:val="single" w:color="808080" w:sz="4"/>
+            <w:tcW w:type="dxa" w:w="6540"/>
+            <w:tcBorders>
+              <w:top w:val="single" w:color="000000" w:sz="4"/>
+              <w:left w:val="single" w:color="000000" w:sz="4"/>
+              <w:bottom w:val="single" w:color="000000" w:sz="4"/>
+              <w:right w:val="single" w:color="000000" w:sz="4"/>
             </w:tcBorders>
             <w:tcMar>
               <w:top w:type="dxa" w:w="60"/>
@@ -4659,10 +3406,10 @@
             </w:pPr>
             <w:r>
               <w:rPr>
-                <w:sz w:val="19"/>
-                <w:szCs w:val="19"/>
-              </w:rPr>
-              <w:t xml:space="preserve">jumlah pull sejak S-Rank terakhir (0 sampai hard pity − 1)</w:t>
+                <w:sz w:val="20"/>
+                <w:szCs w:val="20"/>
+              </w:rPr>
+              <w:t xml:space="preserve">jumlah pull sejak S-Rank terakhir</w:t>
             </w:r>
           </w:p>
         </w:tc>
@@ -4673,12 +3420,12 @@
         </w:trPr>
         <w:tc>
           <w:tcPr>
-            <w:tcW w:type="dxa" w:w="2121"/>
-            <w:tcBorders>
-              <w:top w:val="single" w:color="808080" w:sz="4"/>
-              <w:left w:val="single" w:color="808080" w:sz="4"/>
-              <w:bottom w:val="single" w:color="808080" w:sz="4"/>
-              <w:right w:val="single" w:color="808080" w:sz="4"/>
+            <w:tcW w:type="dxa" w:w="2298"/>
+            <w:tcBorders>
+              <w:top w:val="single" w:color="000000" w:sz="4"/>
+              <w:left w:val="single" w:color="000000" w:sz="4"/>
+              <w:bottom w:val="single" w:color="000000" w:sz="4"/>
+              <w:right w:val="single" w:color="000000" w:sz="4"/>
             </w:tcBorders>
             <w:tcMar>
               <w:top w:type="dxa" w:w="60"/>
@@ -4696,8 +3443,8 @@
             </w:pPr>
             <w:r>
               <w:rPr>
-                <w:sz w:val="19"/>
-                <w:szCs w:val="19"/>
+                <w:sz w:val="20"/>
+                <w:szCs w:val="20"/>
               </w:rPr>
               <w:t xml:space="preserve">pity_ratio</w:t>
             </w:r>
@@ -4705,12 +3452,12 @@
         </w:tc>
         <w:tc>
           <w:tcPr>
-            <w:tcW w:type="dxa" w:w="6717"/>
-            <w:tcBorders>
-              <w:top w:val="single" w:color="808080" w:sz="4"/>
-              <w:left w:val="single" w:color="808080" w:sz="4"/>
-              <w:bottom w:val="single" w:color="808080" w:sz="4"/>
-              <w:right w:val="single" w:color="808080" w:sz="4"/>
+            <w:tcW w:type="dxa" w:w="6540"/>
+            <w:tcBorders>
+              <w:top w:val="single" w:color="000000" w:sz="4"/>
+              <w:left w:val="single" w:color="000000" w:sz="4"/>
+              <w:bottom w:val="single" w:color="000000" w:sz="4"/>
+              <w:right w:val="single" w:color="000000" w:sz="4"/>
             </w:tcBorders>
             <w:tcMar>
               <w:top w:type="dxa" w:w="60"/>
@@ -4728,10 +3475,10 @@
             </w:pPr>
             <w:r>
               <w:rPr>
-                <w:sz w:val="19"/>
-                <w:szCs w:val="19"/>
-              </w:rPr>
-              <w:t xml:space="preserve">pity dibagi hard pity, agar kedua banner sebanding</w:t>
+                <w:sz w:val="20"/>
+                <w:szCs w:val="20"/>
+              </w:rPr>
+              <w:t xml:space="preserve">pity dibagi hard pity, agar kedua banner bisa dibandingkan</w:t>
             </w:r>
           </w:p>
         </w:tc>
@@ -4742,12 +3489,12 @@
         </w:trPr>
         <w:tc>
           <w:tcPr>
-            <w:tcW w:type="dxa" w:w="2121"/>
-            <w:tcBorders>
-              <w:top w:val="single" w:color="808080" w:sz="4"/>
-              <w:left w:val="single" w:color="808080" w:sz="4"/>
-              <w:bottom w:val="single" w:color="808080" w:sz="4"/>
-              <w:right w:val="single" w:color="808080" w:sz="4"/>
+            <w:tcW w:type="dxa" w:w="2298"/>
+            <w:tcBorders>
+              <w:top w:val="single" w:color="000000" w:sz="4"/>
+              <w:left w:val="single" w:color="000000" w:sz="4"/>
+              <w:bottom w:val="single" w:color="000000" w:sz="4"/>
+              <w:right w:val="single" w:color="000000" w:sz="4"/>
             </w:tcBorders>
             <w:tcMar>
               <w:top w:type="dxa" w:w="60"/>
@@ -4765,8 +3512,8 @@
             </w:pPr>
             <w:r>
               <w:rPr>
-                <w:sz w:val="19"/>
-                <w:szCs w:val="19"/>
+                <w:sz w:val="20"/>
+                <w:szCs w:val="20"/>
               </w:rPr>
               <w:t xml:space="preserve">guaranteed</w:t>
             </w:r>
@@ -4774,12 +3521,12 @@
         </w:tc>
         <w:tc>
           <w:tcPr>
-            <w:tcW w:type="dxa" w:w="6717"/>
-            <w:tcBorders>
-              <w:top w:val="single" w:color="808080" w:sz="4"/>
-              <w:left w:val="single" w:color="808080" w:sz="4"/>
-              <w:bottom w:val="single" w:color="808080" w:sz="4"/>
-              <w:right w:val="single" w:color="808080" w:sz="4"/>
+            <w:tcW w:type="dxa" w:w="6540"/>
+            <w:tcBorders>
+              <w:top w:val="single" w:color="000000" w:sz="4"/>
+              <w:left w:val="single" w:color="000000" w:sz="4"/>
+              <w:bottom w:val="single" w:color="000000" w:sz="4"/>
+              <w:right w:val="single" w:color="000000" w:sz="4"/>
             </w:tcBorders>
             <w:tcMar>
               <w:top w:type="dxa" w:w="60"/>
@@ -4797,8 +3544,8 @@
             </w:pPr>
             <w:r>
               <w:rPr>
-                <w:sz w:val="19"/>
-                <w:szCs w:val="19"/>
+                <w:sz w:val="20"/>
+                <w:szCs w:val="20"/>
               </w:rPr>
               <w:t xml:space="preserve">1 jika S-Rank berikutnya pasti rate-up, 0 jika tidak</w:t>
             </w:r>
@@ -4811,12 +3558,12 @@
         </w:trPr>
         <w:tc>
           <w:tcPr>
-            <w:tcW w:type="dxa" w:w="2121"/>
-            <w:tcBorders>
-              <w:top w:val="single" w:color="808080" w:sz="4"/>
-              <w:left w:val="single" w:color="808080" w:sz="4"/>
-              <w:bottom w:val="single" w:color="808080" w:sz="4"/>
-              <w:right w:val="single" w:color="808080" w:sz="4"/>
+            <w:tcW w:type="dxa" w:w="2298"/>
+            <w:tcBorders>
+              <w:top w:val="single" w:color="000000" w:sz="4"/>
+              <w:left w:val="single" w:color="000000" w:sz="4"/>
+              <w:bottom w:val="single" w:color="000000" w:sz="4"/>
+              <w:right w:val="single" w:color="000000" w:sz="4"/>
             </w:tcBorders>
             <w:tcMar>
               <w:top w:type="dxa" w:w="60"/>
@@ -4834,8 +3581,8 @@
             </w:pPr>
             <w:r>
               <w:rPr>
-                <w:sz w:val="19"/>
-                <w:szCs w:val="19"/>
+                <w:sz w:val="20"/>
+                <w:szCs w:val="20"/>
               </w:rPr>
               <w:t xml:space="preserve">is_wengine</w:t>
             </w:r>
@@ -4843,12 +3590,12 @@
         </w:tc>
         <w:tc>
           <w:tcPr>
-            <w:tcW w:type="dxa" w:w="6717"/>
-            <w:tcBorders>
-              <w:top w:val="single" w:color="808080" w:sz="4"/>
-              <w:left w:val="single" w:color="808080" w:sz="4"/>
-              <w:bottom w:val="single" w:color="808080" w:sz="4"/>
-              <w:right w:val="single" w:color="808080" w:sz="4"/>
+            <w:tcW w:type="dxa" w:w="6540"/>
+            <w:tcBorders>
+              <w:top w:val="single" w:color="000000" w:sz="4"/>
+              <w:left w:val="single" w:color="000000" w:sz="4"/>
+              <w:bottom w:val="single" w:color="000000" w:sz="4"/>
+              <w:right w:val="single" w:color="000000" w:sz="4"/>
             </w:tcBorders>
             <w:tcMar>
               <w:top w:type="dxa" w:w="60"/>
@@ -4866,8 +3613,8 @@
             </w:pPr>
             <w:r>
               <w:rPr>
-                <w:sz w:val="19"/>
-                <w:szCs w:val="19"/>
+                <w:sz w:val="20"/>
+                <w:szCs w:val="20"/>
               </w:rPr>
               <w:t xml:space="preserve">1 untuk banner W-Engine, 0 untuk banner Agent</w:t>
             </w:r>
@@ -4880,12 +3627,12 @@
         </w:trPr>
         <w:tc>
           <w:tcPr>
-            <w:tcW w:type="dxa" w:w="2121"/>
-            <w:tcBorders>
-              <w:top w:val="single" w:color="808080" w:sz="4"/>
-              <w:left w:val="single" w:color="808080" w:sz="4"/>
-              <w:bottom w:val="single" w:color="808080" w:sz="4"/>
-              <w:right w:val="single" w:color="808080" w:sz="4"/>
+            <w:tcW w:type="dxa" w:w="2298"/>
+            <w:tcBorders>
+              <w:top w:val="single" w:color="000000" w:sz="4"/>
+              <w:left w:val="single" w:color="000000" w:sz="4"/>
+              <w:bottom w:val="single" w:color="000000" w:sz="4"/>
+              <w:right w:val="single" w:color="000000" w:sz="4"/>
             </w:tcBorders>
             <w:tcMar>
               <w:top w:type="dxa" w:w="60"/>
@@ -4903,21 +3650,21 @@
             </w:pPr>
             <w:r>
               <w:rPr>
-                <w:sz w:val="19"/>
-                <w:szCs w:val="19"/>
-              </w:rPr>
-              <w:t xml:space="preserve">Target tugas A</w:t>
-            </w:r>
-          </w:p>
-        </w:tc>
-        <w:tc>
-          <w:tcPr>
-            <w:tcW w:type="dxa" w:w="6717"/>
-            <w:tcBorders>
-              <w:top w:val="single" w:color="808080" w:sz="4"/>
-              <w:left w:val="single" w:color="808080" w:sz="4"/>
-              <w:bottom w:val="single" w:color="808080" w:sz="4"/>
-              <w:right w:val="single" w:color="808080" w:sz="4"/>
+                <w:sz w:val="20"/>
+                <w:szCs w:val="20"/>
+              </w:rPr>
+              <w:t xml:space="preserve">target tugas A</w:t>
+            </w:r>
+          </w:p>
+        </w:tc>
+        <w:tc>
+          <w:tcPr>
+            <w:tcW w:type="dxa" w:w="6540"/>
+            <w:tcBorders>
+              <w:top w:val="single" w:color="000000" w:sz="4"/>
+              <w:left w:val="single" w:color="000000" w:sz="4"/>
+              <w:bottom w:val="single" w:color="000000" w:sz="4"/>
+              <w:right w:val="single" w:color="000000" w:sz="4"/>
             </w:tcBorders>
             <w:tcMar>
               <w:top w:type="dxa" w:w="60"/>
@@ -4935,8 +3682,8 @@
             </w:pPr>
             <w:r>
               <w:rPr>
-                <w:sz w:val="19"/>
-                <w:szCs w:val="19"/>
+                <w:sz w:val="20"/>
+                <w:szCs w:val="20"/>
               </w:rPr>
               <w:t xml:space="preserve">1 jika pull berikutnya menghasilkan S-Rank</w:t>
             </w:r>
@@ -4949,12 +3696,12 @@
         </w:trPr>
         <w:tc>
           <w:tcPr>
-            <w:tcW w:type="dxa" w:w="2121"/>
-            <w:tcBorders>
-              <w:top w:val="single" w:color="808080" w:sz="4"/>
-              <w:left w:val="single" w:color="808080" w:sz="4"/>
-              <w:bottom w:val="single" w:color="808080" w:sz="4"/>
-              <w:right w:val="single" w:color="808080" w:sz="4"/>
+            <w:tcW w:type="dxa" w:w="2298"/>
+            <w:tcBorders>
+              <w:top w:val="single" w:color="000000" w:sz="4"/>
+              <w:left w:val="single" w:color="000000" w:sz="4"/>
+              <w:bottom w:val="single" w:color="000000" w:sz="4"/>
+              <w:right w:val="single" w:color="000000" w:sz="4"/>
             </w:tcBorders>
             <w:tcMar>
               <w:top w:type="dxa" w:w="60"/>
@@ -4972,21 +3719,21 @@
             </w:pPr>
             <w:r>
               <w:rPr>
-                <w:sz w:val="19"/>
-                <w:szCs w:val="19"/>
-              </w:rPr>
-              <w:t xml:space="preserve">Target tugas B</w:t>
-            </w:r>
-          </w:p>
-        </w:tc>
-        <w:tc>
-          <w:tcPr>
-            <w:tcW w:type="dxa" w:w="6717"/>
-            <w:tcBorders>
-              <w:top w:val="single" w:color="808080" w:sz="4"/>
-              <w:left w:val="single" w:color="808080" w:sz="4"/>
-              <w:bottom w:val="single" w:color="808080" w:sz="4"/>
-              <w:right w:val="single" w:color="808080" w:sz="4"/>
+                <w:sz w:val="20"/>
+                <w:szCs w:val="20"/>
+              </w:rPr>
+              <w:t xml:space="preserve">target tugas B</w:t>
+            </w:r>
+          </w:p>
+        </w:tc>
+        <w:tc>
+          <w:tcPr>
+            <w:tcW w:type="dxa" w:w="6540"/>
+            <w:tcBorders>
+              <w:top w:val="single" w:color="000000" w:sz="4"/>
+              <w:left w:val="single" w:color="000000" w:sz="4"/>
+              <w:bottom w:val="single" w:color="000000" w:sz="4"/>
+              <w:right w:val="single" w:color="000000" w:sz="4"/>
             </w:tcBorders>
             <w:tcMar>
               <w:top w:type="dxa" w:w="60"/>
@@ -5004,8 +3751,8 @@
             </w:pPr>
             <w:r>
               <w:rPr>
-                <w:sz w:val="19"/>
-                <w:szCs w:val="19"/>
+                <w:sz w:val="20"/>
+                <w:szCs w:val="20"/>
               </w:rPr>
               <w:t xml:space="preserve">1 jika ada minimal satu S-Rank dalam 10 pull berikutnya</w:t>
             </w:r>
@@ -5017,81 +3764,6 @@
       <w:pPr>
         <w:spacing w:after="0" w:line="276"/>
       </w:pPr>
-    </w:p>
-    <w:p>
-      <w:pPr>
-        <w:spacing w:after="0" w:line="276"/>
-        <w:jc w:val="both"/>
-      </w:pPr>
-      <w:r>
-        <w:t xml:space="preserve">Tahap pra-pemrosesan meliputi:</w:t>
-      </w:r>
-    </w:p>
-    <w:p>
-      <w:pPr>
-        <w:pStyle w:val="ListParagraph"/>
-        <w:numPr>
-          <w:ilvl w:val="0"/>
-          <w:numId w:val="4"/>
-        </w:numPr>
-        <w:spacing w:after="0" w:line="276"/>
-        <w:jc w:val="both"/>
-      </w:pPr>
-      <w:r>
-        <w:t xml:space="preserve">Mengambil hanya pull dari banner Agent dan W-Engine terbatas, membuang data duplikat berdasarkan kolom id, lalu mengurutkan data secara kronologis per akun dan per banner.</w:t>
-      </w:r>
-    </w:p>
-    <w:p>
-      <w:pPr>
-        <w:pStyle w:val="ListParagraph"/>
-        <w:numPr>
-          <w:ilvl w:val="0"/>
-          <w:numId w:val="4"/>
-        </w:numPr>
-        <w:spacing w:after="0" w:line="276"/>
-        <w:jc w:val="both"/>
-      </w:pPr>
-      <w:r>
-        <w:t xml:space="preserve">Menghitung ulang pity dan status </w:t>
-      </w:r>
-      <w:r>
-        <w:rPr>
-          <w:i/>
-          <w:iCs/>
-        </w:rPr>
-        <w:t xml:space="preserve">guaranteed</w:t>
-      </w:r>
-      <w:r>
-        <w:t xml:space="preserve"> dari urutan pull; kalah 50/50 ditentukan dari daftar S-Rank standar.</w:t>
-      </w:r>
-    </w:p>
-    <w:p>
-      <w:pPr>
-        <w:pStyle w:val="ListParagraph"/>
-        <w:numPr>
-          <w:ilvl w:val="0"/>
-          <w:numId w:val="4"/>
-        </w:numPr>
-        <w:spacing w:after="0" w:line="276"/>
-        <w:jc w:val="both"/>
-      </w:pPr>
-      <w:r>
-        <w:t xml:space="preserve">Membuang segmen pertama (pull sebelum S-Rank pertama yang tercatat), karena server hanya menyimpan riwayat beberapa bulan terakhir sehingga pity pada segmen ini bisa tidak lengkap.</w:t>
-      </w:r>
-    </w:p>
-    <w:p>
-      <w:pPr>
-        <w:pStyle w:val="ListParagraph"/>
-        <w:numPr>
-          <w:ilvl w:val="0"/>
-          <w:numId w:val="4"/>
-        </w:numPr>
-        <w:spacing w:after="0" w:line="276"/>
-        <w:jc w:val="both"/>
-      </w:pPr>
-      <w:r>
-        <w:t xml:space="preserve">Menolak riwayat yang melebihi hard pity tanpa S-Rank karena tidak masuk akal.</w:t>
-      </w:r>
     </w:p>
     <w:p>
       <w:pPr>
@@ -5100,7 +3772,17 @@
         <w:jc w:val="both"/>
       </w:pPr>
       <w:r>
-        <w:t xml:space="preserve">Skrip pengambil riwayat hanya membaca berkas di komputer pemain dan tidak mengirim data ke mana pun. Kunci akses sementara (</w:t>
+        <w:t xml:space="preserve">Sebelum digunakan, data asli melalui tahap pra-pemrosesan. Data yang diambil hanya pull dari banner Agent dan W-Engine terbatas. Data yang duplikat berdasarkan kolom id dihapus, lalu data diurutkan berdasarkan waktu untuk setiap akun dan banner. Nilai pity dan status </w:t>
+      </w:r>
+      <w:r>
+        <w:rPr>
+          <w:i/>
+          <w:iCs/>
+        </w:rPr>
+        <w:t xml:space="preserve">guaranteed</w:t>
+      </w:r>
+      <w:r>
+        <w:t xml:space="preserve"> kemudian dihitung ulang dari urutan pull. Pull sebelum S-Rank pertama yang tercatat juga dibuang, karena server hanya menyimpan riwayat beberapa bulan terakhir sehingga nilai pity pada bagian ini bisa tidak lengkap. Skrip pengambil riwayat hanya membaca file di komputer pemain dan tidak mengirim data ke mana pun, sedangkan kunci akses (</w:t>
       </w:r>
       <w:r>
         <w:rPr>
@@ -5130,7 +3812,7 @@
         <w:jc w:val="both"/>
       </w:pPr>
       <w:r>
-        <w:t xml:space="preserve">Eksperimen memakai 306.959 baris data simulasi tugas B dari 400 akun, 77.156 baris dari 100 akun simulasi tambahan untuk </w:t>
+        <w:t xml:space="preserve">Eksperimen dilakukan menggunakan 306.959 baris data simulasi dari 400 akun, 77.156 baris data simulasi tambahan dari 100 akun untuk </w:t>
       </w:r>
       <w:r>
         <w:rPr>
@@ -5140,167 +3822,7 @@
         <w:t xml:space="preserve">grid search</w:t>
       </w:r>
       <w:r>
-        <w:t xml:space="preserve">, dan 1.425 baris data asli. Eksperimen dijalankan dengan bahasa pemrograman Python 3.12 dan pustaka pandas, NumPy, SciPy, scikit-learn [25], XGBoost, dan Plotly. Aplikasi dibangun dengan Streamlit dan dipublikasikan melalui Streamlit Community Cloud, sedangkan kode sumber disimpan di GitHub dan diperiksa otomatis dengan 106 kasus uji (pytest dan GitHub Actions). Skenario eksperimen adalah sebagai berikut:</w:t>
-      </w:r>
-    </w:p>
-    <w:p>
-      <w:pPr>
-        <w:pStyle w:val="ListParagraph"/>
-        <w:numPr>
-          <w:ilvl w:val="0"/>
-          <w:numId w:val="5"/>
-        </w:numPr>
-        <w:spacing w:after="0" w:line="276"/>
-        <w:jc w:val="both"/>
-      </w:pPr>
-      <w:r>
-        <w:rPr>
-          <w:b/>
-          <w:bCs/>
-        </w:rPr>
-        <w:t xml:space="preserve">Grid search:</w:t>
-      </w:r>
-      <w:r>
-        <w:t xml:space="preserve"> hyperparameter dipilih memakai 100 akun simulasi tambahan dengan GroupKFold 4-fold per akun dan metrik accuracy. Pengaturan terpilih dipakai untuk evaluasi simulasi dan model di aplikasi.</w:t>
-      </w:r>
-    </w:p>
-    <w:p>
-      <w:pPr>
-        <w:pStyle w:val="ListParagraph"/>
-        <w:numPr>
-          <w:ilvl w:val="0"/>
-          <w:numId w:val="5"/>
-        </w:numPr>
-        <w:spacing w:after="0" w:line="276"/>
-        <w:jc w:val="both"/>
-      </w:pPr>
-      <w:r>
-        <w:rPr>
-          <w:b/>
-          <w:bCs/>
-        </w:rPr>
-        <w:t xml:space="preserve">Cross-validation:</w:t>
-      </w:r>
-      <w:r>
-        <w:t xml:space="preserve"> GroupKFold 5-fold yang dibagi per akun, karena pull berurutan dari akun yang sama saling berkaitan. Pembagian per baris akan membocorkan informasi antara data latih dan data uji.</w:t>
-      </w:r>
-    </w:p>
-    <w:p>
-      <w:pPr>
-        <w:pStyle w:val="ListParagraph"/>
-        <w:numPr>
-          <w:ilvl w:val="0"/>
-          <w:numId w:val="5"/>
-        </w:numPr>
-        <w:spacing w:after="0" w:line="276"/>
-        <w:jc w:val="both"/>
-      </w:pPr>
-      <w:r>
-        <w:rPr>
-          <w:b/>
-          <w:bCs/>
-        </w:rPr>
-        <w:t xml:space="preserve">Uji signifikansi:</w:t>
-      </w:r>
-      <w:r>
-        <w:t xml:space="preserve"> akurasi setiap algoritma pada kelima fold dibandingkan dengan algoritma berakurasi tertinggi memakai uji t berpasangan terkoreksi (α = 0,05).</w:t>
-      </w:r>
-    </w:p>
-    <w:p>
-      <w:pPr>
-        <w:pStyle w:val="ListParagraph"/>
-        <w:numPr>
-          <w:ilvl w:val="0"/>
-          <w:numId w:val="5"/>
-        </w:numPr>
-        <w:spacing w:after="0" w:line="276"/>
-        <w:jc w:val="both"/>
-      </w:pPr>
-      <w:r>
-        <w:rPr>
-          <w:b/>
-          <w:bCs/>
-        </w:rPr>
-        <w:t xml:space="preserve">Uji data asli:</w:t>
-      </w:r>
-      <w:r>
-        <w:t xml:space="preserve"> model akhir dilatih dengan pembagian 80/20 per akun (GroupShuffleSplit), lalu diuji pada data asli 3 akun yang tidak pernah dipakai saat pelatihan.</w:t>
-      </w:r>
-    </w:p>
-    <w:p>
-      <w:pPr>
-        <w:pStyle w:val="ListParagraph"/>
-        <w:numPr>
-          <w:ilvl w:val="0"/>
-          <w:numId w:val="5"/>
-        </w:numPr>
-        <w:spacing w:after="0" w:line="276"/>
-        <w:jc w:val="both"/>
-      </w:pPr>
-      <w:r>
-        <w:rPr>
-          <w:b/>
-          <w:bCs/>
-        </w:rPr>
-        <w:t xml:space="preserve">Eksperimen kedua:</w:t>
-      </w:r>
-      <w:r>
-        <w:t xml:space="preserve"> keenam algoritma dilatih dan diuji hanya dengan data asli memakai GroupKFold 5-fold yang dibagi per siklus pity (25 siklus), dengan hyperparameter dipilih ulang di dalam data latih setiap fold (</w:t>
-      </w:r>
-      <w:r>
-        <w:rPr>
-          <w:i/>
-          <w:iCs/>
-        </w:rPr>
-        <w:t xml:space="preserve">nested cross-validation</w:t>
-      </w:r>
-      <w:r>
-        <w:t xml:space="preserve">).</w:t>
-      </w:r>
-    </w:p>
-    <w:p>
-      <w:pPr>
-        <w:pStyle w:val="ListParagraph"/>
-        <w:numPr>
-          <w:ilvl w:val="0"/>
-          <w:numId w:val="5"/>
-        </w:numPr>
-        <w:spacing w:after="0" w:line="276"/>
-        <w:jc w:val="both"/>
-      </w:pPr>
-      <w:r>
-        <w:rPr>
-          <w:b/>
-          <w:bCs/>
-        </w:rPr>
-        <w:t xml:space="preserve">Analisis soft pity:</w:t>
-      </w:r>
-      <w:r>
-        <w:t xml:space="preserve"> laju S-Rank per rentang pity pada data asli dibandingkan dengan peluang model Markov.</w:t>
-      </w:r>
-    </w:p>
-    <w:p>
-      <w:pPr>
-        <w:pStyle w:val="ListParagraph"/>
-        <w:numPr>
-          <w:ilvl w:val="0"/>
-          <w:numId w:val="5"/>
-        </w:numPr>
-        <w:spacing w:after="0" w:line="276"/>
-        <w:jc w:val="both"/>
-      </w:pPr>
-      <w:r>
-        <w:t xml:space="preserve">Prediksi kelas memakai ambang peluang 0,5. </w:t>
-      </w:r>
-      <w:r>
-        <w:rPr>
-          <w:i/>
-          <w:iCs/>
-        </w:rPr>
-        <w:t xml:space="preserve">Oversampling</w:t>
-      </w:r>
-      <w:r>
-        <w:t xml:space="preserve"> seperti SMOTE tidak dipakai karena tujuan utamanya adalah angka peluang yang tepat, sedangkan data buatan untuk kelas minoritas akan menggeser peluang tersebut.</w:t>
+        <w:t xml:space="preserve">, dan 1.425 baris data asli. Program dibuat menggunakan bahasa Python 3.12 dengan library pandas, NumPy, SciPy, scikit-learn [25], XGBoost, dan Plotly. Aplikasi dibuat menggunakan Streamlit dan dipublikasikan melalui Streamlit Community Cloud, sedangkan kode programnya disimpan di GitHub.</w:t>
       </w:r>
     </w:p>
     <w:p>
@@ -5310,37 +3832,77 @@
         <w:jc w:val="both"/>
       </w:pPr>
       <w:r>
-        <w:t xml:space="preserve">Uji awal pada tugas B menunjukkan bahwa model berbasis pohon dan KNN mencapai akurasi ±91% pada data simulasi dan ±92% pada data asli, mendekati acuan Markov Chain, sedangkan baseline hanya ±83%. </w:t>
+        <w:t xml:space="preserve">Hyperparameter setiap algoritma dipilih menggunakan </w:t>
       </w:r>
       <w:r>
         <w:rPr>
           <w:i/>
           <w:iCs/>
         </w:rPr>
-        <w:t xml:space="preserve">Grid search</w:t>
-      </w:r>
-      <w:r>
-        <w:t xml:space="preserve"> menaikkan akurasi Naive Bayes dari 85,4% menjadi 89,0% pada data </w:t>
+        <w:t xml:space="preserve">grid search</w:t>
+      </w:r>
+      <w:r>
+        <w:t xml:space="preserve"> pada data simulasi tambahan dengan GroupKFold 4-fold. Setelah itu, model dibandingkan menggunakan GroupKFold 5-fold yang dibagi per akun, karena pull yang berurutan dari akun yang sama saling berkaitan. Akurasi setiap algoritma pada kelima fold dibandingkan dengan algoritma yang akurasinya paling tinggi menggunakan uji t terkoreksi. Model akhir dilatih dengan pembagian data 80:20 per akun, kemudian diuji pada data asli dari 3 akun yang tidak pernah digunakan saat pelatihan.</w:t>
+      </w:r>
+    </w:p>
+    <w:p>
+      <w:pPr>
+        <w:spacing w:after="0" w:line="276"/>
+        <w:ind w:firstLine="720"/>
+        <w:jc w:val="both"/>
+      </w:pPr>
+      <w:r>
+        <w:t xml:space="preserve">Pada eksperimen kedua, keenam algoritma dilatih dan diuji hanya dengan data asli menggunakan GroupKFold 5-fold yang dibagi per siklus pity (25 siklus), dan hyperparameter dipilih ulang pada setiap fold. Selain itu, laju S-Rank pada setiap rentang pity di data asli dibandingkan dengan peluang dari model Markov untuk melihat pola </w:t>
       </w:r>
       <w:r>
         <w:rPr>
           <w:i/>
           <w:iCs/>
         </w:rPr>
-        <w:t xml:space="preserve">grid search</w:t>
-      </w:r>
-      <w:r>
-        <w:t xml:space="preserve">. Pada data asli, laju S-Rank banner Agent naik dari 0,7% menjadi 14,3% mulai pull ke-74, sesuai dengan estimasi </w:t>
+        <w:t xml:space="preserve">soft pity</w:t>
+      </w:r>
+      <w:r>
+        <w:t xml:space="preserve">. Prediksi kelas menggunakan batas peluang 0,5, dan teknik </w:t>
       </w:r>
       <w:r>
         <w:rPr>
           <w:i/>
           <w:iCs/>
         </w:rPr>
+        <w:t xml:space="preserve">oversampling</w:t>
+      </w:r>
+      <w:r>
+        <w:t xml:space="preserve"> seperti SMOTE tidak digunakan karena dapat menggeser angka peluang yang dihasilkan model.</w:t>
+      </w:r>
+    </w:p>
+    <w:p>
+      <w:pPr>
+        <w:spacing w:after="0" w:line="276"/>
+        <w:ind w:firstLine="720"/>
+        <w:jc w:val="both"/>
+      </w:pPr>
+      <w:r>
+        <w:t xml:space="preserve">Uji awal pada tugas B menunjukkan bahwa model berbasis pohon dan KNN mencapai akurasi sekitar 91% pada data simulasi dan sekitar 92% pada data asli. Angka ini mendekati model Markov Chain, sedangkan baseline yang selalu menebak "tidak dapat S-Rank" hanya mencapai sekitar 83%. </w:t>
+      </w:r>
+      <w:r>
+        <w:rPr>
+          <w:i/>
+          <w:iCs/>
+        </w:rPr>
+        <w:t xml:space="preserve">Grid search</w:t>
+      </w:r>
+      <w:r>
+        <w:t xml:space="preserve"> juga menaikkan akurasi Naive Bayes dari 85,4% menjadi 89,0%. Pada data asli, laju S-Rank banner Agent naik dari 0,7% menjadi 14,3% mulai pull ke-74, sesuai dengan perkiraan </w:t>
+      </w:r>
+      <w:r>
+        <w:rPr>
+          <w:i/>
+          <w:iCs/>
+        </w:rPr>
         <w:t xml:space="preserve">soft pity</w:t>
       </w:r>
       <w:r>
-        <w:t xml:space="preserve">. Hasil lengkap akan disajikan pada laporan akhir.</w:t>
+        <w:t xml:space="preserve"> dari komunitas. Hasil lengkapnya akan dibahas pada laporan akhir.</w:t>
       </w:r>
     </w:p>
     <w:p>
@@ -5360,7 +3922,7 @@
         <w:jc w:val="both"/>
       </w:pPr>
       <w:r>
-        <w:t xml:space="preserve">Penelitian ini diharapkan menghasilkan perbandingan kinerja enam algoritma klasifikasi yang adil dan teruji secara statistik dalam memprediksi keluarnya S-Rank, sehingga dapat diketahui algoritma mana yang paling sesuai untuk data gacha. Model terbaik diharapkan mengungguli baseline pada Balanced Accuracy, F1-score, dan ROC-AUC, serta mendekati acuan teori Markov Chain. Penelitian ini juga diharapkan dapat memastikan apakah titik </w:t>
+        <w:t xml:space="preserve">Penelitian ini diharapkan dapat menghasilkan perbandingan kinerja enam algoritma klasifikasi dalam memprediksi keluarnya S-Rank, sehingga dapat diketahui algoritma yang paling sesuai untuk data gacha. Model terbaik diharapkan lebih baik daripada baseline pada Balanced Accuracy, F1-score, dan ROC-AUC, serta mendekati hasil model Markov Chain. Penelitian ini juga diharapkan dapat membuktikan apakah titik </w:t>
       </w:r>
       <w:r>
         <w:rPr>
@@ -5370,7 +3932,7 @@
         <w:t xml:space="preserve">soft pity</w:t>
       </w:r>
       <w:r>
-        <w:t xml:space="preserve"> hasil estimasi komunitas (pull ke-74 untuk Agent dan ke-65 untuk W-Engine) sesuai dengan data pemain asli.</w:t>
+        <w:t xml:space="preserve"> yang diperkirakan komunitas, yaitu pull ke-74 untuk Agent dan pull ke-65 untuk W-Engine, sesuai dengan data pemain asli.</w:t>
       </w:r>
     </w:p>
     <w:p>
@@ -5380,7 +3942,7 @@
         <w:jc w:val="both"/>
       </w:pPr>
       <w:r>
-        <w:t xml:space="preserve">Bagi pemain, hasil penelitian memberikan gambaran peluang yang jelas untuk merencanakan penggunaan mata uang permainan. Bagi mahasiswa, penelitian ini menerapkan tahapan CRISP-DM, algoritma klasifikasi, evaluasi, dan </w:t>
+        <w:t xml:space="preserve">Bagi pemain, hasil penelitian ini dapat membantu memperkirakan peluang mendapatkan S-Rank sehingga penggunaan mata uang di dalam game dapat direncanakan dengan lebih baik. Bagi mahasiswa, penelitian ini menjadi sarana untuk menerapkan materi perkuliahan, mulai dari tahapan CRISP-DM, algoritma klasifikasi, evaluasi model, sampai </w:t>
       </w:r>
       <w:r>
         <w:rPr>
@@ -5390,7 +3952,7 @@
         <w:t xml:space="preserve">deployment</w:t>
       </w:r>
       <w:r>
-        <w:t xml:space="preserve"> sesuai materi perkuliahan. Bagi keilmuan, penelitian ini memberikan contoh penerapan penambangan data untuk menggali aturan yang tidak diumumkan, sekaligus contoh nyata bahaya memakai akurasi sebagai satu-satunya metrik pada data tidak seimbang.</w:t>
+        <w:t xml:space="preserve"> aplikasi.</w:t>
       </w:r>
     </w:p>
     <w:p>
@@ -5406,163 +3968,21 @@
     <w:p>
       <w:pPr>
         <w:spacing w:after="0" w:line="276"/>
+        <w:ind w:firstLine="720"/>
         <w:jc w:val="both"/>
       </w:pPr>
       <w:r>
-        <w:t xml:space="preserve">Target capaian dari penelitian ini adalah:</w:t>
-      </w:r>
-    </w:p>
-    <w:p>
-      <w:pPr>
-        <w:pStyle w:val="ListParagraph"/>
-        <w:numPr>
-          <w:ilvl w:val="0"/>
-          <w:numId w:val="6"/>
-        </w:numPr>
-        <w:spacing w:after="0" w:line="276"/>
-        <w:jc w:val="both"/>
-      </w:pPr>
-      <w:r>
-        <w:t xml:space="preserve">Model klasifikasi tugas A dan tugas B dari keenam algoritma, dengan hyperparameter hasil </w:t>
+        <w:t xml:space="preserve">Target capaian dari penelitian ini adalah tersusunnya model klasifikasi dari keenam algoritma untuk tugas A dan tugas B, beserta perbandingan kinerjanya pada data simulasi maupun data asli. Selain itu, penelitian ini menargetkan hasil analisis pola </w:t>
       </w:r>
       <w:r>
         <w:rPr>
           <w:i/>
           <w:iCs/>
         </w:rPr>
-        <w:t xml:space="preserve">grid search</w:t>
-      </w:r>
-      <w:r>
-        <w:t xml:space="preserve">, yang tersimpan dan dapat dipakai ulang oleh aplikasi.</w:t>
-      </w:r>
-    </w:p>
-    <w:p>
-      <w:pPr>
-        <w:pStyle w:val="ListParagraph"/>
-        <w:numPr>
-          <w:ilvl w:val="0"/>
-          <w:numId w:val="6"/>
-        </w:numPr>
-        <w:spacing w:after="0" w:line="276"/>
-        <w:jc w:val="both"/>
-      </w:pPr>
-      <w:r>
-        <w:t xml:space="preserve">Tabel perbandingan kinerja dengan delapan metrik evaluasi beserta hasil uji signifikansi, baik pada data simulasi maupun data asli.</w:t>
-      </w:r>
-    </w:p>
-    <w:p>
-      <w:pPr>
-        <w:pStyle w:val="ListParagraph"/>
-        <w:numPr>
-          <w:ilvl w:val="0"/>
-          <w:numId w:val="6"/>
-        </w:numPr>
-        <w:spacing w:after="0" w:line="276"/>
-        <w:jc w:val="both"/>
-      </w:pPr>
-      <w:r>
-        <w:t xml:space="preserve">Analisis pola </w:t>
-      </w:r>
-      <w:r>
-        <w:rPr>
-          <w:i/>
-          <w:iCs/>
-        </w:rPr>
         <w:t xml:space="preserve">soft pity</w:t>
       </w:r>
       <w:r>
-        <w:t xml:space="preserve"> dari data asli yang dibandingkan dengan model Markov Chain.</w:t>
-      </w:r>
-    </w:p>
-    <w:p>
-      <w:pPr>
-        <w:pStyle w:val="ListParagraph"/>
-        <w:numPr>
-          <w:ilvl w:val="0"/>
-          <w:numId w:val="6"/>
-        </w:numPr>
-        <w:spacing w:after="0" w:line="276"/>
-        <w:jc w:val="both"/>
-      </w:pPr>
-      <w:r>
-        <w:t xml:space="preserve">Aplikasi web Streamlit yang dapat diakses publik dari ponsel maupun komputer, dengan halaman Import Data, Kalkulator Peluang, Statistik Riwayat, Perbandingan Algoritma, serta Panduan dan FAQ. Prototipe sudah berjalan di https://project-data-mining-zzz.streamlit.app (Gambar 2.2).</w:t>
-      </w:r>
-    </w:p>
-    <w:p>
-      <w:pPr>
-        <w:pStyle w:val="ListParagraph"/>
-        <w:numPr>
-          <w:ilvl w:val="0"/>
-          <w:numId w:val="6"/>
-        </w:numPr>
-        <w:spacing w:after="0" w:line="276"/>
-        <w:jc w:val="both"/>
-      </w:pPr>
-      <w:r>
-        <w:t xml:space="preserve">Kode sumber terbuka di https://github.com/tehgeii/project-data-mining, laporan akhir, dan video presentasi.</w:t>
-      </w:r>
-    </w:p>
-    <w:p>
-      <w:pPr>
-        <w:keepNext/>
-        <w:spacing w:before="120"/>
-        <w:jc w:val="center"/>
-      </w:pPr>
-      <w:r>
-        <w:drawing>
-          <wp:inline distT="0" distB="0" distL="0" distR="0">
-            <wp:extent cx="2381250" cy="3286125"/>
-            <wp:effectExtent t="0" r="0" b="0" l="0"/>
-            <wp:docPr id="4" name="app_kalkulator_top.png" descr="Prototipe halaman Kalkulator Peluang" title="Prototipe halaman Kalkulator Peluang"/>
-            <wp:cNvGraphicFramePr>
-              <a:graphicFrameLocks xmlns:a="http://schemas.openxmlformats.org/drawingml/2006/main" noChangeAspect="1"/>
-            </wp:cNvGraphicFramePr>
-            <a:graphic xmlns:a="http://schemas.openxmlformats.org/drawingml/2006/main">
-              <a:graphicData uri="http://schemas.openxmlformats.org/drawingml/2006/picture">
-                <pic:pic xmlns:pic="http://schemas.openxmlformats.org/drawingml/2006/picture">
-                  <pic:nvPicPr>
-                    <pic:cNvPr id="0" name="" descr=""/>
-                    <pic:cNvPicPr>
-                      <a:picLocks noChangeAspect="1" noChangeArrowheads="1"/>
-                    </pic:cNvPicPr>
-                  </pic:nvPicPr>
-                  <pic:blipFill>
-                    <a:blip r:embed="rId11" cstate="none"/>
-                    <a:srcRect/>
-                    <a:stretch>
-                      <a:fillRect/>
-                    </a:stretch>
-                  </pic:blipFill>
-                  <pic:spPr bwMode="auto">
-                    <a:xfrm>
-                      <a:off x="0" y="0"/>
-                      <a:ext cx="2381250" cy="3286125"/>
-                    </a:xfrm>
-                    <a:prstGeom prst="rect">
-                      <a:avLst/>
-                    </a:prstGeom>
-                  </pic:spPr>
-                </pic:pic>
-              </a:graphicData>
-            </a:graphic>
-          </wp:inline>
-        </w:drawing>
-      </w:r>
-    </w:p>
-    <w:p>
-      <w:pPr>
-        <w:spacing w:after="200"/>
-        <w:jc w:val="center"/>
-      </w:pPr>
-      <w:r>
-        <w:rPr>
-          <w:b/>
-          <w:bCs/>
-        </w:rPr>
-        <w:t xml:space="preserve">Gambar 2.2</w:t>
-      </w:r>
-      <w:r>
-        <w:t xml:space="preserve"> Prototipe halaman Kalkulator Peluang</w:t>
+        <w:t xml:space="preserve"> dari data pemain asli yang dibandingkan dengan model Markov Chain. Hasil penelitian akan diterapkan dalam aplikasi web Streamlit yang dapat diakses melalui HP maupun komputer, dengan fitur impor riwayat gacha, kalkulator peluang, statistik riwayat, dan perbandingan algoritma. Prototipe aplikasi sudah dapat diakses di https://project-data-mining-zzz.streamlit.app, dan kode programnya tersedia di https://github.com/tehgeii/project-data-mining. Luaran lainnya berupa laporan akhir dan video presentasi.</w:t>
       </w:r>
     </w:p>
     <w:p>
@@ -12114,24 +10534,6 @@
     </w:lvlOverride>
   </w:num>
   <w:num w:numId="3">
-    <w:abstractNumId w:val="3"/>
-    <w:lvlOverride w:ilvl="0">
-      <w:startOverride w:val="1"/>
-    </w:lvlOverride>
-  </w:num>
-  <w:num w:numId="4">
-    <w:abstractNumId w:val="2"/>
-    <w:lvlOverride w:ilvl="0">
-      <w:startOverride w:val="1"/>
-    </w:lvlOverride>
-  </w:num>
-  <w:num w:numId="5">
-    <w:abstractNumId w:val="2"/>
-    <w:lvlOverride w:ilvl="0">
-      <w:startOverride w:val="1"/>
-    </w:lvlOverride>
-  </w:num>
-  <w:num w:numId="6">
     <w:abstractNumId w:val="3"/>
     <w:lvlOverride w:ilvl="0">
       <w:startOverride w:val="1"/>

</xml_diff>